<commit_message>
docs: clarify executor local admin right on the on-prem collector server (not the Arc resource)
Co-authored-by: Copilot <223556219+Copilot@users.noreply.github.com>
</commit_message>
<xml_diff>
--- a/docs/ODA-JIT-Deployment.de.docx
+++ b/docs/ODA-JIT-Deployment.de.docx
@@ -2816,7 +2816,20 @@
               <w:rPr>
                 <w:sz w:val="19"/>
               </w:rPr>
-              <w:t>Collector</w:t>
+              <w:t xml:space="preserve">Collector-Server (on-prem, Windows) – </w:t>
+            </w:r>
+            <w:r>
+              <w:rPr>
+                <w:b/>
+                <w:sz w:val="19"/>
+              </w:rPr>
+              <w:t>nicht</w:t>
+            </w:r>
+            <w:r>
+              <w:rPr>
+                <w:sz w:val="19"/>
+              </w:rPr>
+              <w:t xml:space="preserve"> das Arc-Objekt, keine Azure-Rolle</w:t>
             </w:r>
           </w:p>
         </w:tc>
@@ -2830,7 +2843,7 @@
               <w:rPr>
                 <w:sz w:val="19"/>
               </w:rPr>
-              <w:t xml:space="preserve">CIM-Abfrage der geplanten Aufgaben und Lesen von </w:t>
+              <w:t xml:space="preserve">Der Watcher fragt vom Tier-0-Host per WinRM/CIM die geplanten Aufgaben und </w:t>
             </w:r>
             <w:r>
               <w:rPr>
@@ -2838,6 +2851,20 @@
                 <w:color w:val="8B0000"/>
                 <w:sz w:val="19"/>
               </w:rPr>
+              <w:t>OMSAssessment.exe</w:t>
+            </w:r>
+            <w:r>
+              <w:rPr>
+                <w:sz w:val="19"/>
+              </w:rPr>
+              <w:t xml:space="preserve"> ab und liest per SMB </w:t>
+            </w:r>
+            <w:r>
+              <w:rPr>
+                <w:rFonts w:ascii="Consolas" w:hAnsi="Consolas" w:eastAsia="Consolas"/>
+                <w:color w:val="8B0000"/>
+                <w:sz w:val="19"/>
+              </w:rPr>
               <w:t>C$</w:t>
             </w:r>
             <w:r>
@@ -2857,7 +2884,7 @@
               <w:rPr>
                 <w:sz w:val="19"/>
               </w:rPr>
-              <w:t xml:space="preserve"> automatisch Admin</w:t>
+              <w:t xml:space="preserve"> automatisch lokaler Admin</w:t>
             </w:r>
           </w:p>
         </w:tc>
@@ -6132,7 +6159,7 @@
               <w:rPr>
                 <w:sz w:val="19"/>
               </w:rPr>
-              <w:t>WinRM gesperrt oder Ausführer nicht lokaler Admin</w:t>
+              <w:t>WinRM gesperrt oder Ausführer nicht lokaler Admin auf dem Collector-Server</w:t>
             </w:r>
           </w:p>
         </w:tc>
@@ -6194,6 +6221,12 @@
               </w:rPr>
               <w:t>C$</w:t>
             </w:r>
+            <w:r>
+              <w:rPr>
+                <w:sz w:val="19"/>
+              </w:rPr>
+              <w:t xml:space="preserve"> des Collector-Servers</w:t>
+            </w:r>
           </w:p>
         </w:tc>
         <w:tc>
@@ -6206,7 +6239,7 @@
               <w:rPr>
                 <w:sz w:val="19"/>
               </w:rPr>
-              <w:t xml:space="preserve">Firewall 445, lokaler Admin, </w:t>
+              <w:t xml:space="preserve">Firewall 445, lokaler Admin auf dem Collector-Server, </w:t>
             </w:r>
             <w:r>
               <w:rPr>

</xml_diff>

<commit_message>
docs: add PIM trust / shadow principals guide (built-in AD DS, EN/DE + Word)
- What the PAM optional feature, shadow principals and the PIM trust are, SID filtering per MS-PAC 4.1.2.2 (EA/DA pass a PIM trust, BUILTIN never)
- Step-by-step setup with native tools (functional level, Enable-ADOptionalFeature, netdom /ForestTRANsitive /EnableSIDHistory /EnablePIMTrust /Quarantine, msDS-ShadowPrincipal, TTL members), test, monitoring, removal
- Impact on ODA-JIT: shadow principals can host the executor in an admin forest; the ODA gMSA stays in production (PAM TTL)
- Deployment guide links the admin-forest variant; Word docs generated from markdown (meta/alt via HTML comments)

Co-authored-by: Copilot <223556219+Copilot@users.noreply.github.com>
</commit_message>
<xml_diff>
--- a/docs/ODA-JIT-Deployment.de.docx
+++ b/docs/ODA-JIT-Deployment.de.docx
@@ -5516,6 +5516,45 @@
         <w:t>Nicht empfohlen.</w:t>
       </w:r>
     </w:p>
+    <w:tbl>
+      <w:tblPr>
+        <w:tblStyle w:val="TableGrid"/>
+        <w:tblW w:type="auto" w:w="0"/>
+        <w:tblLook w:firstColumn="1" w:firstRow="1" w:lastColumn="0" w:lastRow="0" w:noHBand="0" w:noVBand="1" w:val="04A0"/>
+      </w:tblPr>
+      <w:tblGrid>
+        <w:gridCol w:w="9746"/>
+      </w:tblGrid>
+      <w:tr>
+        <w:tc>
+          <w:tcPr>
+            <w:tcW w:type="dxa" w:w="9746"/>
+            <w:shd w:val="clear" w:color="auto" w:fill="DEEBF7"/>
+          </w:tcPr>
+          <w:p>
+            <w:r/>
+            <w:r>
+              <w:rPr>
+                <w:b/>
+                <w:sz w:val="19"/>
+              </w:rPr>
+              <w:t>Variante mit Admin-Forest:</w:t>
+            </w:r>
+            <w:r>
+              <w:rPr>
+                <w:sz w:val="19"/>
+              </w:rPr>
+              <w:t xml:space="preserve"> Mit einem eigenen, gehärteten Admin-Forest und einem PIM-Trust kann der Ausführer im Admin-Forest leben. Er erhält Enterprise-Admin-Rechte in Produktion dann über einen Shadow Principal, ohne dauerhafte Mitgliedschaft in einer Produktionsgruppe. Grundlagen, Einrichtung und Grenzen beschreibt PAM-Trust-Shadow-Principals.de.md. Das ODA-gMSA bleibt im Produktions-Forest.</w:t>
+            </w:r>
+          </w:p>
+        </w:tc>
+      </w:tr>
+    </w:tbl>
+    <w:p>
+      <w:pPr>
+        <w:spacing w:after="40"/>
+      </w:pPr>
+    </w:p>
     <w:p>
       <w:pPr>
         <w:pStyle w:val="Heading1"/>

</xml_diff>

<commit_message>
docs(jit): document assessments on different days (single vs. two windows)
Step 6 now explains that both AD assessments must run on the same WindowDay; if they run on different weekdays the watcher classifies the window as Incomplete and revokes EA before the other day's assessment runs. Adds Option A (align triggers to one day) and Option B (two JIT windows with distinct ForestName labels), plus a troubleshooting row for the Incomplete/event-1013 case. Regenerated the German Word version.

Co-authored-by: Copilot <223556219+Copilot@users.noreply.github.com>
</commit_message>
<xml_diff>
--- a/docs/ODA-JIT-Deployment.de.docx
+++ b/docs/ODA-JIT-Deployment.de.docx
@@ -7311,6 +7311,847 @@
         <w:t xml:space="preserve">und warnt bei Abweichungen.</w:t>
       </w:r>
     </w:p>
+    <w:p>
+      <w:pPr>
+        <w:pStyle w:val="BodyText"/>
+      </w:pPr>
+      <w:r>
+        <w:t xml:space="preserve">Beide ODA-Aufgaben müssen am</w:t>
+      </w:r>
+      <w:r>
+        <w:t xml:space="preserve"> </w:t>
+      </w:r>
+      <w:r>
+        <w:rPr>
+          <w:b/>
+          <w:bCs/>
+        </w:rPr>
+        <w:t xml:space="preserve">selben Wochentag</w:t>
+      </w:r>
+      <w:r>
+        <w:t xml:space="preserve"> </w:t>
+      </w:r>
+      <w:r>
+        <w:t xml:space="preserve">laufen. Das JIT-Fenster deckt genau einen</w:t>
+      </w:r>
+      <w:r>
+        <w:t xml:space="preserve"> </w:t>
+      </w:r>
+      <w:r>
+        <w:rPr>
+          <w:rStyle w:val="VerbatimChar"/>
+        </w:rPr>
+        <w:t xml:space="preserve">WindowDay</w:t>
+      </w:r>
+      <w:r>
+        <w:t xml:space="preserve"> </w:t>
+      </w:r>
+      <w:r>
+        <w:t xml:space="preserve">ab. Laufen</w:t>
+      </w:r>
+      <w:r>
+        <w:t xml:space="preserve"> </w:t>
+      </w:r>
+      <w:r>
+        <w:rPr>
+          <w:rStyle w:val="VerbatimChar"/>
+        </w:rPr>
+        <w:t xml:space="preserve">ADAssessment</w:t>
+      </w:r>
+      <w:r>
+        <w:t xml:space="preserve"> </w:t>
+      </w:r>
+      <w:r>
+        <w:t xml:space="preserve">und</w:t>
+      </w:r>
+      <w:r>
+        <w:t xml:space="preserve"> </w:t>
+      </w:r>
+      <w:r>
+        <w:rPr>
+          <w:rStyle w:val="VerbatimChar"/>
+        </w:rPr>
+        <w:t xml:space="preserve">ADSecurityAssessment</w:t>
+      </w:r>
+      <w:r>
+        <w:t xml:space="preserve"> </w:t>
+      </w:r>
+      <w:r>
+        <w:t xml:space="preserve">an</w:t>
+      </w:r>
+      <w:r>
+        <w:t xml:space="preserve"> </w:t>
+      </w:r>
+      <w:r>
+        <w:rPr>
+          <w:b/>
+          <w:bCs/>
+        </w:rPr>
+        <w:t xml:space="preserve">verschiedenen Tagen</w:t>
+      </w:r>
+      <w:r>
+        <w:t xml:space="preserve"> </w:t>
+      </w:r>
+      <w:r>
+        <w:t xml:space="preserve">(im</w:t>
+      </w:r>
+      <w:r>
+        <w:t xml:space="preserve"> </w:t>
+      </w:r>
+      <w:r>
+        <w:t xml:space="preserve">obigen Befehl unterschiedliche</w:t>
+      </w:r>
+      <w:r>
+        <w:t xml:space="preserve"> </w:t>
+      </w:r>
+      <w:r>
+        <w:rPr>
+          <w:rStyle w:val="VerbatimChar"/>
+        </w:rPr>
+        <w:t xml:space="preserve">StartBoundary</w:t>
+      </w:r>
+      <w:r>
+        <w:t xml:space="preserve">), wertet der Watcher den am Fenstertag fehlenden</w:t>
+      </w:r>
+      <w:r>
+        <w:t xml:space="preserve"> </w:t>
+      </w:r>
+      <w:r>
+        <w:t xml:space="preserve">Task nach</w:t>
+      </w:r>
+      <w:r>
+        <w:t xml:space="preserve"> </w:t>
+      </w:r>
+      <w:r>
+        <w:rPr>
+          <w:rStyle w:val="VerbatimChar"/>
+        </w:rPr>
+        <w:t xml:space="preserve">NoStartTimeoutMinutes</w:t>
+      </w:r>
+      <w:r>
+        <w:t xml:space="preserve"> </w:t>
+      </w:r>
+      <w:r>
+        <w:t xml:space="preserve">als</w:t>
+      </w:r>
+      <w:r>
+        <w:t xml:space="preserve"> </w:t>
+      </w:r>
+      <w:r>
+        <w:rPr>
+          <w:i/>
+          <w:iCs/>
+        </w:rPr>
+        <w:t xml:space="preserve">nicht gelaufen</w:t>
+      </w:r>
+      <w:r>
+        <w:t xml:space="preserve"> </w:t>
+      </w:r>
+      <w:r>
+        <w:t xml:space="preserve">(</w:t>
+      </w:r>
+      <w:r>
+        <w:rPr>
+          <w:rStyle w:val="VerbatimChar"/>
+        </w:rPr>
+        <w:t xml:space="preserve">Incomplete</w:t>
+      </w:r>
+      <w:r>
+        <w:t xml:space="preserve">), entzieht EA – und das</w:t>
+      </w:r>
+      <w:r>
+        <w:t xml:space="preserve"> </w:t>
+      </w:r>
+      <w:r>
+        <w:t xml:space="preserve">Assessment am anderen Tag läuft</w:t>
+      </w:r>
+      <w:r>
+        <w:t xml:space="preserve"> </w:t>
+      </w:r>
+      <w:r>
+        <w:rPr>
+          <w:b/>
+          <w:bCs/>
+        </w:rPr>
+        <w:t xml:space="preserve">ohne</w:t>
+      </w:r>
+      <w:r>
+        <w:t xml:space="preserve"> </w:t>
+      </w:r>
+      <w:r>
+        <w:t xml:space="preserve">EA, also mit unvollständigen Ergebnissen.</w:t>
+      </w:r>
+    </w:p>
+    <w:p>
+      <w:pPr>
+        <w:pStyle w:val="BodyText"/>
+      </w:pPr>
+      <w:r>
+        <w:rPr>
+          <w:b/>
+          <w:bCs/>
+        </w:rPr>
+        <w:t xml:space="preserve">Option A (empfohlen): beide Trigger auf denselben Tag.</w:t>
+      </w:r>
+      <w:r>
+        <w:t xml:space="preserve"> </w:t>
+      </w:r>
+      <w:r>
+        <w:t xml:space="preserve">Kurz nacheinander, passend zu</w:t>
+      </w:r>
+      <w:r>
+        <w:t xml:space="preserve"> </w:t>
+      </w:r>
+      <w:r>
+        <w:rPr>
+          <w:rStyle w:val="VerbatimChar"/>
+        </w:rPr>
+        <w:t xml:space="preserve">WindowDay</w:t>
+      </w:r>
+      <w:r>
+        <w:t xml:space="preserve">/</w:t>
+      </w:r>
+      <w:r>
+        <w:rPr>
+          <w:rStyle w:val="VerbatimChar"/>
+        </w:rPr>
+        <w:t xml:space="preserve">WindowStart</w:t>
+      </w:r>
+      <w:r>
+        <w:t xml:space="preserve"> </w:t>
+      </w:r>
+      <w:r>
+        <w:t xml:space="preserve">(z. B. Sonntag 02:00 und 02:30):</w:t>
+      </w:r>
+    </w:p>
+    <w:p>
+      <w:pPr>
+        <w:pStyle w:val="SourceCode"/>
+      </w:pPr>
+      <w:r>
+        <w:rPr>
+          <w:rStyle w:val="NormalTok"/>
+        </w:rPr>
+        <w:t xml:space="preserve">Set-ScheduledTask </w:t>
+      </w:r>
+      <w:r>
+        <w:rPr>
+          <w:rStyle w:val="OperatorTok"/>
+        </w:rPr>
+        <w:t xml:space="preserve">-</w:t>
+      </w:r>
+      <w:r>
+        <w:rPr>
+          <w:rStyle w:val="NormalTok"/>
+        </w:rPr>
+        <w:t xml:space="preserve">TaskName ADAssessment         </w:t>
+      </w:r>
+      <w:r>
+        <w:rPr>
+          <w:rStyle w:val="OperatorTok"/>
+        </w:rPr>
+        <w:t xml:space="preserve">-</w:t>
+      </w:r>
+      <w:r>
+        <w:rPr>
+          <w:rStyle w:val="NormalTok"/>
+        </w:rPr>
+        <w:t xml:space="preserve">Trigger </w:t>
+      </w:r>
+      <w:r>
+        <w:rPr>
+          <w:rStyle w:val="OperatorTok"/>
+        </w:rPr>
+        <w:t xml:space="preserve">(</w:t>
+      </w:r>
+      <w:r>
+        <w:rPr>
+          <w:rStyle w:val="NormalTok"/>
+        </w:rPr>
+        <w:t xml:space="preserve">New-ScheduledTaskTrigger </w:t>
+      </w:r>
+      <w:r>
+        <w:rPr>
+          <w:rStyle w:val="OperatorTok"/>
+        </w:rPr>
+        <w:t xml:space="preserve">-</w:t>
+      </w:r>
+      <w:r>
+        <w:rPr>
+          <w:rStyle w:val="NormalTok"/>
+        </w:rPr>
+        <w:t xml:space="preserve">Weekly </w:t>
+      </w:r>
+      <w:r>
+        <w:rPr>
+          <w:rStyle w:val="OperatorTok"/>
+        </w:rPr>
+        <w:t xml:space="preserve">-</w:t>
+      </w:r>
+      <w:r>
+        <w:rPr>
+          <w:rStyle w:val="NormalTok"/>
+        </w:rPr>
+        <w:t xml:space="preserve">DaysOfWeek Sunday </w:t>
+      </w:r>
+      <w:r>
+        <w:rPr>
+          <w:rStyle w:val="OperatorTok"/>
+        </w:rPr>
+        <w:t xml:space="preserve">-</w:t>
+      </w:r>
+      <w:r>
+        <w:rPr>
+          <w:rStyle w:val="NormalTok"/>
+        </w:rPr>
+        <w:t xml:space="preserve">At </w:t>
+      </w:r>
+      <w:r>
+        <w:rPr>
+          <w:rStyle w:val="DecValTok"/>
+        </w:rPr>
+        <w:t xml:space="preserve">02</w:t>
+      </w:r>
+      <w:r>
+        <w:rPr>
+          <w:rStyle w:val="OperatorTok"/>
+        </w:rPr>
+        <w:t xml:space="preserve">:</w:t>
+      </w:r>
+      <w:r>
+        <w:rPr>
+          <w:rStyle w:val="DecValTok"/>
+        </w:rPr>
+        <w:t xml:space="preserve">00</w:t>
+      </w:r>
+      <w:r>
+        <w:rPr>
+          <w:rStyle w:val="OperatorTok"/>
+        </w:rPr>
+        <w:t xml:space="preserve">)</w:t>
+      </w:r>
+      <w:r>
+        <w:br/>
+      </w:r>
+      <w:r>
+        <w:rPr>
+          <w:rStyle w:val="NormalTok"/>
+        </w:rPr>
+        <w:t xml:space="preserve">Set-ScheduledTask </w:t>
+      </w:r>
+      <w:r>
+        <w:rPr>
+          <w:rStyle w:val="OperatorTok"/>
+        </w:rPr>
+        <w:t xml:space="preserve">-</w:t>
+      </w:r>
+      <w:r>
+        <w:rPr>
+          <w:rStyle w:val="NormalTok"/>
+        </w:rPr>
+        <w:t xml:space="preserve">TaskName ADSecurityAssessment </w:t>
+      </w:r>
+      <w:r>
+        <w:rPr>
+          <w:rStyle w:val="OperatorTok"/>
+        </w:rPr>
+        <w:t xml:space="preserve">-</w:t>
+      </w:r>
+      <w:r>
+        <w:rPr>
+          <w:rStyle w:val="NormalTok"/>
+        </w:rPr>
+        <w:t xml:space="preserve">Trigger </w:t>
+      </w:r>
+      <w:r>
+        <w:rPr>
+          <w:rStyle w:val="OperatorTok"/>
+        </w:rPr>
+        <w:t xml:space="preserve">(</w:t>
+      </w:r>
+      <w:r>
+        <w:rPr>
+          <w:rStyle w:val="NormalTok"/>
+        </w:rPr>
+        <w:t xml:space="preserve">New-ScheduledTaskTrigger </w:t>
+      </w:r>
+      <w:r>
+        <w:rPr>
+          <w:rStyle w:val="OperatorTok"/>
+        </w:rPr>
+        <w:t xml:space="preserve">-</w:t>
+      </w:r>
+      <w:r>
+        <w:rPr>
+          <w:rStyle w:val="NormalTok"/>
+        </w:rPr>
+        <w:t xml:space="preserve">Weekly </w:t>
+      </w:r>
+      <w:r>
+        <w:rPr>
+          <w:rStyle w:val="OperatorTok"/>
+        </w:rPr>
+        <w:t xml:space="preserve">-</w:t>
+      </w:r>
+      <w:r>
+        <w:rPr>
+          <w:rStyle w:val="NormalTok"/>
+        </w:rPr>
+        <w:t xml:space="preserve">DaysOfWeek Sunday </w:t>
+      </w:r>
+      <w:r>
+        <w:rPr>
+          <w:rStyle w:val="OperatorTok"/>
+        </w:rPr>
+        <w:t xml:space="preserve">-</w:t>
+      </w:r>
+      <w:r>
+        <w:rPr>
+          <w:rStyle w:val="NormalTok"/>
+        </w:rPr>
+        <w:t xml:space="preserve">At </w:t>
+      </w:r>
+      <w:r>
+        <w:rPr>
+          <w:rStyle w:val="DecValTok"/>
+        </w:rPr>
+        <w:t xml:space="preserve">02</w:t>
+      </w:r>
+      <w:r>
+        <w:rPr>
+          <w:rStyle w:val="OperatorTok"/>
+        </w:rPr>
+        <w:t xml:space="preserve">:</w:t>
+      </w:r>
+      <w:r>
+        <w:rPr>
+          <w:rStyle w:val="DecValTok"/>
+        </w:rPr>
+        <w:t xml:space="preserve">30</w:t>
+      </w:r>
+      <w:r>
+        <w:rPr>
+          <w:rStyle w:val="OperatorTok"/>
+        </w:rPr>
+        <w:t xml:space="preserve">)</w:t>
+      </w:r>
+    </w:p>
+    <w:p>
+      <w:pPr>
+        <w:pStyle w:val="FirstParagraph"/>
+      </w:pPr>
+      <w:r>
+        <w:rPr>
+          <w:b/>
+          <w:bCs/>
+        </w:rPr>
+        <w:t xml:space="preserve">Option B (getrennte Tage beibehalten): zwei JIT-Fenster.</w:t>
+      </w:r>
+      <w:r>
+        <w:t xml:space="preserve"> </w:t>
+      </w:r>
+      <w:r>
+        <w:t xml:space="preserve">Pro Tag ein eigenes</w:t>
+      </w:r>
+      <w:r>
+        <w:t xml:space="preserve"> </w:t>
+      </w:r>
+      <w:r>
+        <w:t xml:space="preserve">Config-/Grant-/Watcher-Paar mit</w:t>
+      </w:r>
+      <w:r>
+        <w:t xml:space="preserve"> </w:t>
+      </w:r>
+      <w:r>
+        <w:rPr>
+          <w:b/>
+          <w:bCs/>
+        </w:rPr>
+        <w:t xml:space="preserve">nur einem</w:t>
+      </w:r>
+      <w:r>
+        <w:t xml:space="preserve"> </w:t>
+      </w:r>
+      <w:r>
+        <w:t xml:space="preserve">Assessment in</w:t>
+      </w:r>
+      <w:r>
+        <w:t xml:space="preserve"> </w:t>
+      </w:r>
+      <w:r>
+        <w:rPr>
+          <w:rStyle w:val="VerbatimChar"/>
+        </w:rPr>
+        <w:t xml:space="preserve">OdaTaskNames</w:t>
+      </w:r>
+      <w:r>
+        <w:t xml:space="preserve"> </w:t>
+      </w:r>
+      <w:r>
+        <w:t xml:space="preserve">und</w:t>
+      </w:r>
+      <w:r>
+        <w:t xml:space="preserve"> </w:t>
+      </w:r>
+      <w:r>
+        <w:rPr>
+          <w:b/>
+          <w:bCs/>
+        </w:rPr>
+        <w:t xml:space="preserve">eigenem</w:t>
+      </w:r>
+      <w:r>
+        <w:rPr>
+          <w:b/>
+          <w:bCs/>
+        </w:rPr>
+        <w:t xml:space="preserve"> </w:t>
+      </w:r>
+      <w:r>
+        <w:rPr>
+          <w:rStyle w:val="VerbatimChar"/>
+          <w:b/>
+          <w:bCs/>
+        </w:rPr>
+        <w:t xml:space="preserve">ForestName</w:t>
+      </w:r>
+      <w:r>
+        <w:rPr>
+          <w:b/>
+          <w:bCs/>
+        </w:rPr>
+        <w:t xml:space="preserve">-Label</w:t>
+      </w:r>
+      <w:r>
+        <w:t xml:space="preserve"> </w:t>
+      </w:r>
+      <w:r>
+        <w:t xml:space="preserve">(sonst kollidieren die Tasknamen</w:t>
+      </w:r>
+      <w:r>
+        <w:t xml:space="preserve"> </w:t>
+      </w:r>
+      <w:r>
+        <w:rPr>
+          <w:rStyle w:val="VerbatimChar"/>
+        </w:rPr>
+        <w:t xml:space="preserve">ODA-JIT-Grant-&lt;ForestName&gt;</w:t>
+      </w:r>
+      <w:r>
+        <w:t xml:space="preserve">).</w:t>
+      </w:r>
+      <w:r>
+        <w:t xml:space="preserve"> </w:t>
+      </w:r>
+      <w:r>
+        <w:rPr>
+          <w:rStyle w:val="VerbatimChar"/>
+        </w:rPr>
+        <w:t xml:space="preserve">AccountGroupDN</w:t>
+      </w:r>
+      <w:r>
+        <w:t xml:space="preserve">,</w:t>
+      </w:r>
+      <w:r>
+        <w:t xml:space="preserve"> </w:t>
+      </w:r>
+      <w:r>
+        <w:rPr>
+          <w:rStyle w:val="VerbatimChar"/>
+        </w:rPr>
+        <w:t xml:space="preserve">ForestRootServer</w:t>
+      </w:r>
+      <w:r>
+        <w:t xml:space="preserve">,</w:t>
+      </w:r>
+      <w:r>
+        <w:t xml:space="preserve"> </w:t>
+      </w:r>
+      <w:r>
+        <w:rPr>
+          <w:rStyle w:val="VerbatimChar"/>
+        </w:rPr>
+        <w:t xml:space="preserve">SiteGlobalCatalogs</w:t>
+      </w:r>
+      <w:r>
+        <w:t xml:space="preserve">,</w:t>
+      </w:r>
+      <w:r>
+        <w:t xml:space="preserve"> </w:t>
+      </w:r>
+      <w:r>
+        <w:rPr>
+          <w:rStyle w:val="VerbatimChar"/>
+        </w:rPr>
+        <w:t xml:space="preserve">Collector</w:t>
+      </w:r>
+      <w:r>
+        <w:t xml:space="preserve"> </w:t>
+      </w:r>
+      <w:r>
+        <w:t xml:space="preserve">und</w:t>
+      </w:r>
+      <w:r>
+        <w:t xml:space="preserve"> </w:t>
+      </w:r>
+      <w:r>
+        <w:rPr>
+          <w:rStyle w:val="VerbatimChar"/>
+        </w:rPr>
+        <w:t xml:space="preserve">ExecutorAccount</w:t>
+      </w:r>
+      <w:r>
+        <w:t xml:space="preserve"> </w:t>
+      </w:r>
+      <w:r>
+        <w:t xml:space="preserve">bleiben identisch;</w:t>
+      </w:r>
+      <w:r>
+        <w:t xml:space="preserve"> </w:t>
+      </w:r>
+      <w:r>
+        <w:t xml:space="preserve">dasselbe gMSA bekommt an beiden Tagen für je ein kurzes Fenster EA.</w:t>
+      </w:r>
+    </w:p>
+    <w:tbl>
+      <w:tblPr>
+        <w:tblStyle w:val="Table"/>
+        <w:tblW w:type="pct" w:w="5000"/>
+        <w:tblLayout w:type="fixed"/>
+        <w:tblLook w:firstRow="1" w:lastRow="0" w:firstColumn="0" w:lastColumn="0" w:noHBand="0" w:noVBand="0" w:val="0020"/>
+      </w:tblPr>
+      <w:tblGrid>
+        <w:gridCol w:w="805"/>
+        <w:gridCol w:w="1610"/>
+        <w:gridCol w:w="3624"/>
+        <w:gridCol w:w="1879"/>
+      </w:tblGrid>
+      <w:tr>
+        <w:trPr>
+          <w:tblHeader w:val="on"/>
+        </w:trPr>
+        <w:tc>
+          <w:tcPr/>
+          <w:p>
+            <w:pPr>
+              <w:pStyle w:val="Compact"/>
+            </w:pPr>
+            <w:r>
+              <w:t xml:space="preserve">Config</w:t>
+            </w:r>
+          </w:p>
+        </w:tc>
+        <w:tc>
+          <w:tcPr/>
+          <w:p>
+            <w:pPr>
+              <w:pStyle w:val="Compact"/>
+            </w:pPr>
+            <w:r>
+              <w:rPr>
+                <w:rStyle w:val="VerbatimChar"/>
+              </w:rPr>
+              <w:t xml:space="preserve">ForestName</w:t>
+            </w:r>
+          </w:p>
+        </w:tc>
+        <w:tc>
+          <w:tcPr/>
+          <w:p>
+            <w:pPr>
+              <w:pStyle w:val="Compact"/>
+            </w:pPr>
+            <w:r>
+              <w:rPr>
+                <w:rStyle w:val="VerbatimChar"/>
+              </w:rPr>
+              <w:t xml:space="preserve">WindowDay</w:t>
+            </w:r>
+            <w:r>
+              <w:t xml:space="preserve"> </w:t>
+            </w:r>
+            <w:r>
+              <w:t xml:space="preserve">/</w:t>
+            </w:r>
+            <w:r>
+              <w:t xml:space="preserve"> </w:t>
+            </w:r>
+            <w:r>
+              <w:rPr>
+                <w:rStyle w:val="VerbatimChar"/>
+              </w:rPr>
+              <w:t xml:space="preserve">WindowStart</w:t>
+            </w:r>
+          </w:p>
+        </w:tc>
+        <w:tc>
+          <w:tcPr/>
+          <w:p>
+            <w:pPr>
+              <w:pStyle w:val="Compact"/>
+            </w:pPr>
+            <w:r>
+              <w:rPr>
+                <w:rStyle w:val="VerbatimChar"/>
+              </w:rPr>
+              <w:t xml:space="preserve">OdaTaskNames</w:t>
+            </w:r>
+          </w:p>
+        </w:tc>
+      </w:tr>
+      <w:tr>
+        <w:tc>
+          <w:tcPr/>
+          <w:p>
+            <w:pPr>
+              <w:pStyle w:val="Compact"/>
+            </w:pPr>
+            <w:r>
+              <w:rPr>
+                <w:rStyle w:val="VerbatimChar"/>
+              </w:rPr>
+              <w:t xml:space="preserve">ODAJit.&lt;forest&gt;-ad.psd1</w:t>
+            </w:r>
+          </w:p>
+        </w:tc>
+        <w:tc>
+          <w:tcPr/>
+          <w:p>
+            <w:pPr>
+              <w:pStyle w:val="Compact"/>
+            </w:pPr>
+            <w:r>
+              <w:rPr>
+                <w:rStyle w:val="VerbatimChar"/>
+              </w:rPr>
+              <w:t xml:space="preserve">forest-a-ad</w:t>
+            </w:r>
+          </w:p>
+        </w:tc>
+        <w:tc>
+          <w:tcPr/>
+          <w:p>
+            <w:pPr>
+              <w:pStyle w:val="Compact"/>
+            </w:pPr>
+            <w:r>
+              <w:t xml:space="preserve">Tuesday / 06:00</w:t>
+            </w:r>
+          </w:p>
+        </w:tc>
+        <w:tc>
+          <w:tcPr/>
+          <w:p>
+            <w:pPr>
+              <w:pStyle w:val="Compact"/>
+            </w:pPr>
+            <w:r>
+              <w:rPr>
+                <w:rStyle w:val="VerbatimChar"/>
+              </w:rPr>
+              <w:t xml:space="preserve">@('ADAssessment')</w:t>
+            </w:r>
+          </w:p>
+        </w:tc>
+      </w:tr>
+      <w:tr>
+        <w:tc>
+          <w:tcPr/>
+          <w:p>
+            <w:pPr>
+              <w:pStyle w:val="Compact"/>
+            </w:pPr>
+            <w:r>
+              <w:rPr>
+                <w:rStyle w:val="VerbatimChar"/>
+              </w:rPr>
+              <w:t xml:space="preserve">ODAJit.&lt;forest&gt;-adsec.psd1</w:t>
+            </w:r>
+          </w:p>
+        </w:tc>
+        <w:tc>
+          <w:tcPr/>
+          <w:p>
+            <w:pPr>
+              <w:pStyle w:val="Compact"/>
+            </w:pPr>
+            <w:r>
+              <w:rPr>
+                <w:rStyle w:val="VerbatimChar"/>
+              </w:rPr>
+              <w:t xml:space="preserve">forest-a-adsec</w:t>
+            </w:r>
+          </w:p>
+        </w:tc>
+        <w:tc>
+          <w:tcPr/>
+          <w:p>
+            <w:pPr>
+              <w:pStyle w:val="Compact"/>
+            </w:pPr>
+            <w:r>
+              <w:t xml:space="preserve">Wednesday / 05:43</w:t>
+            </w:r>
+          </w:p>
+        </w:tc>
+        <w:tc>
+          <w:tcPr/>
+          <w:p>
+            <w:pPr>
+              <w:pStyle w:val="Compact"/>
+            </w:pPr>
+            <w:r>
+              <w:rPr>
+                <w:rStyle w:val="VerbatimChar"/>
+              </w:rPr>
+              <w:t xml:space="preserve">@('ADSecurityAssessment')</w:t>
+            </w:r>
+          </w:p>
+        </w:tc>
+      </w:tr>
+    </w:tbl>
+    <w:p>
+      <w:pPr>
+        <w:pStyle w:val="BodyText"/>
+      </w:pPr>
+      <w:r>
+        <w:rPr>
+          <w:rStyle w:val="VerbatimChar"/>
+        </w:rPr>
+        <w:t xml:space="preserve">DeadlineHours</w:t>
+      </w:r>
+      <w:r>
+        <w:t xml:space="preserve">/</w:t>
+      </w:r>
+      <w:r>
+        <w:rPr>
+          <w:rStyle w:val="VerbatimChar"/>
+        </w:rPr>
+        <w:t xml:space="preserve">TtlHours</w:t>
+      </w:r>
+      <w:r>
+        <w:t xml:space="preserve"> </w:t>
+      </w:r>
+      <w:r>
+        <w:rPr>
+          <w:b/>
+          <w:bCs/>
+        </w:rPr>
+        <w:t xml:space="preserve">nicht</w:t>
+      </w:r>
+      <w:r>
+        <w:t xml:space="preserve"> </w:t>
+      </w:r>
+      <w:r>
+        <w:t xml:space="preserve">über mehrere Tage dehnen – EA bliebe sonst 24 h+ aktiv und der</w:t>
+      </w:r>
+      <w:r>
+        <w:t xml:space="preserve"> </w:t>
+      </w:r>
+      <w:r>
+        <w:t xml:space="preserve">JIT-Zweck wäre dahin.</w:t>
+      </w:r>
+    </w:p>
     <w:bookmarkEnd w:id="22"/>
     <w:bookmarkStart w:id="23" w:name="schritt-7-probelauf-ohne-änderungen"/>
     <w:p>
@@ -9592,6 +10433,102 @@
                 <w:rStyle w:val="VerbatimChar"/>
               </w:rPr>
               <w:t xml:space="preserve">Missing=[…]</w:t>
+            </w:r>
+          </w:p>
+        </w:tc>
+      </w:tr>
+      <w:tr>
+        <w:tc>
+          <w:tcPr/>
+          <w:p>
+            <w:pPr>
+              <w:pStyle w:val="Compact"/>
+            </w:pPr>
+            <w:r>
+              <w:t xml:space="preserve">Watcher endet mit</w:t>
+            </w:r>
+            <w:r>
+              <w:t xml:space="preserve"> </w:t>
+            </w:r>
+            <w:r>
+              <w:rPr>
+                <w:rStyle w:val="VerbatimChar"/>
+              </w:rPr>
+              <w:t xml:space="preserve">Incomplete</w:t>
+            </w:r>
+            <w:r>
+              <w:t xml:space="preserve">, ein Assessment fehlt (Event 1013)</w:t>
+            </w:r>
+          </w:p>
+        </w:tc>
+        <w:tc>
+          <w:tcPr/>
+          <w:p>
+            <w:pPr>
+              <w:pStyle w:val="Compact"/>
+            </w:pPr>
+            <w:r>
+              <w:rPr>
+                <w:rStyle w:val="VerbatimChar"/>
+              </w:rPr>
+              <w:t xml:space="preserve">ADAssessment</w:t>
+            </w:r>
+            <w:r>
+              <w:t xml:space="preserve"> </w:t>
+            </w:r>
+            <w:r>
+              <w:t xml:space="preserve">und</w:t>
+            </w:r>
+            <w:r>
+              <w:t xml:space="preserve"> </w:t>
+            </w:r>
+            <w:r>
+              <w:rPr>
+                <w:rStyle w:val="VerbatimChar"/>
+              </w:rPr>
+              <w:t xml:space="preserve">ADSecurityAssessment</w:t>
+            </w:r>
+            <w:r>
+              <w:t xml:space="preserve"> </w:t>
+            </w:r>
+            <w:r>
+              <w:t xml:space="preserve">laufen an</w:t>
+            </w:r>
+            <w:r>
+              <w:t xml:space="preserve"> </w:t>
+            </w:r>
+            <w:r>
+              <w:rPr>
+                <w:b/>
+                <w:bCs/>
+              </w:rPr>
+              <w:t xml:space="preserve">verschiedenen Tagen</w:t>
+            </w:r>
+          </w:p>
+        </w:tc>
+        <w:tc>
+          <w:tcPr/>
+          <w:p>
+            <w:pPr>
+              <w:pStyle w:val="Compact"/>
+            </w:pPr>
+            <w:r>
+              <w:t xml:space="preserve">Beide auf denselben</w:t>
+            </w:r>
+            <w:r>
+              <w:t xml:space="preserve"> </w:t>
+            </w:r>
+            <w:r>
+              <w:rPr>
+                <w:rStyle w:val="VerbatimChar"/>
+              </w:rPr>
+              <w:t xml:space="preserve">WindowDay</w:t>
+            </w:r>
+            <w:r>
+              <w:t xml:space="preserve"> </w:t>
+            </w:r>
+            <w:r>
+              <w:t xml:space="preserve">legen (Schritt 6, Option A) oder zwei getrennte Fenster (Option B)</w:t>
             </w:r>
           </w:p>
         </w:tc>
@@ -22098,6 +23035,232 @@
     <w:pPr>
       <w:wordWrap w:val="off"/>
     </w:pPr>
+  </w:style>
+  <w:style w:customStyle="1" w:styleId="KeywordTok" w:type="character">
+    <w:name w:val="KeywordTok"/>
+    <w:basedOn w:val="VerbatimChar"/>
+    <w:rPr>
+      <w:b/>
+      <w:color w:val="007020"/>
+    </w:rPr>
+  </w:style>
+  <w:style w:customStyle="1" w:styleId="DataTypeTok" w:type="character">
+    <w:name w:val="DataTypeTok"/>
+    <w:basedOn w:val="VerbatimChar"/>
+    <w:rPr>
+      <w:color w:val="902000"/>
+    </w:rPr>
+  </w:style>
+  <w:style w:customStyle="1" w:styleId="DecValTok" w:type="character">
+    <w:name w:val="DecValTok"/>
+    <w:basedOn w:val="VerbatimChar"/>
+    <w:rPr>
+      <w:color w:val="40a070"/>
+    </w:rPr>
+  </w:style>
+  <w:style w:customStyle="1" w:styleId="BaseNTok" w:type="character">
+    <w:name w:val="BaseNTok"/>
+    <w:basedOn w:val="VerbatimChar"/>
+    <w:rPr>
+      <w:color w:val="40a070"/>
+    </w:rPr>
+  </w:style>
+  <w:style w:customStyle="1" w:styleId="FloatTok" w:type="character">
+    <w:name w:val="FloatTok"/>
+    <w:basedOn w:val="VerbatimChar"/>
+    <w:rPr>
+      <w:color w:val="40a070"/>
+    </w:rPr>
+  </w:style>
+  <w:style w:customStyle="1" w:styleId="ConstantTok" w:type="character">
+    <w:name w:val="ConstantTok"/>
+    <w:basedOn w:val="VerbatimChar"/>
+    <w:rPr>
+      <w:color w:val="880000"/>
+    </w:rPr>
+  </w:style>
+  <w:style w:customStyle="1" w:styleId="CharTok" w:type="character">
+    <w:name w:val="CharTok"/>
+    <w:basedOn w:val="VerbatimChar"/>
+    <w:rPr>
+      <w:color w:val="4070a0"/>
+    </w:rPr>
+  </w:style>
+  <w:style w:customStyle="1" w:styleId="SpecialCharTok" w:type="character">
+    <w:name w:val="SpecialCharTok"/>
+    <w:basedOn w:val="VerbatimChar"/>
+    <w:rPr>
+      <w:color w:val="4070a0"/>
+    </w:rPr>
+  </w:style>
+  <w:style w:customStyle="1" w:styleId="StringTok" w:type="character">
+    <w:name w:val="StringTok"/>
+    <w:basedOn w:val="VerbatimChar"/>
+    <w:rPr>
+      <w:color w:val="4070a0"/>
+    </w:rPr>
+  </w:style>
+  <w:style w:customStyle="1" w:styleId="VerbatimStringTok" w:type="character">
+    <w:name w:val="VerbatimStringTok"/>
+    <w:basedOn w:val="VerbatimChar"/>
+    <w:rPr>
+      <w:color w:val="4070a0"/>
+    </w:rPr>
+  </w:style>
+  <w:style w:customStyle="1" w:styleId="SpecialStringTok" w:type="character">
+    <w:name w:val="SpecialStringTok"/>
+    <w:basedOn w:val="VerbatimChar"/>
+    <w:rPr>
+      <w:color w:val="bb6688"/>
+    </w:rPr>
+  </w:style>
+  <w:style w:customStyle="1" w:styleId="ImportTok" w:type="character">
+    <w:name w:val="ImportTok"/>
+    <w:basedOn w:val="VerbatimChar"/>
+    <w:rPr>
+      <w:b/>
+      <w:color w:val="008000"/>
+    </w:rPr>
+  </w:style>
+  <w:style w:customStyle="1" w:styleId="CommentTok" w:type="character">
+    <w:name w:val="CommentTok"/>
+    <w:basedOn w:val="VerbatimChar"/>
+    <w:rPr>
+      <w:i/>
+      <w:color w:val="60a0b0"/>
+    </w:rPr>
+  </w:style>
+  <w:style w:customStyle="1" w:styleId="DocumentationTok" w:type="character">
+    <w:name w:val="DocumentationTok"/>
+    <w:basedOn w:val="VerbatimChar"/>
+    <w:rPr>
+      <w:i/>
+      <w:color w:val="ba2121"/>
+    </w:rPr>
+  </w:style>
+  <w:style w:customStyle="1" w:styleId="AnnotationTok" w:type="character">
+    <w:name w:val="AnnotationTok"/>
+    <w:basedOn w:val="VerbatimChar"/>
+    <w:rPr>
+      <w:b/>
+      <w:i/>
+      <w:color w:val="60a0b0"/>
+    </w:rPr>
+  </w:style>
+  <w:style w:customStyle="1" w:styleId="CommentVarTok" w:type="character">
+    <w:name w:val="CommentVarTok"/>
+    <w:basedOn w:val="VerbatimChar"/>
+    <w:rPr>
+      <w:b/>
+      <w:i/>
+      <w:color w:val="60a0b0"/>
+    </w:rPr>
+  </w:style>
+  <w:style w:customStyle="1" w:styleId="OtherTok" w:type="character">
+    <w:name w:val="OtherTok"/>
+    <w:basedOn w:val="VerbatimChar"/>
+    <w:rPr>
+      <w:color w:val="007020"/>
+    </w:rPr>
+  </w:style>
+  <w:style w:customStyle="1" w:styleId="FunctionTok" w:type="character">
+    <w:name w:val="FunctionTok"/>
+    <w:basedOn w:val="VerbatimChar"/>
+    <w:rPr>
+      <w:color w:val="06287e"/>
+    </w:rPr>
+  </w:style>
+  <w:style w:customStyle="1" w:styleId="VariableTok" w:type="character">
+    <w:name w:val="VariableTok"/>
+    <w:basedOn w:val="VerbatimChar"/>
+    <w:rPr>
+      <w:color w:val="19177c"/>
+    </w:rPr>
+  </w:style>
+  <w:style w:customStyle="1" w:styleId="ControlFlowTok" w:type="character">
+    <w:name w:val="ControlFlowTok"/>
+    <w:basedOn w:val="VerbatimChar"/>
+    <w:rPr>
+      <w:b/>
+      <w:color w:val="007020"/>
+    </w:rPr>
+  </w:style>
+  <w:style w:customStyle="1" w:styleId="OperatorTok" w:type="character">
+    <w:name w:val="OperatorTok"/>
+    <w:basedOn w:val="VerbatimChar"/>
+    <w:rPr>
+      <w:color w:val="666666"/>
+    </w:rPr>
+  </w:style>
+  <w:style w:customStyle="1" w:styleId="BuiltInTok" w:type="character">
+    <w:name w:val="BuiltInTok"/>
+    <w:basedOn w:val="VerbatimChar"/>
+    <w:rPr>
+      <w:color w:val="008000"/>
+    </w:rPr>
+  </w:style>
+  <w:style w:customStyle="1" w:styleId="ExtensionTok" w:type="character">
+    <w:name w:val="ExtensionTok"/>
+    <w:basedOn w:val="VerbatimChar"/>
+    <w:rPr/>
+  </w:style>
+  <w:style w:customStyle="1" w:styleId="PreprocessorTok" w:type="character">
+    <w:name w:val="PreprocessorTok"/>
+    <w:basedOn w:val="VerbatimChar"/>
+    <w:rPr>
+      <w:color w:val="bc7a00"/>
+    </w:rPr>
+  </w:style>
+  <w:style w:customStyle="1" w:styleId="AttributeTok" w:type="character">
+    <w:name w:val="AttributeTok"/>
+    <w:basedOn w:val="VerbatimChar"/>
+    <w:rPr>
+      <w:color w:val="7d9029"/>
+    </w:rPr>
+  </w:style>
+  <w:style w:customStyle="1" w:styleId="RegionMarkerTok" w:type="character">
+    <w:name w:val="RegionMarkerTok"/>
+    <w:basedOn w:val="VerbatimChar"/>
+    <w:rPr/>
+  </w:style>
+  <w:style w:customStyle="1" w:styleId="InformationTok" w:type="character">
+    <w:name w:val="InformationTok"/>
+    <w:basedOn w:val="VerbatimChar"/>
+    <w:rPr>
+      <w:b/>
+      <w:i/>
+      <w:color w:val="60a0b0"/>
+    </w:rPr>
+  </w:style>
+  <w:style w:customStyle="1" w:styleId="WarningTok" w:type="character">
+    <w:name w:val="WarningTok"/>
+    <w:basedOn w:val="VerbatimChar"/>
+    <w:rPr>
+      <w:b/>
+      <w:i/>
+      <w:color w:val="60a0b0"/>
+    </w:rPr>
+  </w:style>
+  <w:style w:customStyle="1" w:styleId="AlertTok" w:type="character">
+    <w:name w:val="AlertTok"/>
+    <w:basedOn w:val="VerbatimChar"/>
+    <w:rPr>
+      <w:b/>
+      <w:color w:val="ff0000"/>
+    </w:rPr>
+  </w:style>
+  <w:style w:customStyle="1" w:styleId="ErrorTok" w:type="character">
+    <w:name w:val="ErrorTok"/>
+    <w:basedOn w:val="VerbatimChar"/>
+    <w:rPr>
+      <w:b/>
+      <w:color w:val="ff0000"/>
+    </w:rPr>
+  </w:style>
+  <w:style w:customStyle="1" w:styleId="NormalTok" w:type="character">
+    <w:name w:val="NormalTok"/>
+    <w:basedOn w:val="VerbatimChar"/>
+    <w:rPr/>
   </w:style>
   <w:style w:customStyle="1" w:styleId="KeywordTok" w:type="character">
     <w:name w:val="KeywordTok"/>

</xml_diff>

<commit_message>
docs(jit): document changing an assessment task's time/day under gMSA
Step 6 now shows how customers change an ODA assessment task's trigger (day/time) while it runs under a gMSA: Set-ScheduledTask keeps the gMSA principal with LogonType Password (no credential needed), with TaskPath/RunLevel notes, verification, and the follow-up JIT config adjustment. Regenerated the German Word version.

Co-authored-by: Copilot <223556219+Copilot@users.noreply.github.com>
</commit_message>
<xml_diff>
--- a/docs/ODA-JIT-Deployment.de.docx
+++ b/docs/ODA-JIT-Deployment.de.docx
@@ -8152,14 +8152,138 @@
         <w:t xml:space="preserve">JIT-Zweck wäre dahin.</w:t>
       </w:r>
     </w:p>
-    <w:bookmarkEnd w:id="22"/>
-    <w:bookmarkStart w:id="23" w:name="schritt-7-probelauf-ohne-änderungen"/>
     <w:p>
       <w:pPr>
-        <w:pStyle w:val="Heading2"/>
+        <w:pStyle w:val="BodyText"/>
       </w:pPr>
       <w:r>
-        <w:t xml:space="preserve">Schritt 7 – Probelauf (ohne Änderungen)</w:t>
+        <w:rPr>
+          <w:b/>
+          <w:bCs/>
+        </w:rPr>
+        <w:t xml:space="preserve">Startzeit oder Wochentag einer Assessment-Aufgabe ändern (läuft unter gMSA).</w:t>
+      </w:r>
+      <w:r>
+        <w:t xml:space="preserve"> </w:t>
+      </w:r>
+      <w:r>
+        <w:t xml:space="preserve">Müssen Kunden</w:t>
+      </w:r>
+      <w:r>
+        <w:t xml:space="preserve"> </w:t>
+      </w:r>
+      <w:r>
+        <w:t xml:space="preserve">Tag/Uhrzeit anpassen, reicht</w:t>
+      </w:r>
+      <w:r>
+        <w:t xml:space="preserve"> </w:t>
+      </w:r>
+      <w:r>
+        <w:rPr>
+          <w:rStyle w:val="VerbatimChar"/>
+        </w:rPr>
+        <w:t xml:space="preserve">Set-ScheduledTask</w:t>
+      </w:r>
+      <w:r>
+        <w:t xml:space="preserve"> </w:t>
+      </w:r>
+      <w:r>
+        <w:t xml:space="preserve">mit einem neuen Trigger – der</w:t>
+      </w:r>
+      <w:r>
+        <w:t xml:space="preserve"> </w:t>
+      </w:r>
+      <w:r>
+        <w:rPr>
+          <w:b/>
+          <w:bCs/>
+        </w:rPr>
+        <w:t xml:space="preserve">gMSA-Principal</w:t>
+      </w:r>
+      <w:r>
+        <w:rPr>
+          <w:b/>
+          <w:bCs/>
+        </w:rPr>
+        <w:t xml:space="preserve"> </w:t>
+      </w:r>
+      <w:r>
+        <w:rPr>
+          <w:b/>
+          <w:bCs/>
+        </w:rPr>
+        <w:t xml:space="preserve">bleibt erhalten</w:t>
+      </w:r>
+      <w:r>
+        <w:t xml:space="preserve"> </w:t>
+      </w:r>
+      <w:r>
+        <w:t xml:space="preserve">und es ist</w:t>
+      </w:r>
+      <w:r>
+        <w:t xml:space="preserve"> </w:t>
+      </w:r>
+      <w:r>
+        <w:rPr>
+          <w:b/>
+          <w:bCs/>
+        </w:rPr>
+        <w:t xml:space="preserve">kein Kennwort</w:t>
+      </w:r>
+      <w:r>
+        <w:t xml:space="preserve"> </w:t>
+      </w:r>
+      <w:r>
+        <w:t xml:space="preserve">nötig (LogonType</w:t>
+      </w:r>
+      <w:r>
+        <w:t xml:space="preserve"> </w:t>
+      </w:r>
+      <w:r>
+        <w:rPr>
+          <w:rStyle w:val="VerbatimChar"/>
+        </w:rPr>
+        <w:t xml:space="preserve">Password</w:t>
+      </w:r>
+      <w:r>
+        <w:t xml:space="preserve">: das OS holt das</w:t>
+      </w:r>
+      <w:r>
+        <w:t xml:space="preserve"> </w:t>
+      </w:r>
+      <w:r>
+        <w:t xml:space="preserve">verwaltete Kennwort selbst). Beispiel: AD Security auf</w:t>
+      </w:r>
+      <w:r>
+        <w:t xml:space="preserve"> </w:t>
+      </w:r>
+      <w:r>
+        <w:rPr>
+          <w:b/>
+          <w:bCs/>
+        </w:rPr>
+        <w:t xml:space="preserve">Dienstag 07:00</w:t>
+      </w:r>
+      <w:r>
+        <w:t xml:space="preserve"> </w:t>
+      </w:r>
+      <w:r>
+        <w:t xml:space="preserve">(passend zu</w:t>
+      </w:r>
+      <w:r>
+        <w:t xml:space="preserve"> </w:t>
+      </w:r>
+      <w:r>
+        <w:rPr>
+          <w:rStyle w:val="VerbatimChar"/>
+        </w:rPr>
+        <w:t xml:space="preserve">ADAssessment</w:t>
+      </w:r>
+      <w:r>
+        <w:t xml:space="preserve"> </w:t>
+      </w:r>
+      <w:r>
+        <w:t xml:space="preserve">am Dienstag):</w:t>
       </w:r>
     </w:p>
     <w:p>
@@ -8168,42 +8292,513 @@
       </w:pPr>
       <w:r>
         <w:rPr>
+          <w:rStyle w:val="CommentTok"/>
+        </w:rPr>
+        <w:t xml:space="preserve"># 1) Principal prüfen (UserId = DOMAIN\ODA-SVC$, LogonType = Password)</w:t>
+      </w:r>
+      <w:r>
+        <w:br/>
+      </w:r>
+      <w:r>
+        <w:rPr>
+          <w:rStyle w:val="OperatorTok"/>
+        </w:rPr>
+        <w:t xml:space="preserve">(</w:t>
+      </w:r>
+      <w:r>
+        <w:rPr>
+          <w:rStyle w:val="NormalTok"/>
+        </w:rPr>
+        <w:t xml:space="preserve">Get-ScheduledTask </w:t>
+      </w:r>
+      <w:r>
+        <w:rPr>
+          <w:rStyle w:val="OperatorTok"/>
+        </w:rPr>
+        <w:t xml:space="preserve">-</w:t>
+      </w:r>
+      <w:r>
+        <w:rPr>
+          <w:rStyle w:val="NormalTok"/>
+        </w:rPr>
+        <w:t xml:space="preserve">TaskName ADSecurityAssessment</w:t>
+      </w:r>
+      <w:r>
+        <w:rPr>
+          <w:rStyle w:val="OperatorTok"/>
+        </w:rPr>
+        <w:t xml:space="preserve">).</w:t>
+      </w:r>
+      <w:r>
+        <w:rPr>
           <w:rStyle w:val="FunctionTok"/>
         </w:rPr>
-        <w:t xml:space="preserve">cd</w:t>
-      </w:r>
-      <w:r>
-        <w:rPr>
-          <w:rStyle w:val="NormalTok"/>
-        </w:rPr>
-        <w:t xml:space="preserve"> C</w:t>
+        <w:t xml:space="preserve">Principal</w:t>
+      </w:r>
+      <w:r>
+        <w:br/>
+      </w:r>
+      <w:r>
+        <w:br/>
+      </w:r>
+      <w:r>
+        <w:rPr>
+          <w:rStyle w:val="CommentTok"/>
+        </w:rPr>
+        <w:t xml:space="preserve"># 2) Nur den Trigger ändern – gMSA bleibt unangetastet, kein Passwort nötig</w:t>
+      </w:r>
+      <w:r>
+        <w:br/>
+      </w:r>
+      <w:r>
+        <w:rPr>
+          <w:rStyle w:val="VariableTok"/>
+        </w:rPr>
+        <w:t xml:space="preserve">$trigger</w:t>
+      </w:r>
+      <w:r>
+        <w:rPr>
+          <w:rStyle w:val="NormalTok"/>
+        </w:rPr>
+        <w:t xml:space="preserve"> </w:t>
       </w:r>
       <w:r>
         <w:rPr>
           <w:rStyle w:val="OperatorTok"/>
         </w:rPr>
-        <w:t xml:space="preserve">:</w:t>
-      </w:r>
-      <w:r>
-        <w:rPr>
-          <w:rStyle w:val="NormalTok"/>
-        </w:rPr>
-        <w:t xml:space="preserve">\ODA-JIT</w:t>
+        <w:t xml:space="preserve">=</w:t>
+      </w:r>
+      <w:r>
+        <w:rPr>
+          <w:rStyle w:val="NormalTok"/>
+        </w:rPr>
+        <w:t xml:space="preserve"> New-ScheduledTaskTrigger </w:t>
+      </w:r>
+      <w:r>
+        <w:rPr>
+          <w:rStyle w:val="OperatorTok"/>
+        </w:rPr>
+        <w:t xml:space="preserve">-</w:t>
+      </w:r>
+      <w:r>
+        <w:rPr>
+          <w:rStyle w:val="NormalTok"/>
+        </w:rPr>
+        <w:t xml:space="preserve">Weekly </w:t>
+      </w:r>
+      <w:r>
+        <w:rPr>
+          <w:rStyle w:val="OperatorTok"/>
+        </w:rPr>
+        <w:t xml:space="preserve">-</w:t>
+      </w:r>
+      <w:r>
+        <w:rPr>
+          <w:rStyle w:val="NormalTok"/>
+        </w:rPr>
+        <w:t xml:space="preserve">DaysOfWeek Tuesday </w:t>
+      </w:r>
+      <w:r>
+        <w:rPr>
+          <w:rStyle w:val="OperatorTok"/>
+        </w:rPr>
+        <w:t xml:space="preserve">-</w:t>
+      </w:r>
+      <w:r>
+        <w:rPr>
+          <w:rStyle w:val="NormalTok"/>
+        </w:rPr>
+        <w:t xml:space="preserve">At </w:t>
+      </w:r>
+      <w:r>
+        <w:rPr>
+          <w:rStyle w:val="OperatorTok"/>
+        </w:rPr>
+        <w:t xml:space="preserve">([</w:t>
+      </w:r>
+      <w:r>
+        <w:rPr>
+          <w:rStyle w:val="NormalTok"/>
+        </w:rPr>
+        <w:t xml:space="preserve">datetime</w:t>
+      </w:r>
+      <w:r>
+        <w:rPr>
+          <w:rStyle w:val="OperatorTok"/>
+        </w:rPr>
+        <w:t xml:space="preserve">]</w:t>
+      </w:r>
+      <w:r>
+        <w:rPr>
+          <w:rStyle w:val="StringTok"/>
+        </w:rPr>
+        <w:t xml:space="preserve">'07:00'</w:t>
+      </w:r>
+      <w:r>
+        <w:rPr>
+          <w:rStyle w:val="OperatorTok"/>
+        </w:rPr>
+        <w:t xml:space="preserve">)</w:t>
       </w:r>
       <w:r>
         <w:br/>
       </w:r>
       <w:r>
         <w:rPr>
+          <w:rStyle w:val="NormalTok"/>
+        </w:rPr>
+        <w:t xml:space="preserve">Set-ScheduledTask </w:t>
+      </w:r>
+      <w:r>
+        <w:rPr>
           <w:rStyle w:val="OperatorTok"/>
         </w:rPr>
+        <w:t xml:space="preserve">-</w:t>
+      </w:r>
+      <w:r>
+        <w:rPr>
+          <w:rStyle w:val="NormalTok"/>
+        </w:rPr>
+        <w:t xml:space="preserve">TaskName ADSecurityAssessment </w:t>
+      </w:r>
+      <w:r>
+        <w:rPr>
+          <w:rStyle w:val="OperatorTok"/>
+        </w:rPr>
+        <w:t xml:space="preserve">-</w:t>
+      </w:r>
+      <w:r>
+        <w:rPr>
+          <w:rStyle w:val="NormalTok"/>
+        </w:rPr>
+        <w:t xml:space="preserve">Trigger </w:t>
+      </w:r>
+      <w:r>
+        <w:rPr>
+          <w:rStyle w:val="VariableTok"/>
+        </w:rPr>
+        <w:t xml:space="preserve">$trigger</w:t>
+      </w:r>
+      <w:r>
+        <w:br/>
+      </w:r>
+      <w:r>
+        <w:br/>
+      </w:r>
+      <w:r>
+        <w:rPr>
+          <w:rStyle w:val="CommentTok"/>
+        </w:rPr>
+        <w:t xml:space="preserve"># 2b) Nur falls Set-ScheduledTask nach dem Principal fragt: gMSA explizit (weiterhin ohne Passwort)</w:t>
+      </w:r>
+      <w:r>
+        <w:br/>
+      </w:r>
+      <w:r>
+        <w:rPr>
+          <w:rStyle w:val="VariableTok"/>
+        </w:rPr>
+        <w:t xml:space="preserve">$principal</w:t>
+      </w:r>
+      <w:r>
+        <w:rPr>
+          <w:rStyle w:val="NormalTok"/>
+        </w:rPr>
+        <w:t xml:space="preserve"> </w:t>
+      </w:r>
+      <w:r>
+        <w:rPr>
+          <w:rStyle w:val="OperatorTok"/>
+        </w:rPr>
+        <w:t xml:space="preserve">=</w:t>
+      </w:r>
+      <w:r>
+        <w:rPr>
+          <w:rStyle w:val="NormalTok"/>
+        </w:rPr>
+        <w:t xml:space="preserve"> New-ScheduledTaskPrincipal </w:t>
+      </w:r>
+      <w:r>
+        <w:rPr>
+          <w:rStyle w:val="OperatorTok"/>
+        </w:rPr>
+        <w:t xml:space="preserve">-</w:t>
+      </w:r>
+      <w:r>
+        <w:rPr>
+          <w:rStyle w:val="NormalTok"/>
+        </w:rPr>
+        <w:t xml:space="preserve">UserId </w:t>
+      </w:r>
+      <w:r>
+        <w:rPr>
+          <w:rStyle w:val="StringTok"/>
+        </w:rPr>
+        <w:t xml:space="preserve">'DOMAIN\ODA-SVC$'</w:t>
+      </w:r>
+      <w:r>
+        <w:rPr>
+          <w:rStyle w:val="NormalTok"/>
+        </w:rPr>
+        <w:t xml:space="preserve"> </w:t>
+      </w:r>
+      <w:r>
+        <w:rPr>
+          <w:rStyle w:val="OperatorTok"/>
+        </w:rPr>
+        <w:t xml:space="preserve">-</w:t>
+      </w:r>
+      <w:r>
+        <w:rPr>
+          <w:rStyle w:val="NormalTok"/>
+        </w:rPr>
+        <w:t xml:space="preserve">LogonType Password </w:t>
+      </w:r>
+      <w:r>
+        <w:rPr>
+          <w:rStyle w:val="OperatorTok"/>
+        </w:rPr>
+        <w:t xml:space="preserve">-</w:t>
+      </w:r>
+      <w:r>
+        <w:rPr>
+          <w:rStyle w:val="NormalTok"/>
+        </w:rPr>
+        <w:t xml:space="preserve">RunLevel Highest</w:t>
+      </w:r>
+      <w:r>
+        <w:br/>
+      </w:r>
+      <w:r>
+        <w:rPr>
+          <w:rStyle w:val="NormalTok"/>
+        </w:rPr>
+        <w:t xml:space="preserve">Set-ScheduledTask </w:t>
+      </w:r>
+      <w:r>
+        <w:rPr>
+          <w:rStyle w:val="OperatorTok"/>
+        </w:rPr>
+        <w:t xml:space="preserve">-</w:t>
+      </w:r>
+      <w:r>
+        <w:rPr>
+          <w:rStyle w:val="NormalTok"/>
+        </w:rPr>
+        <w:t xml:space="preserve">TaskName ADSecurityAssessment </w:t>
+      </w:r>
+      <w:r>
+        <w:rPr>
+          <w:rStyle w:val="OperatorTok"/>
+        </w:rPr>
+        <w:t xml:space="preserve">-</w:t>
+      </w:r>
+      <w:r>
+        <w:rPr>
+          <w:rStyle w:val="NormalTok"/>
+        </w:rPr>
+        <w:t xml:space="preserve">Trigger </w:t>
+      </w:r>
+      <w:r>
+        <w:rPr>
+          <w:rStyle w:val="VariableTok"/>
+        </w:rPr>
+        <w:t xml:space="preserve">$trigger</w:t>
+      </w:r>
+      <w:r>
+        <w:rPr>
+          <w:rStyle w:val="NormalTok"/>
+        </w:rPr>
+        <w:t xml:space="preserve"> </w:t>
+      </w:r>
+      <w:r>
+        <w:rPr>
+          <w:rStyle w:val="OperatorTok"/>
+        </w:rPr>
+        <w:t xml:space="preserve">-</w:t>
+      </w:r>
+      <w:r>
+        <w:rPr>
+          <w:rStyle w:val="NormalTok"/>
+        </w:rPr>
+        <w:t xml:space="preserve">Principal </w:t>
+      </w:r>
+      <w:r>
+        <w:rPr>
+          <w:rStyle w:val="VariableTok"/>
+        </w:rPr>
+        <w:t xml:space="preserve">$principal</w:t>
+      </w:r>
+      <w:r>
+        <w:br/>
+      </w:r>
+      <w:r>
+        <w:br/>
+      </w:r>
+      <w:r>
+        <w:rPr>
+          <w:rStyle w:val="CommentTok"/>
+        </w:rPr>
+        <w:t xml:space="preserve"># 3) Prüfen – beide auf Dienstag, RunAs = gMSA</w:t>
+      </w:r>
+      <w:r>
+        <w:br/>
+      </w:r>
+      <w:r>
+        <w:rPr>
+          <w:rStyle w:val="NormalTok"/>
+        </w:rPr>
+        <w:t xml:space="preserve">Get-ScheduledTask </w:t>
+      </w:r>
+      <w:r>
+        <w:rPr>
+          <w:rStyle w:val="OperatorTok"/>
+        </w:rPr>
+        <w:t xml:space="preserve">-</w:t>
+      </w:r>
+      <w:r>
+        <w:rPr>
+          <w:rStyle w:val="NormalTok"/>
+        </w:rPr>
+        <w:t xml:space="preserve">TaskName ADAssessment</w:t>
+      </w:r>
+      <w:r>
+        <w:rPr>
+          <w:rStyle w:val="OperatorTok"/>
+        </w:rPr>
+        <w:t xml:space="preserve">,</w:t>
+      </w:r>
+      <w:r>
+        <w:rPr>
+          <w:rStyle w:val="NormalTok"/>
+        </w:rPr>
+        <w:t xml:space="preserve"> ADSecurityAssessment </w:t>
+      </w:r>
+      <w:r>
+        <w:rPr>
+          <w:rStyle w:val="OperatorTok"/>
+        </w:rPr>
+        <w:t xml:space="preserve">|</w:t>
+      </w:r>
+      <w:r>
+        <w:br/>
+      </w:r>
+      <w:r>
+        <w:rPr>
+          <w:rStyle w:val="NormalTok"/>
+        </w:rPr>
+        <w:t xml:space="preserve">    </w:t>
+      </w:r>
+      <w:r>
+        <w:rPr>
+          <w:rStyle w:val="FunctionTok"/>
+        </w:rPr>
+        <w:t xml:space="preserve">Select-Object</w:t>
+      </w:r>
+      <w:r>
+        <w:rPr>
+          <w:rStyle w:val="NormalTok"/>
+        </w:rPr>
+        <w:t xml:space="preserve"> TaskName</w:t>
+      </w:r>
+      <w:r>
+        <w:rPr>
+          <w:rStyle w:val="OperatorTok"/>
+        </w:rPr>
+        <w:t xml:space="preserve">,</w:t>
+      </w:r>
+      <w:r>
+        <w:br/>
+      </w:r>
+      <w:r>
+        <w:rPr>
+          <w:rStyle w:val="NormalTok"/>
+        </w:rPr>
+        <w:t xml:space="preserve">        @</w:t>
+      </w:r>
+      <w:r>
+        <w:rPr>
+          <w:rStyle w:val="OperatorTok"/>
+        </w:rPr>
+        <w:t xml:space="preserve">{</w:t>
+      </w:r>
+      <w:r>
+        <w:rPr>
+          <w:rStyle w:val="NormalTok"/>
+        </w:rPr>
+        <w:t xml:space="preserve"> n </w:t>
+      </w:r>
+      <w:r>
+        <w:rPr>
+          <w:rStyle w:val="OperatorTok"/>
+        </w:rPr>
+        <w:t xml:space="preserve">=</w:t>
+      </w:r>
+      <w:r>
+        <w:rPr>
+          <w:rStyle w:val="NormalTok"/>
+        </w:rPr>
+        <w:t xml:space="preserve"> </w:t>
+      </w:r>
+      <w:r>
+        <w:rPr>
+          <w:rStyle w:val="StringTok"/>
+        </w:rPr>
+        <w:t xml:space="preserve">'Start'</w:t>
+      </w:r>
+      <w:r>
+        <w:rPr>
+          <w:rStyle w:val="OperatorTok"/>
+        </w:rPr>
+        <w:t xml:space="preserve">;</w:t>
+      </w:r>
+      <w:r>
+        <w:rPr>
+          <w:rStyle w:val="NormalTok"/>
+        </w:rPr>
+        <w:t xml:space="preserve"> e </w:t>
+      </w:r>
+      <w:r>
+        <w:rPr>
+          <w:rStyle w:val="OperatorTok"/>
+        </w:rPr>
+        <w:t xml:space="preserve">=</w:t>
+      </w:r>
+      <w:r>
+        <w:rPr>
+          <w:rStyle w:val="NormalTok"/>
+        </w:rPr>
+        <w:t xml:space="preserve"> </w:t>
+      </w:r>
+      <w:r>
+        <w:rPr>
+          <w:rStyle w:val="OperatorTok"/>
+        </w:rPr>
+        <w:t xml:space="preserve">{</w:t>
+      </w:r>
+      <w:r>
+        <w:rPr>
+          <w:rStyle w:val="NormalTok"/>
+        </w:rPr>
+        <w:t xml:space="preserve"> </w:t>
+      </w:r>
+      <w:r>
+        <w:rPr>
+          <w:rStyle w:val="VariableTok"/>
+        </w:rPr>
+        <w:t xml:space="preserve">$_</w:t>
+      </w:r>
+      <w:r>
+        <w:rPr>
+          <w:rStyle w:val="OperatorTok"/>
+        </w:rPr>
         <w:t xml:space="preserve">.</w:t>
       </w:r>
       <w:r>
         <w:rPr>
-          <w:rStyle w:val="NormalTok"/>
-        </w:rPr>
-        <w:t xml:space="preserve">\Register-ODAJitTasks</w:t>
+          <w:rStyle w:val="FunctionTok"/>
+        </w:rPr>
+        <w:t xml:space="preserve">Triggers</w:t>
       </w:r>
       <w:r>
         <w:rPr>
@@ -8215,73 +8810,148 @@
         <w:rPr>
           <w:rStyle w:val="FunctionTok"/>
         </w:rPr>
-        <w:t xml:space="preserve">ps1</w:t>
-      </w:r>
-      <w:r>
-        <w:rPr>
-          <w:rStyle w:val="NormalTok"/>
-        </w:rPr>
-        <w:t xml:space="preserve">       </w:t>
+        <w:t xml:space="preserve">StartBoundary</w:t>
+      </w:r>
+      <w:r>
+        <w:rPr>
+          <w:rStyle w:val="NormalTok"/>
+        </w:rPr>
+        <w:t xml:space="preserve"> </w:t>
       </w:r>
       <w:r>
         <w:rPr>
           <w:rStyle w:val="OperatorTok"/>
         </w:rPr>
-        <w:t xml:space="preserve">-</w:t>
-      </w:r>
-      <w:r>
-        <w:rPr>
-          <w:rStyle w:val="NormalTok"/>
-        </w:rPr>
-        <w:t xml:space="preserve">ConfigPath C</w:t>
+        <w:t xml:space="preserve">}</w:t>
+      </w:r>
+      <w:r>
+        <w:rPr>
+          <w:rStyle w:val="NormalTok"/>
+        </w:rPr>
+        <w:t xml:space="preserve"> </w:t>
       </w:r>
       <w:r>
         <w:rPr>
           <w:rStyle w:val="OperatorTok"/>
         </w:rPr>
-        <w:t xml:space="preserve">:</w:t>
-      </w:r>
-      <w:r>
-        <w:rPr>
-          <w:rStyle w:val="NormalTok"/>
-        </w:rPr>
-        <w:t xml:space="preserve">\ODA-JIT\Config\ODAJit</w:t>
+        <w:t xml:space="preserve">},</w:t>
+      </w:r>
+      <w:r>
+        <w:br/>
+      </w:r>
+      <w:r>
+        <w:rPr>
+          <w:rStyle w:val="NormalTok"/>
+        </w:rPr>
+        <w:t xml:space="preserve">        @</w:t>
       </w:r>
       <w:r>
         <w:rPr>
           <w:rStyle w:val="OperatorTok"/>
         </w:rPr>
+        <w:t xml:space="preserve">{</w:t>
+      </w:r>
+      <w:r>
+        <w:rPr>
+          <w:rStyle w:val="NormalTok"/>
+        </w:rPr>
+        <w:t xml:space="preserve"> n </w:t>
+      </w:r>
+      <w:r>
+        <w:rPr>
+          <w:rStyle w:val="OperatorTok"/>
+        </w:rPr>
+        <w:t xml:space="preserve">=</w:t>
+      </w:r>
+      <w:r>
+        <w:rPr>
+          <w:rStyle w:val="NormalTok"/>
+        </w:rPr>
+        <w:t xml:space="preserve"> </w:t>
+      </w:r>
+      <w:r>
+        <w:rPr>
+          <w:rStyle w:val="StringTok"/>
+        </w:rPr>
+        <w:t xml:space="preserve">'RunAs'</w:t>
+      </w:r>
+      <w:r>
+        <w:rPr>
+          <w:rStyle w:val="OperatorTok"/>
+        </w:rPr>
+        <w:t xml:space="preserve">;</w:t>
+      </w:r>
+      <w:r>
+        <w:rPr>
+          <w:rStyle w:val="NormalTok"/>
+        </w:rPr>
+        <w:t xml:space="preserve"> e </w:t>
+      </w:r>
+      <w:r>
+        <w:rPr>
+          <w:rStyle w:val="OperatorTok"/>
+        </w:rPr>
+        <w:t xml:space="preserve">=</w:t>
+      </w:r>
+      <w:r>
+        <w:rPr>
+          <w:rStyle w:val="NormalTok"/>
+        </w:rPr>
+        <w:t xml:space="preserve"> </w:t>
+      </w:r>
+      <w:r>
+        <w:rPr>
+          <w:rStyle w:val="OperatorTok"/>
+        </w:rPr>
+        <w:t xml:space="preserve">{</w:t>
+      </w:r>
+      <w:r>
+        <w:rPr>
+          <w:rStyle w:val="NormalTok"/>
+        </w:rPr>
+        <w:t xml:space="preserve"> </w:t>
+      </w:r>
+      <w:r>
+        <w:rPr>
+          <w:rStyle w:val="VariableTok"/>
+        </w:rPr>
+        <w:t xml:space="preserve">$_</w:t>
+      </w:r>
+      <w:r>
+        <w:rPr>
+          <w:rStyle w:val="OperatorTok"/>
+        </w:rPr>
         <w:t xml:space="preserve">.</w:t>
       </w:r>
       <w:r>
         <w:rPr>
           <w:rStyle w:val="FunctionTok"/>
         </w:rPr>
-        <w:t xml:space="preserve">forest</w:t>
+        <w:t xml:space="preserve">Principal</w:t>
       </w:r>
       <w:r>
         <w:rPr>
           <w:rStyle w:val="OperatorTok"/>
         </w:rPr>
-        <w:t xml:space="preserve">-</w:t>
-      </w:r>
-      <w:r>
-        <w:rPr>
-          <w:rStyle w:val="NormalTok"/>
-        </w:rPr>
-        <w:t xml:space="preserve">a</w:t>
+        <w:t xml:space="preserve">.</w:t>
+      </w:r>
+      <w:r>
+        <w:rPr>
+          <w:rStyle w:val="FunctionTok"/>
+        </w:rPr>
+        <w:t xml:space="preserve">UserId</w:t>
+      </w:r>
+      <w:r>
+        <w:rPr>
+          <w:rStyle w:val="NormalTok"/>
+        </w:rPr>
+        <w:t xml:space="preserve"> </w:t>
       </w:r>
       <w:r>
         <w:rPr>
           <w:rStyle w:val="OperatorTok"/>
         </w:rPr>
-        <w:t xml:space="preserve">.</w:t>
-      </w:r>
-      <w:r>
-        <w:rPr>
-          <w:rStyle w:val="FunctionTok"/>
-        </w:rPr>
-        <w:t xml:space="preserve">psd1</w:t>
+        <w:t xml:space="preserve">}</w:t>
       </w:r>
       <w:r>
         <w:rPr>
@@ -8293,811 +8963,7 @@
         <w:rPr>
           <w:rStyle w:val="OperatorTok"/>
         </w:rPr>
-        <w:t xml:space="preserve">-</w:t>
-      </w:r>
-      <w:r>
-        <w:rPr>
-          <w:rStyle w:val="NormalTok"/>
-        </w:rPr>
-        <w:t xml:space="preserve">WhatIf   </w:t>
-      </w:r>
-      <w:r>
-        <w:rPr>
-          <w:rStyle w:val="CommentTok"/>
-        </w:rPr>
-        <w:t xml:space="preserve"># Zeiten + Abgleich mit Collector</w:t>
-      </w:r>
-      <w:r>
-        <w:br/>
-      </w:r>
-      <w:r>
-        <w:rPr>
-          <w:rStyle w:val="OperatorTok"/>
-        </w:rPr>
-        <w:t xml:space="preserve">.</w:t>
-      </w:r>
-      <w:r>
-        <w:rPr>
-          <w:rStyle w:val="NormalTok"/>
-        </w:rPr>
-        <w:t xml:space="preserve">\Start-ODAJitGrant</w:t>
-      </w:r>
-      <w:r>
-        <w:rPr>
-          <w:rStyle w:val="OperatorTok"/>
-        </w:rPr>
-        <w:t xml:space="preserve">.</w:t>
-      </w:r>
-      <w:r>
-        <w:rPr>
-          <w:rStyle w:val="FunctionTok"/>
-        </w:rPr>
-        <w:t xml:space="preserve">ps1</w:t>
-      </w:r>
-      <w:r>
-        <w:rPr>
-          <w:rStyle w:val="NormalTok"/>
-        </w:rPr>
-        <w:t xml:space="preserve">          </w:t>
-      </w:r>
-      <w:r>
-        <w:rPr>
-          <w:rStyle w:val="OperatorTok"/>
-        </w:rPr>
-        <w:t xml:space="preserve">-</w:t>
-      </w:r>
-      <w:r>
-        <w:rPr>
-          <w:rStyle w:val="NormalTok"/>
-        </w:rPr>
-        <w:t xml:space="preserve">ConfigPath C</w:t>
-      </w:r>
-      <w:r>
-        <w:rPr>
-          <w:rStyle w:val="OperatorTok"/>
-        </w:rPr>
-        <w:t xml:space="preserve">:</w:t>
-      </w:r>
-      <w:r>
-        <w:rPr>
-          <w:rStyle w:val="NormalTok"/>
-        </w:rPr>
-        <w:t xml:space="preserve">\ODA-JIT\Config\ODAJit</w:t>
-      </w:r>
-      <w:r>
-        <w:rPr>
-          <w:rStyle w:val="OperatorTok"/>
-        </w:rPr>
-        <w:t xml:space="preserve">.</w:t>
-      </w:r>
-      <w:r>
-        <w:rPr>
-          <w:rStyle w:val="FunctionTok"/>
-        </w:rPr>
-        <w:t xml:space="preserve">forest</w:t>
-      </w:r>
-      <w:r>
-        <w:rPr>
-          <w:rStyle w:val="OperatorTok"/>
-        </w:rPr>
-        <w:t xml:space="preserve">-</w:t>
-      </w:r>
-      <w:r>
-        <w:rPr>
-          <w:rStyle w:val="NormalTok"/>
-        </w:rPr>
-        <w:t xml:space="preserve">a</w:t>
-      </w:r>
-      <w:r>
-        <w:rPr>
-          <w:rStyle w:val="OperatorTok"/>
-        </w:rPr>
-        <w:t xml:space="preserve">.</w:t>
-      </w:r>
-      <w:r>
-        <w:rPr>
-          <w:rStyle w:val="FunctionTok"/>
-        </w:rPr>
-        <w:t xml:space="preserve">psd1</w:t>
-      </w:r>
-      <w:r>
-        <w:rPr>
-          <w:rStyle w:val="NormalTok"/>
-        </w:rPr>
-        <w:t xml:space="preserve"> </w:t>
-      </w:r>
-      <w:r>
-        <w:rPr>
-          <w:rStyle w:val="OperatorTok"/>
-        </w:rPr>
-        <w:t xml:space="preserve">-</w:t>
-      </w:r>
-      <w:r>
-        <w:rPr>
-          <w:rStyle w:val="NormalTok"/>
-        </w:rPr>
-        <w:t xml:space="preserve">WhatIf   </w:t>
-      </w:r>
-      <w:r>
-        <w:rPr>
-          <w:rStyle w:val="CommentTok"/>
-        </w:rPr>
-        <w:t xml:space="preserve"># Vorprüfung Collector, kein Grant</w:t>
-      </w:r>
-      <w:r>
-        <w:br/>
-      </w:r>
-      <w:r>
-        <w:rPr>
-          <w:rStyle w:val="OperatorTok"/>
-        </w:rPr>
-        <w:t xml:space="preserve">.</w:t>
-      </w:r>
-      <w:r>
-        <w:rPr>
-          <w:rStyle w:val="NormalTok"/>
-        </w:rPr>
-        <w:t xml:space="preserve">\Start-ODAJitRevokeWatcher</w:t>
-      </w:r>
-      <w:r>
-        <w:rPr>
-          <w:rStyle w:val="OperatorTok"/>
-        </w:rPr>
-        <w:t xml:space="preserve">.</w:t>
-      </w:r>
-      <w:r>
-        <w:rPr>
-          <w:rStyle w:val="FunctionTok"/>
-        </w:rPr>
-        <w:t xml:space="preserve">ps1</w:t>
-      </w:r>
-      <w:r>
-        <w:rPr>
-          <w:rStyle w:val="NormalTok"/>
-        </w:rPr>
-        <w:t xml:space="preserve">  </w:t>
-      </w:r>
-      <w:r>
-        <w:rPr>
-          <w:rStyle w:val="OperatorTok"/>
-        </w:rPr>
-        <w:t xml:space="preserve">-</w:t>
-      </w:r>
-      <w:r>
-        <w:rPr>
-          <w:rStyle w:val="NormalTok"/>
-        </w:rPr>
-        <w:t xml:space="preserve">ConfigPath C</w:t>
-      </w:r>
-      <w:r>
-        <w:rPr>
-          <w:rStyle w:val="OperatorTok"/>
-        </w:rPr>
-        <w:t xml:space="preserve">:</w:t>
-      </w:r>
-      <w:r>
-        <w:rPr>
-          <w:rStyle w:val="NormalTok"/>
-        </w:rPr>
-        <w:t xml:space="preserve">\ODA-JIT\Config\ODAJit</w:t>
-      </w:r>
-      <w:r>
-        <w:rPr>
-          <w:rStyle w:val="OperatorTok"/>
-        </w:rPr>
-        <w:t xml:space="preserve">.</w:t>
-      </w:r>
-      <w:r>
-        <w:rPr>
-          <w:rStyle w:val="FunctionTok"/>
-        </w:rPr>
-        <w:t xml:space="preserve">forest</w:t>
-      </w:r>
-      <w:r>
-        <w:rPr>
-          <w:rStyle w:val="OperatorTok"/>
-        </w:rPr>
-        <w:t xml:space="preserve">-</w:t>
-      </w:r>
-      <w:r>
-        <w:rPr>
-          <w:rStyle w:val="NormalTok"/>
-        </w:rPr>
-        <w:t xml:space="preserve">a</w:t>
-      </w:r>
-      <w:r>
-        <w:rPr>
-          <w:rStyle w:val="OperatorTok"/>
-        </w:rPr>
-        <w:t xml:space="preserve">.</w:t>
-      </w:r>
-      <w:r>
-        <w:rPr>
-          <w:rStyle w:val="FunctionTok"/>
-        </w:rPr>
-        <w:t xml:space="preserve">psd1</w:t>
-      </w:r>
-      <w:r>
-        <w:rPr>
-          <w:rStyle w:val="NormalTok"/>
-        </w:rPr>
-        <w:t xml:space="preserve"> </w:t>
-      </w:r>
-      <w:r>
-        <w:rPr>
-          <w:rStyle w:val="OperatorTok"/>
-        </w:rPr>
-        <w:t xml:space="preserve">-</w:t>
-      </w:r>
-      <w:r>
-        <w:rPr>
-          <w:rStyle w:val="NormalTok"/>
-        </w:rPr>
-        <w:t xml:space="preserve">RevokeNow </w:t>
-      </w:r>
-      <w:r>
-        <w:rPr>
-          <w:rStyle w:val="OperatorTok"/>
-        </w:rPr>
-        <w:t xml:space="preserve">-</w:t>
-      </w:r>
-      <w:r>
-        <w:rPr>
-          <w:rStyle w:val="NormalTok"/>
-        </w:rPr>
-        <w:t xml:space="preserve">WhatIf</w:t>
-      </w:r>
-    </w:p>
-    <w:p>
-      <w:pPr>
-        <w:pStyle w:val="FirstParagraph"/>
-      </w:pPr>
-      <w:r>
-        <w:t xml:space="preserve">Danach einen</w:t>
-      </w:r>
-      <w:r>
-        <w:t xml:space="preserve"> </w:t>
-      </w:r>
-      <w:r>
-        <w:rPr>
-          <w:b/>
-          <w:bCs/>
-        </w:rPr>
-        <w:t xml:space="preserve">echten Testlauf außerhalb des Fensters</w:t>
-      </w:r>
-      <w:r>
-        <w:t xml:space="preserve"> </w:t>
-      </w:r>
-      <w:r>
-        <w:t xml:space="preserve">im Kontext des Ausführer-gMSA ausführen.</w:t>
-      </w:r>
-      <w:r>
-        <w:t xml:space="preserve"> </w:t>
-      </w:r>
-      <w:r>
-        <w:t xml:space="preserve">Am einfachsten registriert man dazu die Aufgaben (Schritt 8) und startet sie manuell:</w:t>
-      </w:r>
-    </w:p>
-    <w:p>
-      <w:pPr>
-        <w:pStyle w:val="SourceCode"/>
-      </w:pPr>
-      <w:r>
-        <w:rPr>
-          <w:rStyle w:val="CommentTok"/>
-        </w:rPr>
-        <w:t xml:space="preserve"># Grant + ODA-Aufgaben sofort starten, danach Watcher mit Fensterstart "jetzt"</w:t>
-      </w:r>
-      <w:r>
-        <w:br/>
-      </w:r>
-      <w:r>
-        <w:rPr>
-          <w:rStyle w:val="OperatorTok"/>
-        </w:rPr>
-        <w:t xml:space="preserve">.</w:t>
-      </w:r>
-      <w:r>
-        <w:rPr>
-          <w:rStyle w:val="NormalTok"/>
-        </w:rPr>
-        <w:t xml:space="preserve">\Start-ODAJitGrant</w:t>
-      </w:r>
-      <w:r>
-        <w:rPr>
-          <w:rStyle w:val="OperatorTok"/>
-        </w:rPr>
-        <w:t xml:space="preserve">.</w:t>
-      </w:r>
-      <w:r>
-        <w:rPr>
-          <w:rStyle w:val="FunctionTok"/>
-        </w:rPr>
-        <w:t xml:space="preserve">ps1</w:t>
-      </w:r>
-      <w:r>
-        <w:rPr>
-          <w:rStyle w:val="NormalTok"/>
-        </w:rPr>
-        <w:t xml:space="preserve">         </w:t>
-      </w:r>
-      <w:r>
-        <w:rPr>
-          <w:rStyle w:val="OperatorTok"/>
-        </w:rPr>
-        <w:t xml:space="preserve">-</w:t>
-      </w:r>
-      <w:r>
-        <w:rPr>
-          <w:rStyle w:val="NormalTok"/>
-        </w:rPr>
-        <w:t xml:space="preserve">ConfigPath C</w:t>
-      </w:r>
-      <w:r>
-        <w:rPr>
-          <w:rStyle w:val="OperatorTok"/>
-        </w:rPr>
-        <w:t xml:space="preserve">:</w:t>
-      </w:r>
-      <w:r>
-        <w:rPr>
-          <w:rStyle w:val="NormalTok"/>
-        </w:rPr>
-        <w:t xml:space="preserve">\ODA-JIT\Config\ODAJit</w:t>
-      </w:r>
-      <w:r>
-        <w:rPr>
-          <w:rStyle w:val="OperatorTok"/>
-        </w:rPr>
-        <w:t xml:space="preserve">.</w:t>
-      </w:r>
-      <w:r>
-        <w:rPr>
-          <w:rStyle w:val="FunctionTok"/>
-        </w:rPr>
-        <w:t xml:space="preserve">forest</w:t>
-      </w:r>
-      <w:r>
-        <w:rPr>
-          <w:rStyle w:val="OperatorTok"/>
-        </w:rPr>
-        <w:t xml:space="preserve">-</w:t>
-      </w:r>
-      <w:r>
-        <w:rPr>
-          <w:rStyle w:val="NormalTok"/>
-        </w:rPr>
-        <w:t xml:space="preserve">a</w:t>
-      </w:r>
-      <w:r>
-        <w:rPr>
-          <w:rStyle w:val="OperatorTok"/>
-        </w:rPr>
-        <w:t xml:space="preserve">.</w:t>
-      </w:r>
-      <w:r>
-        <w:rPr>
-          <w:rStyle w:val="FunctionTok"/>
-        </w:rPr>
-        <w:t xml:space="preserve">psd1</w:t>
-      </w:r>
-      <w:r>
-        <w:rPr>
-          <w:rStyle w:val="NormalTok"/>
-        </w:rPr>
-        <w:t xml:space="preserve"> </w:t>
-      </w:r>
-      <w:r>
-        <w:rPr>
-          <w:rStyle w:val="OperatorTok"/>
-        </w:rPr>
-        <w:t xml:space="preserve">-</w:t>
-      </w:r>
-      <w:r>
-        <w:rPr>
-          <w:rStyle w:val="NormalTok"/>
-        </w:rPr>
-        <w:t xml:space="preserve">StartOdaTasks</w:t>
-      </w:r>
-      <w:r>
-        <w:br/>
-      </w:r>
-      <w:r>
-        <w:rPr>
-          <w:rStyle w:val="OperatorTok"/>
-        </w:rPr>
-        <w:t xml:space="preserve">.</w:t>
-      </w:r>
-      <w:r>
-        <w:rPr>
-          <w:rStyle w:val="NormalTok"/>
-        </w:rPr>
-        <w:t xml:space="preserve">\Start-ODAJitRevokeWatcher</w:t>
-      </w:r>
-      <w:r>
-        <w:rPr>
-          <w:rStyle w:val="OperatorTok"/>
-        </w:rPr>
-        <w:t xml:space="preserve">.</w:t>
-      </w:r>
-      <w:r>
-        <w:rPr>
-          <w:rStyle w:val="FunctionTok"/>
-        </w:rPr>
-        <w:t xml:space="preserve">ps1</w:t>
-      </w:r>
-      <w:r>
-        <w:rPr>
-          <w:rStyle w:val="NormalTok"/>
-        </w:rPr>
-        <w:t xml:space="preserve"> </w:t>
-      </w:r>
-      <w:r>
-        <w:rPr>
-          <w:rStyle w:val="OperatorTok"/>
-        </w:rPr>
-        <w:t xml:space="preserve">-</w:t>
-      </w:r>
-      <w:r>
-        <w:rPr>
-          <w:rStyle w:val="NormalTok"/>
-        </w:rPr>
-        <w:t xml:space="preserve">ConfigPath C</w:t>
-      </w:r>
-      <w:r>
-        <w:rPr>
-          <w:rStyle w:val="OperatorTok"/>
-        </w:rPr>
-        <w:t xml:space="preserve">:</w:t>
-      </w:r>
-      <w:r>
-        <w:rPr>
-          <w:rStyle w:val="NormalTok"/>
-        </w:rPr>
-        <w:t xml:space="preserve">\ODA-JIT\Config\ODAJit</w:t>
-      </w:r>
-      <w:r>
-        <w:rPr>
-          <w:rStyle w:val="OperatorTok"/>
-        </w:rPr>
-        <w:t xml:space="preserve">.</w:t>
-      </w:r>
-      <w:r>
-        <w:rPr>
-          <w:rStyle w:val="FunctionTok"/>
-        </w:rPr>
-        <w:t xml:space="preserve">forest</w:t>
-      </w:r>
-      <w:r>
-        <w:rPr>
-          <w:rStyle w:val="OperatorTok"/>
-        </w:rPr>
-        <w:t xml:space="preserve">-</w:t>
-      </w:r>
-      <w:r>
-        <w:rPr>
-          <w:rStyle w:val="NormalTok"/>
-        </w:rPr>
-        <w:t xml:space="preserve">a</w:t>
-      </w:r>
-      <w:r>
-        <w:rPr>
-          <w:rStyle w:val="OperatorTok"/>
-        </w:rPr>
-        <w:t xml:space="preserve">.</w:t>
-      </w:r>
-      <w:r>
-        <w:rPr>
-          <w:rStyle w:val="FunctionTok"/>
-        </w:rPr>
-        <w:t xml:space="preserve">psd1</w:t>
-      </w:r>
-      <w:r>
-        <w:rPr>
-          <w:rStyle w:val="NormalTok"/>
-        </w:rPr>
-        <w:t xml:space="preserve"> </w:t>
-      </w:r>
-      <w:r>
-        <w:rPr>
-          <w:rStyle w:val="OperatorTok"/>
-        </w:rPr>
-        <w:t xml:space="preserve">-</w:t>
-      </w:r>
-      <w:r>
-        <w:rPr>
-          <w:rStyle w:val="NormalTok"/>
-        </w:rPr>
-        <w:t xml:space="preserve">WindowStart </w:t>
-      </w:r>
-      <w:r>
-        <w:rPr>
-          <w:rStyle w:val="OperatorTok"/>
-        </w:rPr>
-        <w:t xml:space="preserve">(</w:t>
-      </w:r>
-      <w:r>
-        <w:rPr>
-          <w:rStyle w:val="FunctionTok"/>
-        </w:rPr>
-        <w:t xml:space="preserve">Get-Date</w:t>
-      </w:r>
-      <w:r>
-        <w:rPr>
-          <w:rStyle w:val="OperatorTok"/>
-        </w:rPr>
-        <w:t xml:space="preserve">)</w:t>
-      </w:r>
-    </w:p>
-    <w:p>
-      <w:pPr>
-        <w:pStyle w:val="FirstParagraph"/>
-      </w:pPr>
-      <w:r>
-        <w:t xml:space="preserve">Prüfen: Grant-Log OK, Event 1000; Watcher erkennt Ende → Event 1010; das gMSA ist danach nicht</w:t>
-      </w:r>
-      <w:r>
-        <w:t xml:space="preserve"> </w:t>
-      </w:r>
-      <w:r>
-        <w:t xml:space="preserve">mehr in Enterprise Admins; die ODA-Ergebnisse sind vollständig (keine leeren Tabellenblätter).</w:t>
-      </w:r>
-    </w:p>
-    <w:bookmarkEnd w:id="23"/>
-    <w:bookmarkStart w:id="24" w:name="schritt-8-geplante-aufgaben-registrieren"/>
-    <w:p>
-      <w:pPr>
-        <w:pStyle w:val="Heading2"/>
-      </w:pPr>
-      <w:r>
-        <w:t xml:space="preserve">Schritt 8 – Geplante Aufgaben registrieren</w:t>
-      </w:r>
-    </w:p>
-    <w:p>
-      <w:pPr>
-        <w:pStyle w:val="FirstParagraph"/>
-      </w:pPr>
-      <w:r>
-        <w:t xml:space="preserve">In einer</w:t>
-      </w:r>
-      <w:r>
-        <w:t xml:space="preserve"> </w:t>
-      </w:r>
-      <w:r>
-        <w:rPr>
-          <w:b/>
-          <w:bCs/>
-        </w:rPr>
-        <w:t xml:space="preserve">PowerShell als Administrator</w:t>
-      </w:r>
-      <w:r>
-        <w:t xml:space="preserve"> </w:t>
-      </w:r>
-      <w:r>
-        <w:t xml:space="preserve">auf dem Tier-0-Host:</w:t>
-      </w:r>
-    </w:p>
-    <w:p>
-      <w:pPr>
-        <w:pStyle w:val="SourceCode"/>
-      </w:pPr>
-      <w:r>
-        <w:rPr>
-          <w:rStyle w:val="OperatorTok"/>
-        </w:rPr>
-        <w:t xml:space="preserve">.</w:t>
-      </w:r>
-      <w:r>
-        <w:rPr>
-          <w:rStyle w:val="NormalTok"/>
-        </w:rPr>
-        <w:t xml:space="preserve">\Register-ODAJitTasks</w:t>
-      </w:r>
-      <w:r>
-        <w:rPr>
-          <w:rStyle w:val="OperatorTok"/>
-        </w:rPr>
-        <w:t xml:space="preserve">.</w:t>
-      </w:r>
-      <w:r>
-        <w:rPr>
-          <w:rStyle w:val="FunctionTok"/>
-        </w:rPr>
-        <w:t xml:space="preserve">ps1</w:t>
-      </w:r>
-      <w:r>
-        <w:rPr>
-          <w:rStyle w:val="NormalTok"/>
-        </w:rPr>
-        <w:t xml:space="preserve"> </w:t>
-      </w:r>
-      <w:r>
-        <w:rPr>
-          <w:rStyle w:val="OperatorTok"/>
-        </w:rPr>
-        <w:t xml:space="preserve">-</w:t>
-      </w:r>
-      <w:r>
-        <w:rPr>
-          <w:rStyle w:val="NormalTok"/>
-        </w:rPr>
-        <w:t xml:space="preserve">ConfigPath C</w:t>
-      </w:r>
-      <w:r>
-        <w:rPr>
-          <w:rStyle w:val="OperatorTok"/>
-        </w:rPr>
-        <w:t xml:space="preserve">:</w:t>
-      </w:r>
-      <w:r>
-        <w:rPr>
-          <w:rStyle w:val="NormalTok"/>
-        </w:rPr>
-        <w:t xml:space="preserve">\ODA-JIT\Config\ODAJit</w:t>
-      </w:r>
-      <w:r>
-        <w:rPr>
-          <w:rStyle w:val="OperatorTok"/>
-        </w:rPr>
-        <w:t xml:space="preserve">.</w:t>
-      </w:r>
-      <w:r>
-        <w:rPr>
-          <w:rStyle w:val="FunctionTok"/>
-        </w:rPr>
-        <w:t xml:space="preserve">forest</w:t>
-      </w:r>
-      <w:r>
-        <w:rPr>
-          <w:rStyle w:val="OperatorTok"/>
-        </w:rPr>
-        <w:t xml:space="preserve">-</w:t>
-      </w:r>
-      <w:r>
-        <w:rPr>
-          <w:rStyle w:val="NormalTok"/>
-        </w:rPr>
-        <w:t xml:space="preserve">a</w:t>
-      </w:r>
-      <w:r>
-        <w:rPr>
-          <w:rStyle w:val="OperatorTok"/>
-        </w:rPr>
-        <w:t xml:space="preserve">.</w:t>
-      </w:r>
-      <w:r>
-        <w:rPr>
-          <w:rStyle w:val="FunctionTok"/>
-        </w:rPr>
-        <w:t xml:space="preserve">psd1</w:t>
-      </w:r>
-      <w:r>
-        <w:br/>
-      </w:r>
-      <w:r>
-        <w:rPr>
-          <w:rStyle w:val="CommentTok"/>
-        </w:rPr>
-        <w:t xml:space="preserve"># mit signierten Skripten:</w:t>
-      </w:r>
-      <w:r>
-        <w:br/>
-      </w:r>
-      <w:r>
-        <w:rPr>
-          <w:rStyle w:val="OperatorTok"/>
-        </w:rPr>
-        <w:t xml:space="preserve">.</w:t>
-      </w:r>
-      <w:r>
-        <w:rPr>
-          <w:rStyle w:val="NormalTok"/>
-        </w:rPr>
-        <w:t xml:space="preserve">\Register-ODAJitTasks</w:t>
-      </w:r>
-      <w:r>
-        <w:rPr>
-          <w:rStyle w:val="OperatorTok"/>
-        </w:rPr>
-        <w:t xml:space="preserve">.</w:t>
-      </w:r>
-      <w:r>
-        <w:rPr>
-          <w:rStyle w:val="FunctionTok"/>
-        </w:rPr>
-        <w:t xml:space="preserve">ps1</w:t>
-      </w:r>
-      <w:r>
-        <w:rPr>
-          <w:rStyle w:val="NormalTok"/>
-        </w:rPr>
-        <w:t xml:space="preserve"> </w:t>
-      </w:r>
-      <w:r>
-        <w:rPr>
-          <w:rStyle w:val="OperatorTok"/>
-        </w:rPr>
-        <w:t xml:space="preserve">-</w:t>
-      </w:r>
-      <w:r>
-        <w:rPr>
-          <w:rStyle w:val="NormalTok"/>
-        </w:rPr>
-        <w:t xml:space="preserve">ConfigPath C</w:t>
-      </w:r>
-      <w:r>
-        <w:rPr>
-          <w:rStyle w:val="OperatorTok"/>
-        </w:rPr>
-        <w:t xml:space="preserve">:</w:t>
-      </w:r>
-      <w:r>
-        <w:rPr>
-          <w:rStyle w:val="NormalTok"/>
-        </w:rPr>
-        <w:t xml:space="preserve">\ODA-JIT\Config\ODAJit</w:t>
-      </w:r>
-      <w:r>
-        <w:rPr>
-          <w:rStyle w:val="OperatorTok"/>
-        </w:rPr>
-        <w:t xml:space="preserve">.</w:t>
-      </w:r>
-      <w:r>
-        <w:rPr>
-          <w:rStyle w:val="FunctionTok"/>
-        </w:rPr>
-        <w:t xml:space="preserve">forest</w:t>
-      </w:r>
-      <w:r>
-        <w:rPr>
-          <w:rStyle w:val="OperatorTok"/>
-        </w:rPr>
-        <w:t xml:space="preserve">-</w:t>
-      </w:r>
-      <w:r>
-        <w:rPr>
-          <w:rStyle w:val="NormalTok"/>
-        </w:rPr>
-        <w:t xml:space="preserve">a</w:t>
-      </w:r>
-      <w:r>
-        <w:rPr>
-          <w:rStyle w:val="OperatorTok"/>
-        </w:rPr>
-        <w:t xml:space="preserve">.</w:t>
-      </w:r>
-      <w:r>
-        <w:rPr>
-          <w:rStyle w:val="FunctionTok"/>
-        </w:rPr>
-        <w:t xml:space="preserve">psd1</w:t>
-      </w:r>
-      <w:r>
-        <w:rPr>
-          <w:rStyle w:val="NormalTok"/>
-        </w:rPr>
-        <w:t xml:space="preserve"> </w:t>
-      </w:r>
-      <w:r>
-        <w:rPr>
-          <w:rStyle w:val="OperatorTok"/>
-        </w:rPr>
-        <w:t xml:space="preserve">-</w:t>
-      </w:r>
-      <w:r>
-        <w:rPr>
-          <w:rStyle w:val="NormalTok"/>
-        </w:rPr>
-        <w:t xml:space="preserve">ExecutionPolicy AllSigned</w:t>
-      </w:r>
-    </w:p>
-    <w:p>
-      <w:pPr>
-        <w:pStyle w:val="FirstParagraph"/>
-      </w:pPr>
-      <w:r>
-        <w:t xml:space="preserve">Das Skript</w:t>
+        <w:t xml:space="preserve">}</w:t>
       </w:r>
     </w:p>
     <w:p>
@@ -9109,22 +8975,22 @@
         </w:numPr>
       </w:pPr>
       <w:r>
-        <w:t xml:space="preserve">legt</w:t>
-      </w:r>
-      <w:r>
-        <w:t xml:space="preserve"> </w:t>
-      </w:r>
-      <w:r>
         <w:rPr>
           <w:rStyle w:val="VerbatimChar"/>
         </w:rPr>
-        <w:t xml:space="preserve">\ODA-JIT\ODA-JIT-Grant-forest-a.example</w:t>
-      </w:r>
-      <w:r>
-        <w:t xml:space="preserve"> </w:t>
-      </w:r>
-      <w:r>
-        <w:t xml:space="preserve">(Sonntag 01:00) und</w:t>
+        <w:t xml:space="preserve">-LogonType Password</w:t>
+      </w:r>
+      <w:r>
+        <w:t xml:space="preserve"> </w:t>
+      </w:r>
+      <w:r>
+        <w:t xml:space="preserve">ist für gMSA korrekt (kein Klartext-Kennwort, anders als bei einem normalen</w:t>
+      </w:r>
+      <w:r>
+        <w:t xml:space="preserve"> </w:t>
+      </w:r>
+      <w:r>
+        <w:t xml:space="preserve">Konto).</w:t>
       </w:r>
       <w:r>
         <w:t xml:space="preserve"> </w:t>
@@ -9133,19 +8999,13 @@
         <w:rPr>
           <w:rStyle w:val="VerbatimChar"/>
         </w:rPr>
-        <w:t xml:space="preserve">\ODA-JIT\ODA-JIT-Revoke-forest-a.example</w:t>
-      </w:r>
-      <w:r>
-        <w:t xml:space="preserve"> </w:t>
-      </w:r>
-      <w:r>
-        <w:t xml:space="preserve">(Sonntag 02:15) an, beide mit dem Ausführer-gMSA</w:t>
-      </w:r>
-      <w:r>
-        <w:t xml:space="preserve"> </w:t>
-      </w:r>
-      <w:r>
-        <w:t xml:space="preserve">als Principal,</w:t>
+        <w:t xml:space="preserve">-RunLevel Highest</w:t>
+      </w:r>
+      <w:r>
+        <w:t xml:space="preserve"> </w:t>
+      </w:r>
+      <w:r>
+        <w:t xml:space="preserve">nur, wenn die Aufgabe bisher mit höchsten Rechten läuft (Schritt 1).</w:t>
       </w:r>
     </w:p>
     <w:p>
@@ -9157,7 +9017,7 @@
         </w:numPr>
       </w:pPr>
       <w:r>
-        <w:t xml:space="preserve">legt die Ereignisquelle</w:t>
+        <w:t xml:space="preserve">Ist der Aufgabenname nicht eindeutig oder liegt die Aufgabe in einem Unterordner, zusätzlich</w:t>
       </w:r>
       <w:r>
         <w:t xml:space="preserve"> </w:t>
@@ -9166,13 +9026,25 @@
         <w:rPr>
           <w:rStyle w:val="VerbatimChar"/>
         </w:rPr>
-        <w:t xml:space="preserve">ODA-JIT</w:t>
-      </w:r>
-      <w:r>
-        <w:t xml:space="preserve"> </w:t>
-      </w:r>
-      <w:r>
-        <w:t xml:space="preserve">und den Log-Ordner an,</w:t>
+        <w:t xml:space="preserve">-TaskPath '\Microsoft\Operations Management Suite\…\Assessments\'</w:t>
+      </w:r>
+      <w:r>
+        <w:t xml:space="preserve"> </w:t>
+      </w:r>
+      <w:r>
+        <w:t xml:space="preserve">angeben (Pfad:</w:t>
+      </w:r>
+      <w:r>
+        <w:t xml:space="preserve"> </w:t>
+      </w:r>
+      <w:r>
+        <w:rPr>
+          <w:rStyle w:val="VerbatimChar"/>
+        </w:rPr>
+        <w:t xml:space="preserve">(Get-ScheduledTask -TaskName ADSecurityAssessment).TaskPath</w:t>
+      </w:r>
+      <w:r>
+        <w:t xml:space="preserve">).</w:t>
       </w:r>
     </w:p>
     <w:p>
@@ -9184,7 +9056,105 @@
         </w:numPr>
       </w:pPr>
       <w:r>
-        <w:t xml:space="preserve">vergleicht die Trigger der ODA-Aufgaben auf dem Collector mit der Konfiguration.</w:t>
+        <w:t xml:space="preserve">Danach die JIT-Konfiguration anpassen (</w:t>
+      </w:r>
+      <w:r>
+        <w:rPr>
+          <w:rStyle w:val="VerbatimChar"/>
+        </w:rPr>
+        <w:t xml:space="preserve">WindowDay</w:t>
+      </w:r>
+      <w:r>
+        <w:t xml:space="preserve">,</w:t>
+      </w:r>
+      <w:r>
+        <w:t xml:space="preserve"> </w:t>
+      </w:r>
+      <w:r>
+        <w:rPr>
+          <w:rStyle w:val="VerbatimChar"/>
+        </w:rPr>
+        <w:t xml:space="preserve">WindowStart</w:t>
+      </w:r>
+      <w:r>
+        <w:t xml:space="preserve"> </w:t>
+      </w:r>
+      <w:r>
+        <w:t xml:space="preserve">= Start der</w:t>
+      </w:r>
+      <w:r>
+        <w:t xml:space="preserve"> </w:t>
+      </w:r>
+      <w:r>
+        <w:rPr>
+          <w:b/>
+          <w:bCs/>
+        </w:rPr>
+        <w:t xml:space="preserve">ersten</w:t>
+      </w:r>
+      <w:r>
+        <w:t xml:space="preserve"> </w:t>
+      </w:r>
+      <w:r>
+        <w:t xml:space="preserve">Aufgabe,</w:t>
+      </w:r>
+      <w:r>
+        <w:t xml:space="preserve"> </w:t>
+      </w:r>
+      <w:r>
+        <w:rPr>
+          <w:rStyle w:val="VerbatimChar"/>
+        </w:rPr>
+        <w:t xml:space="preserve">NoStartTimeoutMinutes</w:t>
+      </w:r>
+      <w:r>
+        <w:t xml:space="preserve"> </w:t>
+      </w:r>
+      <w:r>
+        <w:t xml:space="preserve">&gt; Abstand zur letzten Aufgabe) und</w:t>
+      </w:r>
+      <w:r>
+        <w:t xml:space="preserve"> </w:t>
+      </w:r>
+      <w:r>
+        <w:rPr>
+          <w:rStyle w:val="VerbatimChar"/>
+        </w:rPr>
+        <w:t xml:space="preserve">Register-ODAJitTasks.ps1</w:t>
+      </w:r>
+      <w:r>
+        <w:t xml:space="preserve"> </w:t>
+      </w:r>
+      <w:r>
+        <w:t xml:space="preserve">erneut</w:t>
+      </w:r>
+      <w:r>
+        <w:t xml:space="preserve"> </w:t>
+      </w:r>
+      <w:r>
+        <w:t xml:space="preserve">ausführen.</w:t>
+      </w:r>
+    </w:p>
+    <w:p>
+      <w:pPr>
+        <w:pStyle w:val="Compact"/>
+        <w:numPr>
+          <w:ilvl w:val="0"/>
+          <w:numId w:val="1002"/>
+        </w:numPr>
+      </w:pPr>
+      <w:r>
+        <w:t xml:space="preserve">Nach einem ODA-Update kann das Assessment-Setup den Trigger zurücksetzen – kurz gegenprüfen.</w:t>
+      </w:r>
+    </w:p>
+    <w:bookmarkEnd w:id="22"/>
+    <w:bookmarkStart w:id="23" w:name="schritt-7-probelauf-ohne-änderungen"/>
+    <w:p>
+      <w:pPr>
+        <w:pStyle w:val="Heading2"/>
+      </w:pPr>
+      <w:r>
+        <w:t xml:space="preserve">Schritt 7 – Probelauf (ohne Änderungen)</w:t>
       </w:r>
     </w:p>
     <w:p>
@@ -9193,118 +9163,936 @@
       </w:pPr>
       <w:r>
         <w:rPr>
-          <w:rStyle w:val="NormalTok"/>
-        </w:rPr>
-        <w:t xml:space="preserve">Get-ScheduledTask </w:t>
+          <w:rStyle w:val="FunctionTok"/>
+        </w:rPr>
+        <w:t xml:space="preserve">cd</w:t>
+      </w:r>
+      <w:r>
+        <w:rPr>
+          <w:rStyle w:val="NormalTok"/>
+        </w:rPr>
+        <w:t xml:space="preserve"> C</w:t>
       </w:r>
       <w:r>
         <w:rPr>
           <w:rStyle w:val="OperatorTok"/>
         </w:rPr>
+        <w:t xml:space="preserve">:</w:t>
+      </w:r>
+      <w:r>
+        <w:rPr>
+          <w:rStyle w:val="NormalTok"/>
+        </w:rPr>
+        <w:t xml:space="preserve">\ODA-JIT</w:t>
+      </w:r>
+      <w:r>
+        <w:br/>
+      </w:r>
+      <w:r>
+        <w:rPr>
+          <w:rStyle w:val="OperatorTok"/>
+        </w:rPr>
+        <w:t xml:space="preserve">.</w:t>
+      </w:r>
+      <w:r>
+        <w:rPr>
+          <w:rStyle w:val="NormalTok"/>
+        </w:rPr>
+        <w:t xml:space="preserve">\Register-ODAJitTasks</w:t>
+      </w:r>
+      <w:r>
+        <w:rPr>
+          <w:rStyle w:val="OperatorTok"/>
+        </w:rPr>
+        <w:t xml:space="preserve">.</w:t>
+      </w:r>
+      <w:r>
+        <w:rPr>
+          <w:rStyle w:val="FunctionTok"/>
+        </w:rPr>
+        <w:t xml:space="preserve">ps1</w:t>
+      </w:r>
+      <w:r>
+        <w:rPr>
+          <w:rStyle w:val="NormalTok"/>
+        </w:rPr>
+        <w:t xml:space="preserve">       </w:t>
+      </w:r>
+      <w:r>
+        <w:rPr>
+          <w:rStyle w:val="OperatorTok"/>
+        </w:rPr>
         <w:t xml:space="preserve">-</w:t>
       </w:r>
       <w:r>
         <w:rPr>
           <w:rStyle w:val="NormalTok"/>
         </w:rPr>
-        <w:t xml:space="preserve">TaskPath </w:t>
-      </w:r>
-      <w:r>
-        <w:rPr>
-          <w:rStyle w:val="StringTok"/>
-        </w:rPr>
-        <w:t xml:space="preserve">'\ODA-JIT\'</w:t>
-      </w:r>
-      <w:r>
-        <w:rPr>
-          <w:rStyle w:val="NormalTok"/>
-        </w:rPr>
-        <w:t xml:space="preserve"> </w:t>
+        <w:t xml:space="preserve">ConfigPath C</w:t>
       </w:r>
       <w:r>
         <w:rPr>
           <w:rStyle w:val="OperatorTok"/>
         </w:rPr>
-        <w:t xml:space="preserve">|</w:t>
-      </w:r>
-      <w:r>
-        <w:rPr>
-          <w:rStyle w:val="NormalTok"/>
-        </w:rPr>
-        <w:t xml:space="preserve"> Get-ScheduledTaskInfo </w:t>
+        <w:t xml:space="preserve">:</w:t>
+      </w:r>
+      <w:r>
+        <w:rPr>
+          <w:rStyle w:val="NormalTok"/>
+        </w:rPr>
+        <w:t xml:space="preserve">\ODA-JIT\Config\ODAJit</w:t>
       </w:r>
       <w:r>
         <w:rPr>
           <w:rStyle w:val="OperatorTok"/>
         </w:rPr>
-        <w:t xml:space="preserve">|</w:t>
+        <w:t xml:space="preserve">.</w:t>
+      </w:r>
+      <w:r>
+        <w:rPr>
+          <w:rStyle w:val="FunctionTok"/>
+        </w:rPr>
+        <w:t xml:space="preserve">forest</w:t>
+      </w:r>
+      <w:r>
+        <w:rPr>
+          <w:rStyle w:val="OperatorTok"/>
+        </w:rPr>
+        <w:t xml:space="preserve">-</w:t>
+      </w:r>
+      <w:r>
+        <w:rPr>
+          <w:rStyle w:val="NormalTok"/>
+        </w:rPr>
+        <w:t xml:space="preserve">a</w:t>
+      </w:r>
+      <w:r>
+        <w:rPr>
+          <w:rStyle w:val="OperatorTok"/>
+        </w:rPr>
+        <w:t xml:space="preserve">.</w:t>
+      </w:r>
+      <w:r>
+        <w:rPr>
+          <w:rStyle w:val="FunctionTok"/>
+        </w:rPr>
+        <w:t xml:space="preserve">psd1</w:t>
+      </w:r>
+      <w:r>
+        <w:rPr>
+          <w:rStyle w:val="NormalTok"/>
+        </w:rPr>
+        <w:t xml:space="preserve"> </w:t>
+      </w:r>
+      <w:r>
+        <w:rPr>
+          <w:rStyle w:val="OperatorTok"/>
+        </w:rPr>
+        <w:t xml:space="preserve">-</w:t>
+      </w:r>
+      <w:r>
+        <w:rPr>
+          <w:rStyle w:val="NormalTok"/>
+        </w:rPr>
+        <w:t xml:space="preserve">WhatIf   </w:t>
+      </w:r>
+      <w:r>
+        <w:rPr>
+          <w:rStyle w:val="CommentTok"/>
+        </w:rPr>
+        <w:t xml:space="preserve"># Zeiten + Abgleich mit Collector</w:t>
       </w:r>
       <w:r>
         <w:br/>
       </w:r>
       <w:r>
         <w:rPr>
-          <w:rStyle w:val="NormalTok"/>
-        </w:rPr>
-        <w:t xml:space="preserve">    </w:t>
+          <w:rStyle w:val="OperatorTok"/>
+        </w:rPr>
+        <w:t xml:space="preserve">.</w:t>
+      </w:r>
+      <w:r>
+        <w:rPr>
+          <w:rStyle w:val="NormalTok"/>
+        </w:rPr>
+        <w:t xml:space="preserve">\Start-ODAJitGrant</w:t>
+      </w:r>
+      <w:r>
+        <w:rPr>
+          <w:rStyle w:val="OperatorTok"/>
+        </w:rPr>
+        <w:t xml:space="preserve">.</w:t>
       </w:r>
       <w:r>
         <w:rPr>
           <w:rStyle w:val="FunctionTok"/>
         </w:rPr>
-        <w:t xml:space="preserve">Select-Object</w:t>
-      </w:r>
-      <w:r>
-        <w:rPr>
-          <w:rStyle w:val="NormalTok"/>
-        </w:rPr>
-        <w:t xml:space="preserve"> TaskName</w:t>
+        <w:t xml:space="preserve">ps1</w:t>
+      </w:r>
+      <w:r>
+        <w:rPr>
+          <w:rStyle w:val="NormalTok"/>
+        </w:rPr>
+        <w:t xml:space="preserve">          </w:t>
       </w:r>
       <w:r>
         <w:rPr>
           <w:rStyle w:val="OperatorTok"/>
         </w:rPr>
-        <w:t xml:space="preserve">,</w:t>
-      </w:r>
-      <w:r>
-        <w:rPr>
-          <w:rStyle w:val="NormalTok"/>
-        </w:rPr>
-        <w:t xml:space="preserve"> NextRunTime</w:t>
+        <w:t xml:space="preserve">-</w:t>
+      </w:r>
+      <w:r>
+        <w:rPr>
+          <w:rStyle w:val="NormalTok"/>
+        </w:rPr>
+        <w:t xml:space="preserve">ConfigPath C</w:t>
       </w:r>
       <w:r>
         <w:rPr>
           <w:rStyle w:val="OperatorTok"/>
         </w:rPr>
-        <w:t xml:space="preserve">,</w:t>
-      </w:r>
-      <w:r>
-        <w:rPr>
-          <w:rStyle w:val="NormalTok"/>
-        </w:rPr>
-        <w:t xml:space="preserve"> LastRunTime</w:t>
+        <w:t xml:space="preserve">:</w:t>
+      </w:r>
+      <w:r>
+        <w:rPr>
+          <w:rStyle w:val="NormalTok"/>
+        </w:rPr>
+        <w:t xml:space="preserve">\ODA-JIT\Config\ODAJit</w:t>
       </w:r>
       <w:r>
         <w:rPr>
           <w:rStyle w:val="OperatorTok"/>
         </w:rPr>
-        <w:t xml:space="preserve">,</w:t>
-      </w:r>
-      <w:r>
-        <w:rPr>
-          <w:rStyle w:val="NormalTok"/>
-        </w:rPr>
-        <w:t xml:space="preserve"> LastTaskResult</w:t>
+        <w:t xml:space="preserve">.</w:t>
+      </w:r>
+      <w:r>
+        <w:rPr>
+          <w:rStyle w:val="FunctionTok"/>
+        </w:rPr>
+        <w:t xml:space="preserve">forest</w:t>
+      </w:r>
+      <w:r>
+        <w:rPr>
+          <w:rStyle w:val="OperatorTok"/>
+        </w:rPr>
+        <w:t xml:space="preserve">-</w:t>
+      </w:r>
+      <w:r>
+        <w:rPr>
+          <w:rStyle w:val="NormalTok"/>
+        </w:rPr>
+        <w:t xml:space="preserve">a</w:t>
+      </w:r>
+      <w:r>
+        <w:rPr>
+          <w:rStyle w:val="OperatorTok"/>
+        </w:rPr>
+        <w:t xml:space="preserve">.</w:t>
+      </w:r>
+      <w:r>
+        <w:rPr>
+          <w:rStyle w:val="FunctionTok"/>
+        </w:rPr>
+        <w:t xml:space="preserve">psd1</w:t>
+      </w:r>
+      <w:r>
+        <w:rPr>
+          <w:rStyle w:val="NormalTok"/>
+        </w:rPr>
+        <w:t xml:space="preserve"> </w:t>
+      </w:r>
+      <w:r>
+        <w:rPr>
+          <w:rStyle w:val="OperatorTok"/>
+        </w:rPr>
+        <w:t xml:space="preserve">-</w:t>
+      </w:r>
+      <w:r>
+        <w:rPr>
+          <w:rStyle w:val="NormalTok"/>
+        </w:rPr>
+        <w:t xml:space="preserve">WhatIf   </w:t>
+      </w:r>
+      <w:r>
+        <w:rPr>
+          <w:rStyle w:val="CommentTok"/>
+        </w:rPr>
+        <w:t xml:space="preserve"># Vorprüfung Collector, kein Grant</w:t>
+      </w:r>
+      <w:r>
+        <w:br/>
+      </w:r>
+      <w:r>
+        <w:rPr>
+          <w:rStyle w:val="OperatorTok"/>
+        </w:rPr>
+        <w:t xml:space="preserve">.</w:t>
+      </w:r>
+      <w:r>
+        <w:rPr>
+          <w:rStyle w:val="NormalTok"/>
+        </w:rPr>
+        <w:t xml:space="preserve">\Start-ODAJitRevokeWatcher</w:t>
+      </w:r>
+      <w:r>
+        <w:rPr>
+          <w:rStyle w:val="OperatorTok"/>
+        </w:rPr>
+        <w:t xml:space="preserve">.</w:t>
+      </w:r>
+      <w:r>
+        <w:rPr>
+          <w:rStyle w:val="FunctionTok"/>
+        </w:rPr>
+        <w:t xml:space="preserve">ps1</w:t>
+      </w:r>
+      <w:r>
+        <w:rPr>
+          <w:rStyle w:val="NormalTok"/>
+        </w:rPr>
+        <w:t xml:space="preserve">  </w:t>
+      </w:r>
+      <w:r>
+        <w:rPr>
+          <w:rStyle w:val="OperatorTok"/>
+        </w:rPr>
+        <w:t xml:space="preserve">-</w:t>
+      </w:r>
+      <w:r>
+        <w:rPr>
+          <w:rStyle w:val="NormalTok"/>
+        </w:rPr>
+        <w:t xml:space="preserve">ConfigPath C</w:t>
+      </w:r>
+      <w:r>
+        <w:rPr>
+          <w:rStyle w:val="OperatorTok"/>
+        </w:rPr>
+        <w:t xml:space="preserve">:</w:t>
+      </w:r>
+      <w:r>
+        <w:rPr>
+          <w:rStyle w:val="NormalTok"/>
+        </w:rPr>
+        <w:t xml:space="preserve">\ODA-JIT\Config\ODAJit</w:t>
+      </w:r>
+      <w:r>
+        <w:rPr>
+          <w:rStyle w:val="OperatorTok"/>
+        </w:rPr>
+        <w:t xml:space="preserve">.</w:t>
+      </w:r>
+      <w:r>
+        <w:rPr>
+          <w:rStyle w:val="FunctionTok"/>
+        </w:rPr>
+        <w:t xml:space="preserve">forest</w:t>
+      </w:r>
+      <w:r>
+        <w:rPr>
+          <w:rStyle w:val="OperatorTok"/>
+        </w:rPr>
+        <w:t xml:space="preserve">-</w:t>
+      </w:r>
+      <w:r>
+        <w:rPr>
+          <w:rStyle w:val="NormalTok"/>
+        </w:rPr>
+        <w:t xml:space="preserve">a</w:t>
+      </w:r>
+      <w:r>
+        <w:rPr>
+          <w:rStyle w:val="OperatorTok"/>
+        </w:rPr>
+        <w:t xml:space="preserve">.</w:t>
+      </w:r>
+      <w:r>
+        <w:rPr>
+          <w:rStyle w:val="FunctionTok"/>
+        </w:rPr>
+        <w:t xml:space="preserve">psd1</w:t>
+      </w:r>
+      <w:r>
+        <w:rPr>
+          <w:rStyle w:val="NormalTok"/>
+        </w:rPr>
+        <w:t xml:space="preserve"> </w:t>
+      </w:r>
+      <w:r>
+        <w:rPr>
+          <w:rStyle w:val="OperatorTok"/>
+        </w:rPr>
+        <w:t xml:space="preserve">-</w:t>
+      </w:r>
+      <w:r>
+        <w:rPr>
+          <w:rStyle w:val="NormalTok"/>
+        </w:rPr>
+        <w:t xml:space="preserve">RevokeNow </w:t>
+      </w:r>
+      <w:r>
+        <w:rPr>
+          <w:rStyle w:val="OperatorTok"/>
+        </w:rPr>
+        <w:t xml:space="preserve">-</w:t>
+      </w:r>
+      <w:r>
+        <w:rPr>
+          <w:rStyle w:val="NormalTok"/>
+        </w:rPr>
+        <w:t xml:space="preserve">WhatIf</w:t>
       </w:r>
     </w:p>
-    <w:bookmarkEnd w:id="24"/>
-    <w:bookmarkStart w:id="25" w:name="schritt-9-auf-jit-umstellen"/>
+    <w:p>
+      <w:pPr>
+        <w:pStyle w:val="FirstParagraph"/>
+      </w:pPr>
+      <w:r>
+        <w:t xml:space="preserve">Danach einen</w:t>
+      </w:r>
+      <w:r>
+        <w:t xml:space="preserve"> </w:t>
+      </w:r>
+      <w:r>
+        <w:rPr>
+          <w:b/>
+          <w:bCs/>
+        </w:rPr>
+        <w:t xml:space="preserve">echten Testlauf außerhalb des Fensters</w:t>
+      </w:r>
+      <w:r>
+        <w:t xml:space="preserve"> </w:t>
+      </w:r>
+      <w:r>
+        <w:t xml:space="preserve">im Kontext des Ausführer-gMSA ausführen.</w:t>
+      </w:r>
+      <w:r>
+        <w:t xml:space="preserve"> </w:t>
+      </w:r>
+      <w:r>
+        <w:t xml:space="preserve">Am einfachsten registriert man dazu die Aufgaben (Schritt 8) und startet sie manuell:</w:t>
+      </w:r>
+    </w:p>
+    <w:p>
+      <w:pPr>
+        <w:pStyle w:val="SourceCode"/>
+      </w:pPr>
+      <w:r>
+        <w:rPr>
+          <w:rStyle w:val="CommentTok"/>
+        </w:rPr>
+        <w:t xml:space="preserve"># Grant + ODA-Aufgaben sofort starten, danach Watcher mit Fensterstart "jetzt"</w:t>
+      </w:r>
+      <w:r>
+        <w:br/>
+      </w:r>
+      <w:r>
+        <w:rPr>
+          <w:rStyle w:val="OperatorTok"/>
+        </w:rPr>
+        <w:t xml:space="preserve">.</w:t>
+      </w:r>
+      <w:r>
+        <w:rPr>
+          <w:rStyle w:val="NormalTok"/>
+        </w:rPr>
+        <w:t xml:space="preserve">\Start-ODAJitGrant</w:t>
+      </w:r>
+      <w:r>
+        <w:rPr>
+          <w:rStyle w:val="OperatorTok"/>
+        </w:rPr>
+        <w:t xml:space="preserve">.</w:t>
+      </w:r>
+      <w:r>
+        <w:rPr>
+          <w:rStyle w:val="FunctionTok"/>
+        </w:rPr>
+        <w:t xml:space="preserve">ps1</w:t>
+      </w:r>
+      <w:r>
+        <w:rPr>
+          <w:rStyle w:val="NormalTok"/>
+        </w:rPr>
+        <w:t xml:space="preserve">         </w:t>
+      </w:r>
+      <w:r>
+        <w:rPr>
+          <w:rStyle w:val="OperatorTok"/>
+        </w:rPr>
+        <w:t xml:space="preserve">-</w:t>
+      </w:r>
+      <w:r>
+        <w:rPr>
+          <w:rStyle w:val="NormalTok"/>
+        </w:rPr>
+        <w:t xml:space="preserve">ConfigPath C</w:t>
+      </w:r>
+      <w:r>
+        <w:rPr>
+          <w:rStyle w:val="OperatorTok"/>
+        </w:rPr>
+        <w:t xml:space="preserve">:</w:t>
+      </w:r>
+      <w:r>
+        <w:rPr>
+          <w:rStyle w:val="NormalTok"/>
+        </w:rPr>
+        <w:t xml:space="preserve">\ODA-JIT\Config\ODAJit</w:t>
+      </w:r>
+      <w:r>
+        <w:rPr>
+          <w:rStyle w:val="OperatorTok"/>
+        </w:rPr>
+        <w:t xml:space="preserve">.</w:t>
+      </w:r>
+      <w:r>
+        <w:rPr>
+          <w:rStyle w:val="FunctionTok"/>
+        </w:rPr>
+        <w:t xml:space="preserve">forest</w:t>
+      </w:r>
+      <w:r>
+        <w:rPr>
+          <w:rStyle w:val="OperatorTok"/>
+        </w:rPr>
+        <w:t xml:space="preserve">-</w:t>
+      </w:r>
+      <w:r>
+        <w:rPr>
+          <w:rStyle w:val="NormalTok"/>
+        </w:rPr>
+        <w:t xml:space="preserve">a</w:t>
+      </w:r>
+      <w:r>
+        <w:rPr>
+          <w:rStyle w:val="OperatorTok"/>
+        </w:rPr>
+        <w:t xml:space="preserve">.</w:t>
+      </w:r>
+      <w:r>
+        <w:rPr>
+          <w:rStyle w:val="FunctionTok"/>
+        </w:rPr>
+        <w:t xml:space="preserve">psd1</w:t>
+      </w:r>
+      <w:r>
+        <w:rPr>
+          <w:rStyle w:val="NormalTok"/>
+        </w:rPr>
+        <w:t xml:space="preserve"> </w:t>
+      </w:r>
+      <w:r>
+        <w:rPr>
+          <w:rStyle w:val="OperatorTok"/>
+        </w:rPr>
+        <w:t xml:space="preserve">-</w:t>
+      </w:r>
+      <w:r>
+        <w:rPr>
+          <w:rStyle w:val="NormalTok"/>
+        </w:rPr>
+        <w:t xml:space="preserve">StartOdaTasks</w:t>
+      </w:r>
+      <w:r>
+        <w:br/>
+      </w:r>
+      <w:r>
+        <w:rPr>
+          <w:rStyle w:val="OperatorTok"/>
+        </w:rPr>
+        <w:t xml:space="preserve">.</w:t>
+      </w:r>
+      <w:r>
+        <w:rPr>
+          <w:rStyle w:val="NormalTok"/>
+        </w:rPr>
+        <w:t xml:space="preserve">\Start-ODAJitRevokeWatcher</w:t>
+      </w:r>
+      <w:r>
+        <w:rPr>
+          <w:rStyle w:val="OperatorTok"/>
+        </w:rPr>
+        <w:t xml:space="preserve">.</w:t>
+      </w:r>
+      <w:r>
+        <w:rPr>
+          <w:rStyle w:val="FunctionTok"/>
+        </w:rPr>
+        <w:t xml:space="preserve">ps1</w:t>
+      </w:r>
+      <w:r>
+        <w:rPr>
+          <w:rStyle w:val="NormalTok"/>
+        </w:rPr>
+        <w:t xml:space="preserve"> </w:t>
+      </w:r>
+      <w:r>
+        <w:rPr>
+          <w:rStyle w:val="OperatorTok"/>
+        </w:rPr>
+        <w:t xml:space="preserve">-</w:t>
+      </w:r>
+      <w:r>
+        <w:rPr>
+          <w:rStyle w:val="NormalTok"/>
+        </w:rPr>
+        <w:t xml:space="preserve">ConfigPath C</w:t>
+      </w:r>
+      <w:r>
+        <w:rPr>
+          <w:rStyle w:val="OperatorTok"/>
+        </w:rPr>
+        <w:t xml:space="preserve">:</w:t>
+      </w:r>
+      <w:r>
+        <w:rPr>
+          <w:rStyle w:val="NormalTok"/>
+        </w:rPr>
+        <w:t xml:space="preserve">\ODA-JIT\Config\ODAJit</w:t>
+      </w:r>
+      <w:r>
+        <w:rPr>
+          <w:rStyle w:val="OperatorTok"/>
+        </w:rPr>
+        <w:t xml:space="preserve">.</w:t>
+      </w:r>
+      <w:r>
+        <w:rPr>
+          <w:rStyle w:val="FunctionTok"/>
+        </w:rPr>
+        <w:t xml:space="preserve">forest</w:t>
+      </w:r>
+      <w:r>
+        <w:rPr>
+          <w:rStyle w:val="OperatorTok"/>
+        </w:rPr>
+        <w:t xml:space="preserve">-</w:t>
+      </w:r>
+      <w:r>
+        <w:rPr>
+          <w:rStyle w:val="NormalTok"/>
+        </w:rPr>
+        <w:t xml:space="preserve">a</w:t>
+      </w:r>
+      <w:r>
+        <w:rPr>
+          <w:rStyle w:val="OperatorTok"/>
+        </w:rPr>
+        <w:t xml:space="preserve">.</w:t>
+      </w:r>
+      <w:r>
+        <w:rPr>
+          <w:rStyle w:val="FunctionTok"/>
+        </w:rPr>
+        <w:t xml:space="preserve">psd1</w:t>
+      </w:r>
+      <w:r>
+        <w:rPr>
+          <w:rStyle w:val="NormalTok"/>
+        </w:rPr>
+        <w:t xml:space="preserve"> </w:t>
+      </w:r>
+      <w:r>
+        <w:rPr>
+          <w:rStyle w:val="OperatorTok"/>
+        </w:rPr>
+        <w:t xml:space="preserve">-</w:t>
+      </w:r>
+      <w:r>
+        <w:rPr>
+          <w:rStyle w:val="NormalTok"/>
+        </w:rPr>
+        <w:t xml:space="preserve">WindowStart </w:t>
+      </w:r>
+      <w:r>
+        <w:rPr>
+          <w:rStyle w:val="OperatorTok"/>
+        </w:rPr>
+        <w:t xml:space="preserve">(</w:t>
+      </w:r>
+      <w:r>
+        <w:rPr>
+          <w:rStyle w:val="FunctionTok"/>
+        </w:rPr>
+        <w:t xml:space="preserve">Get-Date</w:t>
+      </w:r>
+      <w:r>
+        <w:rPr>
+          <w:rStyle w:val="OperatorTok"/>
+        </w:rPr>
+        <w:t xml:space="preserve">)</w:t>
+      </w:r>
+    </w:p>
+    <w:p>
+      <w:pPr>
+        <w:pStyle w:val="FirstParagraph"/>
+      </w:pPr>
+      <w:r>
+        <w:t xml:space="preserve">Prüfen: Grant-Log OK, Event 1000; Watcher erkennt Ende → Event 1010; das gMSA ist danach nicht</w:t>
+      </w:r>
+      <w:r>
+        <w:t xml:space="preserve"> </w:t>
+      </w:r>
+      <w:r>
+        <w:t xml:space="preserve">mehr in Enterprise Admins; die ODA-Ergebnisse sind vollständig (keine leeren Tabellenblätter).</w:t>
+      </w:r>
+    </w:p>
+    <w:bookmarkEnd w:id="23"/>
+    <w:bookmarkStart w:id="24" w:name="schritt-8-geplante-aufgaben-registrieren"/>
     <w:p>
       <w:pPr>
         <w:pStyle w:val="Heading2"/>
       </w:pPr>
       <w:r>
-        <w:t xml:space="preserve">Schritt 9 – Auf JIT umstellen</w:t>
+        <w:t xml:space="preserve">Schritt 8 – Geplante Aufgaben registrieren</w:t>
+      </w:r>
+    </w:p>
+    <w:p>
+      <w:pPr>
+        <w:pStyle w:val="FirstParagraph"/>
+      </w:pPr>
+      <w:r>
+        <w:t xml:space="preserve">In einer</w:t>
+      </w:r>
+      <w:r>
+        <w:t xml:space="preserve"> </w:t>
+      </w:r>
+      <w:r>
+        <w:rPr>
+          <w:b/>
+          <w:bCs/>
+        </w:rPr>
+        <w:t xml:space="preserve">PowerShell als Administrator</w:t>
+      </w:r>
+      <w:r>
+        <w:t xml:space="preserve"> </w:t>
+      </w:r>
+      <w:r>
+        <w:t xml:space="preserve">auf dem Tier-0-Host:</w:t>
+      </w:r>
+    </w:p>
+    <w:p>
+      <w:pPr>
+        <w:pStyle w:val="SourceCode"/>
+      </w:pPr>
+      <w:r>
+        <w:rPr>
+          <w:rStyle w:val="OperatorTok"/>
+        </w:rPr>
+        <w:t xml:space="preserve">.</w:t>
+      </w:r>
+      <w:r>
+        <w:rPr>
+          <w:rStyle w:val="NormalTok"/>
+        </w:rPr>
+        <w:t xml:space="preserve">\Register-ODAJitTasks</w:t>
+      </w:r>
+      <w:r>
+        <w:rPr>
+          <w:rStyle w:val="OperatorTok"/>
+        </w:rPr>
+        <w:t xml:space="preserve">.</w:t>
+      </w:r>
+      <w:r>
+        <w:rPr>
+          <w:rStyle w:val="FunctionTok"/>
+        </w:rPr>
+        <w:t xml:space="preserve">ps1</w:t>
+      </w:r>
+      <w:r>
+        <w:rPr>
+          <w:rStyle w:val="NormalTok"/>
+        </w:rPr>
+        <w:t xml:space="preserve"> </w:t>
+      </w:r>
+      <w:r>
+        <w:rPr>
+          <w:rStyle w:val="OperatorTok"/>
+        </w:rPr>
+        <w:t xml:space="preserve">-</w:t>
+      </w:r>
+      <w:r>
+        <w:rPr>
+          <w:rStyle w:val="NormalTok"/>
+        </w:rPr>
+        <w:t xml:space="preserve">ConfigPath C</w:t>
+      </w:r>
+      <w:r>
+        <w:rPr>
+          <w:rStyle w:val="OperatorTok"/>
+        </w:rPr>
+        <w:t xml:space="preserve">:</w:t>
+      </w:r>
+      <w:r>
+        <w:rPr>
+          <w:rStyle w:val="NormalTok"/>
+        </w:rPr>
+        <w:t xml:space="preserve">\ODA-JIT\Config\ODAJit</w:t>
+      </w:r>
+      <w:r>
+        <w:rPr>
+          <w:rStyle w:val="OperatorTok"/>
+        </w:rPr>
+        <w:t xml:space="preserve">.</w:t>
+      </w:r>
+      <w:r>
+        <w:rPr>
+          <w:rStyle w:val="FunctionTok"/>
+        </w:rPr>
+        <w:t xml:space="preserve">forest</w:t>
+      </w:r>
+      <w:r>
+        <w:rPr>
+          <w:rStyle w:val="OperatorTok"/>
+        </w:rPr>
+        <w:t xml:space="preserve">-</w:t>
+      </w:r>
+      <w:r>
+        <w:rPr>
+          <w:rStyle w:val="NormalTok"/>
+        </w:rPr>
+        <w:t xml:space="preserve">a</w:t>
+      </w:r>
+      <w:r>
+        <w:rPr>
+          <w:rStyle w:val="OperatorTok"/>
+        </w:rPr>
+        <w:t xml:space="preserve">.</w:t>
+      </w:r>
+      <w:r>
+        <w:rPr>
+          <w:rStyle w:val="FunctionTok"/>
+        </w:rPr>
+        <w:t xml:space="preserve">psd1</w:t>
+      </w:r>
+      <w:r>
+        <w:br/>
+      </w:r>
+      <w:r>
+        <w:rPr>
+          <w:rStyle w:val="CommentTok"/>
+        </w:rPr>
+        <w:t xml:space="preserve"># mit signierten Skripten:</w:t>
+      </w:r>
+      <w:r>
+        <w:br/>
+      </w:r>
+      <w:r>
+        <w:rPr>
+          <w:rStyle w:val="OperatorTok"/>
+        </w:rPr>
+        <w:t xml:space="preserve">.</w:t>
+      </w:r>
+      <w:r>
+        <w:rPr>
+          <w:rStyle w:val="NormalTok"/>
+        </w:rPr>
+        <w:t xml:space="preserve">\Register-ODAJitTasks</w:t>
+      </w:r>
+      <w:r>
+        <w:rPr>
+          <w:rStyle w:val="OperatorTok"/>
+        </w:rPr>
+        <w:t xml:space="preserve">.</w:t>
+      </w:r>
+      <w:r>
+        <w:rPr>
+          <w:rStyle w:val="FunctionTok"/>
+        </w:rPr>
+        <w:t xml:space="preserve">ps1</w:t>
+      </w:r>
+      <w:r>
+        <w:rPr>
+          <w:rStyle w:val="NormalTok"/>
+        </w:rPr>
+        <w:t xml:space="preserve"> </w:t>
+      </w:r>
+      <w:r>
+        <w:rPr>
+          <w:rStyle w:val="OperatorTok"/>
+        </w:rPr>
+        <w:t xml:space="preserve">-</w:t>
+      </w:r>
+      <w:r>
+        <w:rPr>
+          <w:rStyle w:val="NormalTok"/>
+        </w:rPr>
+        <w:t xml:space="preserve">ConfigPath C</w:t>
+      </w:r>
+      <w:r>
+        <w:rPr>
+          <w:rStyle w:val="OperatorTok"/>
+        </w:rPr>
+        <w:t xml:space="preserve">:</w:t>
+      </w:r>
+      <w:r>
+        <w:rPr>
+          <w:rStyle w:val="NormalTok"/>
+        </w:rPr>
+        <w:t xml:space="preserve">\ODA-JIT\Config\ODAJit</w:t>
+      </w:r>
+      <w:r>
+        <w:rPr>
+          <w:rStyle w:val="OperatorTok"/>
+        </w:rPr>
+        <w:t xml:space="preserve">.</w:t>
+      </w:r>
+      <w:r>
+        <w:rPr>
+          <w:rStyle w:val="FunctionTok"/>
+        </w:rPr>
+        <w:t xml:space="preserve">forest</w:t>
+      </w:r>
+      <w:r>
+        <w:rPr>
+          <w:rStyle w:val="OperatorTok"/>
+        </w:rPr>
+        <w:t xml:space="preserve">-</w:t>
+      </w:r>
+      <w:r>
+        <w:rPr>
+          <w:rStyle w:val="NormalTok"/>
+        </w:rPr>
+        <w:t xml:space="preserve">a</w:t>
+      </w:r>
+      <w:r>
+        <w:rPr>
+          <w:rStyle w:val="OperatorTok"/>
+        </w:rPr>
+        <w:t xml:space="preserve">.</w:t>
+      </w:r>
+      <w:r>
+        <w:rPr>
+          <w:rStyle w:val="FunctionTok"/>
+        </w:rPr>
+        <w:t xml:space="preserve">psd1</w:t>
+      </w:r>
+      <w:r>
+        <w:rPr>
+          <w:rStyle w:val="NormalTok"/>
+        </w:rPr>
+        <w:t xml:space="preserve"> </w:t>
+      </w:r>
+      <w:r>
+        <w:rPr>
+          <w:rStyle w:val="OperatorTok"/>
+        </w:rPr>
+        <w:t xml:space="preserve">-</w:t>
+      </w:r>
+      <w:r>
+        <w:rPr>
+          <w:rStyle w:val="NormalTok"/>
+        </w:rPr>
+        <w:t xml:space="preserve">ExecutionPolicy AllSigned</w:t>
+      </w:r>
+    </w:p>
+    <w:p>
+      <w:pPr>
+        <w:pStyle w:val="FirstParagraph"/>
+      </w:pPr>
+      <w:r>
+        <w:t xml:space="preserve">Das Skript</w:t>
       </w:r>
     </w:p>
     <w:p>
@@ -9316,7 +10104,43 @@
         </w:numPr>
       </w:pPr>
       <w:r>
-        <w:t xml:space="preserve">Dauerhafte EA-Mitgliedschaft des Assessment-gMSA bzw. der Gruppe entfernen (falls vorhanden).</w:t>
+        <w:t xml:space="preserve">legt</w:t>
+      </w:r>
+      <w:r>
+        <w:t xml:space="preserve"> </w:t>
+      </w:r>
+      <w:r>
+        <w:rPr>
+          <w:rStyle w:val="VerbatimChar"/>
+        </w:rPr>
+        <w:t xml:space="preserve">\ODA-JIT\ODA-JIT-Grant-forest-a.example</w:t>
+      </w:r>
+      <w:r>
+        <w:t xml:space="preserve"> </w:t>
+      </w:r>
+      <w:r>
+        <w:t xml:space="preserve">(Sonntag 01:00) und</w:t>
+      </w:r>
+      <w:r>
+        <w:t xml:space="preserve"> </w:t>
+      </w:r>
+      <w:r>
+        <w:rPr>
+          <w:rStyle w:val="VerbatimChar"/>
+        </w:rPr>
+        <w:t xml:space="preserve">\ODA-JIT\ODA-JIT-Revoke-forest-a.example</w:t>
+      </w:r>
+      <w:r>
+        <w:t xml:space="preserve"> </w:t>
+      </w:r>
+      <w:r>
+        <w:t xml:space="preserve">(Sonntag 02:15) an, beide mit dem Ausführer-gMSA</w:t>
+      </w:r>
+      <w:r>
+        <w:t xml:space="preserve"> </w:t>
+      </w:r>
+      <w:r>
+        <w:t xml:space="preserve">als Principal,</w:t>
       </w:r>
     </w:p>
     <w:p>
@@ -9328,7 +10152,22 @@
         </w:numPr>
       </w:pPr>
       <w:r>
-        <w:t xml:space="preserve">Ersten regulären Lauf abwarten und Events 1000 → 1010 sowie die Ergebnisse prüfen.</w:t>
+        <w:t xml:space="preserve">legt die Ereignisquelle</w:t>
+      </w:r>
+      <w:r>
+        <w:t xml:space="preserve"> </w:t>
+      </w:r>
+      <w:r>
+        <w:rPr>
+          <w:rStyle w:val="VerbatimChar"/>
+        </w:rPr>
+        <w:t xml:space="preserve">ODA-JIT</w:t>
+      </w:r>
+      <w:r>
+        <w:t xml:space="preserve"> </w:t>
+      </w:r>
+      <w:r>
+        <w:t xml:space="preserve">und den Log-Ordner an,</w:t>
       </w:r>
     </w:p>
     <w:p>
@@ -9340,6 +10179,162 @@
         </w:numPr>
       </w:pPr>
       <w:r>
+        <w:t xml:space="preserve">vergleicht die Trigger der ODA-Aufgaben auf dem Collector mit der Konfiguration.</w:t>
+      </w:r>
+    </w:p>
+    <w:p>
+      <w:pPr>
+        <w:pStyle w:val="SourceCode"/>
+      </w:pPr>
+      <w:r>
+        <w:rPr>
+          <w:rStyle w:val="NormalTok"/>
+        </w:rPr>
+        <w:t xml:space="preserve">Get-ScheduledTask </w:t>
+      </w:r>
+      <w:r>
+        <w:rPr>
+          <w:rStyle w:val="OperatorTok"/>
+        </w:rPr>
+        <w:t xml:space="preserve">-</w:t>
+      </w:r>
+      <w:r>
+        <w:rPr>
+          <w:rStyle w:val="NormalTok"/>
+        </w:rPr>
+        <w:t xml:space="preserve">TaskPath </w:t>
+      </w:r>
+      <w:r>
+        <w:rPr>
+          <w:rStyle w:val="StringTok"/>
+        </w:rPr>
+        <w:t xml:space="preserve">'\ODA-JIT\'</w:t>
+      </w:r>
+      <w:r>
+        <w:rPr>
+          <w:rStyle w:val="NormalTok"/>
+        </w:rPr>
+        <w:t xml:space="preserve"> </w:t>
+      </w:r>
+      <w:r>
+        <w:rPr>
+          <w:rStyle w:val="OperatorTok"/>
+        </w:rPr>
+        <w:t xml:space="preserve">|</w:t>
+      </w:r>
+      <w:r>
+        <w:rPr>
+          <w:rStyle w:val="NormalTok"/>
+        </w:rPr>
+        <w:t xml:space="preserve"> Get-ScheduledTaskInfo </w:t>
+      </w:r>
+      <w:r>
+        <w:rPr>
+          <w:rStyle w:val="OperatorTok"/>
+        </w:rPr>
+        <w:t xml:space="preserve">|</w:t>
+      </w:r>
+      <w:r>
+        <w:br/>
+      </w:r>
+      <w:r>
+        <w:rPr>
+          <w:rStyle w:val="NormalTok"/>
+        </w:rPr>
+        <w:t xml:space="preserve">    </w:t>
+      </w:r>
+      <w:r>
+        <w:rPr>
+          <w:rStyle w:val="FunctionTok"/>
+        </w:rPr>
+        <w:t xml:space="preserve">Select-Object</w:t>
+      </w:r>
+      <w:r>
+        <w:rPr>
+          <w:rStyle w:val="NormalTok"/>
+        </w:rPr>
+        <w:t xml:space="preserve"> TaskName</w:t>
+      </w:r>
+      <w:r>
+        <w:rPr>
+          <w:rStyle w:val="OperatorTok"/>
+        </w:rPr>
+        <w:t xml:space="preserve">,</w:t>
+      </w:r>
+      <w:r>
+        <w:rPr>
+          <w:rStyle w:val="NormalTok"/>
+        </w:rPr>
+        <w:t xml:space="preserve"> NextRunTime</w:t>
+      </w:r>
+      <w:r>
+        <w:rPr>
+          <w:rStyle w:val="OperatorTok"/>
+        </w:rPr>
+        <w:t xml:space="preserve">,</w:t>
+      </w:r>
+      <w:r>
+        <w:rPr>
+          <w:rStyle w:val="NormalTok"/>
+        </w:rPr>
+        <w:t xml:space="preserve"> LastRunTime</w:t>
+      </w:r>
+      <w:r>
+        <w:rPr>
+          <w:rStyle w:val="OperatorTok"/>
+        </w:rPr>
+        <w:t xml:space="preserve">,</w:t>
+      </w:r>
+      <w:r>
+        <w:rPr>
+          <w:rStyle w:val="NormalTok"/>
+        </w:rPr>
+        <w:t xml:space="preserve"> LastTaskResult</w:t>
+      </w:r>
+    </w:p>
+    <w:bookmarkEnd w:id="24"/>
+    <w:bookmarkStart w:id="25" w:name="schritt-9-auf-jit-umstellen"/>
+    <w:p>
+      <w:pPr>
+        <w:pStyle w:val="Heading2"/>
+      </w:pPr>
+      <w:r>
+        <w:t xml:space="preserve">Schritt 9 – Auf JIT umstellen</w:t>
+      </w:r>
+    </w:p>
+    <w:p>
+      <w:pPr>
+        <w:pStyle w:val="Compact"/>
+        <w:numPr>
+          <w:ilvl w:val="0"/>
+          <w:numId w:val="1004"/>
+        </w:numPr>
+      </w:pPr>
+      <w:r>
+        <w:t xml:space="preserve">Dauerhafte EA-Mitgliedschaft des Assessment-gMSA bzw. der Gruppe entfernen (falls vorhanden).</w:t>
+      </w:r>
+    </w:p>
+    <w:p>
+      <w:pPr>
+        <w:pStyle w:val="Compact"/>
+        <w:numPr>
+          <w:ilvl w:val="0"/>
+          <w:numId w:val="1004"/>
+        </w:numPr>
+      </w:pPr>
+      <w:r>
+        <w:t xml:space="preserve">Ersten regulären Lauf abwarten und Events 1000 → 1010 sowie die Ergebnisse prüfen.</w:t>
+      </w:r>
+    </w:p>
+    <w:p>
+      <w:pPr>
+        <w:pStyle w:val="Compact"/>
+        <w:numPr>
+          <w:ilvl w:val="0"/>
+          <w:numId w:val="1004"/>
+        </w:numPr>
+      </w:pPr>
+      <w:r>
         <w:t xml:space="preserve">Im SIEM überwachen:</w:t>
       </w:r>
     </w:p>
@@ -9348,7 +10343,7 @@
         <w:pStyle w:val="Compact"/>
         <w:numPr>
           <w:ilvl w:val="1"/>
-          <w:numId w:val="1004"/>
+          <w:numId w:val="1005"/>
         </w:numPr>
       </w:pPr>
       <w:r>
@@ -9372,7 +10367,7 @@
         <w:pStyle w:val="Compact"/>
         <w:numPr>
           <w:ilvl w:val="1"/>
-          <w:numId w:val="1004"/>
+          <w:numId w:val="1005"/>
         </w:numPr>
       </w:pPr>
       <w:r>
@@ -11145,6 +12140,9 @@
     <w:abstractNumId w:val="991"/>
   </w:num>
   <w:num w:numId="1003">
+    <w:abstractNumId w:val="991"/>
+  </w:num>
+  <w:num w:numId="1004">
     <w:abstractNumId w:val="99411"/>
     <w:lvlOverride w:ilvl="0">
       <w:startOverride w:val="1"/>
@@ -11174,7 +12172,7 @@
       <w:startOverride w:val="1"/>
     </w:lvlOverride>
   </w:num>
-  <w:num w:numId="1004">
+  <w:num w:numId="1005">
     <w:abstractNumId w:val="991"/>
   </w:num>
 </w:numbering>
@@ -23035,6 +24033,232 @@
     <w:pPr>
       <w:wordWrap w:val="off"/>
     </w:pPr>
+  </w:style>
+  <w:style w:customStyle="1" w:styleId="KeywordTok" w:type="character">
+    <w:name w:val="KeywordTok"/>
+    <w:basedOn w:val="VerbatimChar"/>
+    <w:rPr>
+      <w:b/>
+      <w:color w:val="007020"/>
+    </w:rPr>
+  </w:style>
+  <w:style w:customStyle="1" w:styleId="DataTypeTok" w:type="character">
+    <w:name w:val="DataTypeTok"/>
+    <w:basedOn w:val="VerbatimChar"/>
+    <w:rPr>
+      <w:color w:val="902000"/>
+    </w:rPr>
+  </w:style>
+  <w:style w:customStyle="1" w:styleId="DecValTok" w:type="character">
+    <w:name w:val="DecValTok"/>
+    <w:basedOn w:val="VerbatimChar"/>
+    <w:rPr>
+      <w:color w:val="40a070"/>
+    </w:rPr>
+  </w:style>
+  <w:style w:customStyle="1" w:styleId="BaseNTok" w:type="character">
+    <w:name w:val="BaseNTok"/>
+    <w:basedOn w:val="VerbatimChar"/>
+    <w:rPr>
+      <w:color w:val="40a070"/>
+    </w:rPr>
+  </w:style>
+  <w:style w:customStyle="1" w:styleId="FloatTok" w:type="character">
+    <w:name w:val="FloatTok"/>
+    <w:basedOn w:val="VerbatimChar"/>
+    <w:rPr>
+      <w:color w:val="40a070"/>
+    </w:rPr>
+  </w:style>
+  <w:style w:customStyle="1" w:styleId="ConstantTok" w:type="character">
+    <w:name w:val="ConstantTok"/>
+    <w:basedOn w:val="VerbatimChar"/>
+    <w:rPr>
+      <w:color w:val="880000"/>
+    </w:rPr>
+  </w:style>
+  <w:style w:customStyle="1" w:styleId="CharTok" w:type="character">
+    <w:name w:val="CharTok"/>
+    <w:basedOn w:val="VerbatimChar"/>
+    <w:rPr>
+      <w:color w:val="4070a0"/>
+    </w:rPr>
+  </w:style>
+  <w:style w:customStyle="1" w:styleId="SpecialCharTok" w:type="character">
+    <w:name w:val="SpecialCharTok"/>
+    <w:basedOn w:val="VerbatimChar"/>
+    <w:rPr>
+      <w:color w:val="4070a0"/>
+    </w:rPr>
+  </w:style>
+  <w:style w:customStyle="1" w:styleId="StringTok" w:type="character">
+    <w:name w:val="StringTok"/>
+    <w:basedOn w:val="VerbatimChar"/>
+    <w:rPr>
+      <w:color w:val="4070a0"/>
+    </w:rPr>
+  </w:style>
+  <w:style w:customStyle="1" w:styleId="VerbatimStringTok" w:type="character">
+    <w:name w:val="VerbatimStringTok"/>
+    <w:basedOn w:val="VerbatimChar"/>
+    <w:rPr>
+      <w:color w:val="4070a0"/>
+    </w:rPr>
+  </w:style>
+  <w:style w:customStyle="1" w:styleId="SpecialStringTok" w:type="character">
+    <w:name w:val="SpecialStringTok"/>
+    <w:basedOn w:val="VerbatimChar"/>
+    <w:rPr>
+      <w:color w:val="bb6688"/>
+    </w:rPr>
+  </w:style>
+  <w:style w:customStyle="1" w:styleId="ImportTok" w:type="character">
+    <w:name w:val="ImportTok"/>
+    <w:basedOn w:val="VerbatimChar"/>
+    <w:rPr>
+      <w:b/>
+      <w:color w:val="008000"/>
+    </w:rPr>
+  </w:style>
+  <w:style w:customStyle="1" w:styleId="CommentTok" w:type="character">
+    <w:name w:val="CommentTok"/>
+    <w:basedOn w:val="VerbatimChar"/>
+    <w:rPr>
+      <w:i/>
+      <w:color w:val="60a0b0"/>
+    </w:rPr>
+  </w:style>
+  <w:style w:customStyle="1" w:styleId="DocumentationTok" w:type="character">
+    <w:name w:val="DocumentationTok"/>
+    <w:basedOn w:val="VerbatimChar"/>
+    <w:rPr>
+      <w:i/>
+      <w:color w:val="ba2121"/>
+    </w:rPr>
+  </w:style>
+  <w:style w:customStyle="1" w:styleId="AnnotationTok" w:type="character">
+    <w:name w:val="AnnotationTok"/>
+    <w:basedOn w:val="VerbatimChar"/>
+    <w:rPr>
+      <w:b/>
+      <w:i/>
+      <w:color w:val="60a0b0"/>
+    </w:rPr>
+  </w:style>
+  <w:style w:customStyle="1" w:styleId="CommentVarTok" w:type="character">
+    <w:name w:val="CommentVarTok"/>
+    <w:basedOn w:val="VerbatimChar"/>
+    <w:rPr>
+      <w:b/>
+      <w:i/>
+      <w:color w:val="60a0b0"/>
+    </w:rPr>
+  </w:style>
+  <w:style w:customStyle="1" w:styleId="OtherTok" w:type="character">
+    <w:name w:val="OtherTok"/>
+    <w:basedOn w:val="VerbatimChar"/>
+    <w:rPr>
+      <w:color w:val="007020"/>
+    </w:rPr>
+  </w:style>
+  <w:style w:customStyle="1" w:styleId="FunctionTok" w:type="character">
+    <w:name w:val="FunctionTok"/>
+    <w:basedOn w:val="VerbatimChar"/>
+    <w:rPr>
+      <w:color w:val="06287e"/>
+    </w:rPr>
+  </w:style>
+  <w:style w:customStyle="1" w:styleId="VariableTok" w:type="character">
+    <w:name w:val="VariableTok"/>
+    <w:basedOn w:val="VerbatimChar"/>
+    <w:rPr>
+      <w:color w:val="19177c"/>
+    </w:rPr>
+  </w:style>
+  <w:style w:customStyle="1" w:styleId="ControlFlowTok" w:type="character">
+    <w:name w:val="ControlFlowTok"/>
+    <w:basedOn w:val="VerbatimChar"/>
+    <w:rPr>
+      <w:b/>
+      <w:color w:val="007020"/>
+    </w:rPr>
+  </w:style>
+  <w:style w:customStyle="1" w:styleId="OperatorTok" w:type="character">
+    <w:name w:val="OperatorTok"/>
+    <w:basedOn w:val="VerbatimChar"/>
+    <w:rPr>
+      <w:color w:val="666666"/>
+    </w:rPr>
+  </w:style>
+  <w:style w:customStyle="1" w:styleId="BuiltInTok" w:type="character">
+    <w:name w:val="BuiltInTok"/>
+    <w:basedOn w:val="VerbatimChar"/>
+    <w:rPr>
+      <w:color w:val="008000"/>
+    </w:rPr>
+  </w:style>
+  <w:style w:customStyle="1" w:styleId="ExtensionTok" w:type="character">
+    <w:name w:val="ExtensionTok"/>
+    <w:basedOn w:val="VerbatimChar"/>
+    <w:rPr/>
+  </w:style>
+  <w:style w:customStyle="1" w:styleId="PreprocessorTok" w:type="character">
+    <w:name w:val="PreprocessorTok"/>
+    <w:basedOn w:val="VerbatimChar"/>
+    <w:rPr>
+      <w:color w:val="bc7a00"/>
+    </w:rPr>
+  </w:style>
+  <w:style w:customStyle="1" w:styleId="AttributeTok" w:type="character">
+    <w:name w:val="AttributeTok"/>
+    <w:basedOn w:val="VerbatimChar"/>
+    <w:rPr>
+      <w:color w:val="7d9029"/>
+    </w:rPr>
+  </w:style>
+  <w:style w:customStyle="1" w:styleId="RegionMarkerTok" w:type="character">
+    <w:name w:val="RegionMarkerTok"/>
+    <w:basedOn w:val="VerbatimChar"/>
+    <w:rPr/>
+  </w:style>
+  <w:style w:customStyle="1" w:styleId="InformationTok" w:type="character">
+    <w:name w:val="InformationTok"/>
+    <w:basedOn w:val="VerbatimChar"/>
+    <w:rPr>
+      <w:b/>
+      <w:i/>
+      <w:color w:val="60a0b0"/>
+    </w:rPr>
+  </w:style>
+  <w:style w:customStyle="1" w:styleId="WarningTok" w:type="character">
+    <w:name w:val="WarningTok"/>
+    <w:basedOn w:val="VerbatimChar"/>
+    <w:rPr>
+      <w:b/>
+      <w:i/>
+      <w:color w:val="60a0b0"/>
+    </w:rPr>
+  </w:style>
+  <w:style w:customStyle="1" w:styleId="AlertTok" w:type="character">
+    <w:name w:val="AlertTok"/>
+    <w:basedOn w:val="VerbatimChar"/>
+    <w:rPr>
+      <w:b/>
+      <w:color w:val="ff0000"/>
+    </w:rPr>
+  </w:style>
+  <w:style w:customStyle="1" w:styleId="ErrorTok" w:type="character">
+    <w:name w:val="ErrorTok"/>
+    <w:basedOn w:val="VerbatimChar"/>
+    <w:rPr>
+      <w:b/>
+      <w:color w:val="ff0000"/>
+    </w:rPr>
+  </w:style>
+  <w:style w:customStyle="1" w:styleId="NormalTok" w:type="character">
+    <w:name w:val="NormalTok"/>
+    <w:basedOn w:val="VerbatimChar"/>
+    <w:rPr/>
   </w:style>
   <w:style w:customStyle="1" w:styleId="KeywordTok" w:type="character">
     <w:name w:val="KeywordTok"/>

</xml_diff>

<commit_message>
docs(jit): make -TaskPath mandatory for assessment trigger change
ODA assessment tasks live under a subfolder, so Set-ScheduledTask needs -TaskPath; without it it fails with 0x80070002 / ObjectNotFound even though Get-ScheduledTask -TaskName resolves the task. Move -TaskPath into the main steps, add the error explanation and the task-object pipe alternative. Regenerated the German Word version.

Co-authored-by: Copilot <223556219+Copilot@users.noreply.github.com>
</commit_message>
<xml_diff>
--- a/docs/ODA-JIT-Deployment.de.docx
+++ b/docs/ODA-JIT-Deployment.de.docx
@@ -8345,7 +8345,7 @@
         <w:rPr>
           <w:rStyle w:val="CommentTok"/>
         </w:rPr>
-        <w:t xml:space="preserve"># 2) Nur den Trigger ändern – gMSA bleibt unangetastet, kein Passwort nötig</w:t>
+        <w:t xml:space="preserve"># 2) TaskPath ermitteln – ODA-Aufgaben liegen in einem Unterordner, daher Pflicht</w:t>
       </w:r>
       <w:r>
         <w:br/>
@@ -8354,6 +8354,93 @@
         <w:rPr>
           <w:rStyle w:val="VariableTok"/>
         </w:rPr>
+        <w:t xml:space="preserve">$tp</w:t>
+      </w:r>
+      <w:r>
+        <w:rPr>
+          <w:rStyle w:val="NormalTok"/>
+        </w:rPr>
+        <w:t xml:space="preserve"> </w:t>
+      </w:r>
+      <w:r>
+        <w:rPr>
+          <w:rStyle w:val="OperatorTok"/>
+        </w:rPr>
+        <w:t xml:space="preserve">=</w:t>
+      </w:r>
+      <w:r>
+        <w:rPr>
+          <w:rStyle w:val="NormalTok"/>
+        </w:rPr>
+        <w:t xml:space="preserve"> </w:t>
+      </w:r>
+      <w:r>
+        <w:rPr>
+          <w:rStyle w:val="OperatorTok"/>
+        </w:rPr>
+        <w:t xml:space="preserve">(</w:t>
+      </w:r>
+      <w:r>
+        <w:rPr>
+          <w:rStyle w:val="NormalTok"/>
+        </w:rPr>
+        <w:t xml:space="preserve">Get-ScheduledTask </w:t>
+      </w:r>
+      <w:r>
+        <w:rPr>
+          <w:rStyle w:val="OperatorTok"/>
+        </w:rPr>
+        <w:t xml:space="preserve">-</w:t>
+      </w:r>
+      <w:r>
+        <w:rPr>
+          <w:rStyle w:val="NormalTok"/>
+        </w:rPr>
+        <w:t xml:space="preserve">TaskName ADSecurityAssessment</w:t>
+      </w:r>
+      <w:r>
+        <w:rPr>
+          <w:rStyle w:val="OperatorTok"/>
+        </w:rPr>
+        <w:t xml:space="preserve">).</w:t>
+      </w:r>
+      <w:r>
+        <w:rPr>
+          <w:rStyle w:val="FunctionTok"/>
+        </w:rPr>
+        <w:t xml:space="preserve">TaskPath</w:t>
+      </w:r>
+      <w:r>
+        <w:rPr>
+          <w:rStyle w:val="NormalTok"/>
+        </w:rPr>
+        <w:t xml:space="preserve">   </w:t>
+      </w:r>
+      <w:r>
+        <w:rPr>
+          <w:rStyle w:val="CommentTok"/>
+        </w:rPr>
+        <w:t xml:space="preserve"># z. B. \Microsoft\Operations Management Suite\AOI-…\Assessments\</w:t>
+      </w:r>
+      <w:r>
+        <w:br/>
+      </w:r>
+      <w:r>
+        <w:br/>
+      </w:r>
+      <w:r>
+        <w:rPr>
+          <w:rStyle w:val="CommentTok"/>
+        </w:rPr>
+        <w:t xml:space="preserve"># 3) Nur den Trigger ändern – gMSA bleibt unangetastet, kein Passwort nötig</w:t>
+      </w:r>
+      <w:r>
+        <w:br/>
+      </w:r>
+      <w:r>
+        <w:rPr>
+          <w:rStyle w:val="VariableTok"/>
+        </w:rPr>
         <w:t xml:space="preserve">$trigger</w:t>
       </w:r>
       <w:r>
@@ -8471,6 +8558,30 @@
         <w:rPr>
           <w:rStyle w:val="NormalTok"/>
         </w:rPr>
+        <w:t xml:space="preserve">TaskPath </w:t>
+      </w:r>
+      <w:r>
+        <w:rPr>
+          <w:rStyle w:val="VariableTok"/>
+        </w:rPr>
+        <w:t xml:space="preserve">$tp</w:t>
+      </w:r>
+      <w:r>
+        <w:rPr>
+          <w:rStyle w:val="NormalTok"/>
+        </w:rPr>
+        <w:t xml:space="preserve"> </w:t>
+      </w:r>
+      <w:r>
+        <w:rPr>
+          <w:rStyle w:val="OperatorTok"/>
+        </w:rPr>
+        <w:t xml:space="preserve">-</w:t>
+      </w:r>
+      <w:r>
+        <w:rPr>
+          <w:rStyle w:val="NormalTok"/>
+        </w:rPr>
         <w:t xml:space="preserve">Trigger </w:t>
       </w:r>
       <w:r>
@@ -8489,7 +8600,7 @@
         <w:rPr>
           <w:rStyle w:val="CommentTok"/>
         </w:rPr>
-        <w:t xml:space="preserve"># 2b) Nur falls Set-ScheduledTask nach dem Principal fragt: gMSA explizit (weiterhin ohne Passwort)</w:t>
+        <w:t xml:space="preserve"># 3b) Nur falls Set-ScheduledTask nach dem Principal fragt: gMSA explizit (weiterhin ohne Passwort)</w:t>
       </w:r>
       <w:r>
         <w:br/>
@@ -8597,6 +8708,30 @@
         <w:rPr>
           <w:rStyle w:val="NormalTok"/>
         </w:rPr>
+        <w:t xml:space="preserve">TaskPath </w:t>
+      </w:r>
+      <w:r>
+        <w:rPr>
+          <w:rStyle w:val="VariableTok"/>
+        </w:rPr>
+        <w:t xml:space="preserve">$tp</w:t>
+      </w:r>
+      <w:r>
+        <w:rPr>
+          <w:rStyle w:val="NormalTok"/>
+        </w:rPr>
+        <w:t xml:space="preserve"> </w:t>
+      </w:r>
+      <w:r>
+        <w:rPr>
+          <w:rStyle w:val="OperatorTok"/>
+        </w:rPr>
+        <w:t xml:space="preserve">-</w:t>
+      </w:r>
+      <w:r>
+        <w:rPr>
+          <w:rStyle w:val="NormalTok"/>
+        </w:rPr>
         <w:t xml:space="preserve">Trigger </w:t>
       </w:r>
       <w:r>
@@ -8639,7 +8774,7 @@
         <w:rPr>
           <w:rStyle w:val="CommentTok"/>
         </w:rPr>
-        <w:t xml:space="preserve"># 3) Prüfen – beide auf Dienstag, RunAs = gMSA</w:t>
+        <w:t xml:space="preserve"># 4) Prüfen – beide auf Dienstag, RunAs = gMSA</w:t>
       </w:r>
       <w:r>
         <w:br/>
@@ -8977,20 +9112,30 @@
       <w:r>
         <w:rPr>
           <w:rStyle w:val="VerbatimChar"/>
-        </w:rPr>
-        <w:t xml:space="preserve">-LogonType Password</w:t>
-      </w:r>
-      <w:r>
-        <w:t xml:space="preserve"> </w:t>
-      </w:r>
-      <w:r>
-        <w:t xml:space="preserve">ist für gMSA korrekt (kein Klartext-Kennwort, anders als bei einem normalen</w:t>
-      </w:r>
-      <w:r>
-        <w:t xml:space="preserve"> </w:t>
-      </w:r>
-      <w:r>
-        <w:t xml:space="preserve">Konto).</w:t>
+          <w:b/>
+          <w:bCs/>
+        </w:rPr>
+        <w:t xml:space="preserve">-TaskPath</w:t>
+      </w:r>
+      <w:r>
+        <w:rPr>
+          <w:b/>
+          <w:bCs/>
+        </w:rPr>
+        <w:t xml:space="preserve"> </w:t>
+      </w:r>
+      <w:r>
+        <w:rPr>
+          <w:b/>
+          <w:bCs/>
+        </w:rPr>
+        <w:t xml:space="preserve">ist für die ODA-Aufgaben praktisch immer erforderlich.</w:t>
+      </w:r>
+      <w:r>
+        <w:t xml:space="preserve"> </w:t>
+      </w:r>
+      <w:r>
+        <w:t xml:space="preserve">Sie liegen unter</w:t>
       </w:r>
       <w:r>
         <w:t xml:space="preserve"> </w:t>
@@ -8999,13 +9144,118 @@
         <w:rPr>
           <w:rStyle w:val="VerbatimChar"/>
         </w:rPr>
-        <w:t xml:space="preserve">-RunLevel Highest</w:t>
-      </w:r>
-      <w:r>
-        <w:t xml:space="preserve"> </w:t>
-      </w:r>
-      <w:r>
-        <w:t xml:space="preserve">nur, wenn die Aufgabe bisher mit höchsten Rechten läuft (Schritt 1).</w:t>
+        <w:t xml:space="preserve">\Microsoft\Operations Management Suite\…\Assessments\</w:t>
+      </w:r>
+      <w:r>
+        <w:t xml:space="preserve">.</w:t>
+      </w:r>
+      <w:r>
+        <w:t xml:space="preserve"> </w:t>
+      </w:r>
+      <w:r>
+        <w:rPr>
+          <w:rStyle w:val="VerbatimChar"/>
+        </w:rPr>
+        <w:t xml:space="preserve">Set-ScheduledTask</w:t>
+      </w:r>
+      <w:r>
+        <w:t xml:space="preserve"> </w:t>
+      </w:r>
+      <w:r>
+        <w:t xml:space="preserve">sucht ohne</w:t>
+      </w:r>
+      <w:r>
+        <w:t xml:space="preserve"> </w:t>
+      </w:r>
+      <w:r>
+        <w:rPr>
+          <w:rStyle w:val="VerbatimChar"/>
+        </w:rPr>
+        <w:t xml:space="preserve">-TaskPath</w:t>
+      </w:r>
+      <w:r>
+        <w:t xml:space="preserve"> </w:t>
+      </w:r>
+      <w:r>
+        <w:t xml:space="preserve">nur im Stammordner</w:t>
+      </w:r>
+      <w:r>
+        <w:t xml:space="preserve"> </w:t>
+      </w:r>
+      <w:r>
+        <w:rPr>
+          <w:rStyle w:val="VerbatimChar"/>
+        </w:rPr>
+        <w:t xml:space="preserve">\</w:t>
+      </w:r>
+      <w:r>
+        <w:t xml:space="preserve"> </w:t>
+      </w:r>
+      <w:r>
+        <w:t xml:space="preserve">und bricht mit</w:t>
+      </w:r>
+      <w:r>
+        <w:t xml:space="preserve"> </w:t>
+      </w:r>
+      <w:r>
+        <w:rPr>
+          <w:rStyle w:val="VerbatimChar"/>
+        </w:rPr>
+        <w:t xml:space="preserve">0x80070002</w:t>
+      </w:r>
+      <w:r>
+        <w:t xml:space="preserve"> </w:t>
+      </w:r>
+      <w:r>
+        <w:t xml:space="preserve">/</w:t>
+      </w:r>
+      <w:r>
+        <w:t xml:space="preserve"> </w:t>
+      </w:r>
+      <w:r>
+        <w:rPr>
+          <w:rStyle w:val="VerbatimChar"/>
+        </w:rPr>
+        <w:t xml:space="preserve">ObjectNotFound</w:t>
+      </w:r>
+      <w:r>
+        <w:t xml:space="preserve"> </w:t>
+      </w:r>
+      <w:r>
+        <w:t xml:space="preserve">ab, obwohl</w:t>
+      </w:r>
+      <w:r>
+        <w:t xml:space="preserve"> </w:t>
+      </w:r>
+      <w:r>
+        <w:rPr>
+          <w:rStyle w:val="VerbatimChar"/>
+        </w:rPr>
+        <w:t xml:space="preserve">Get-ScheduledTask -TaskName</w:t>
+      </w:r>
+      <w:r>
+        <w:t xml:space="preserve"> </w:t>
+      </w:r>
+      <w:r>
+        <w:t xml:space="preserve">die Aufgabe (ordnerübergreifend) findet. Alternativ das Task-Objekt</w:t>
+      </w:r>
+      <w:r>
+        <w:t xml:space="preserve"> </w:t>
+      </w:r>
+      <w:r>
+        <w:t xml:space="preserve">ändern und zurückpipen:</w:t>
+      </w:r>
+      <w:r>
+        <w:t xml:space="preserve"> </w:t>
+      </w:r>
+      <w:r>
+        <w:rPr>
+          <w:rStyle w:val="VerbatimChar"/>
+        </w:rPr>
+        <w:t xml:space="preserve">$t = Get-ScheduledTask -TaskName ADSecurityAssessment; $t.Triggers = @($trigger); $t | Set-ScheduledTask</w:t>
+      </w:r>
+      <w:r>
+        <w:t xml:space="preserve">.</w:t>
       </w:r>
     </w:p>
     <w:p>
@@ -9017,22 +9267,22 @@
         </w:numPr>
       </w:pPr>
       <w:r>
-        <w:t xml:space="preserve">Ist der Aufgabenname nicht eindeutig oder liegt die Aufgabe in einem Unterordner, zusätzlich</w:t>
-      </w:r>
-      <w:r>
-        <w:t xml:space="preserve"> </w:t>
-      </w:r>
-      <w:r>
         <w:rPr>
           <w:rStyle w:val="VerbatimChar"/>
         </w:rPr>
-        <w:t xml:space="preserve">-TaskPath '\Microsoft\Operations Management Suite\…\Assessments\'</w:t>
-      </w:r>
-      <w:r>
-        <w:t xml:space="preserve"> </w:t>
-      </w:r>
-      <w:r>
-        <w:t xml:space="preserve">angeben (Pfad:</w:t>
+        <w:t xml:space="preserve">-LogonType Password</w:t>
+      </w:r>
+      <w:r>
+        <w:t xml:space="preserve"> </w:t>
+      </w:r>
+      <w:r>
+        <w:t xml:space="preserve">ist für gMSA korrekt (kein Klartext-Kennwort, anders als bei einem normalen</w:t>
+      </w:r>
+      <w:r>
+        <w:t xml:space="preserve"> </w:t>
+      </w:r>
+      <w:r>
+        <w:t xml:space="preserve">Konto).</w:t>
       </w:r>
       <w:r>
         <w:t xml:space="preserve"> </w:t>
@@ -9041,10 +9291,13 @@
         <w:rPr>
           <w:rStyle w:val="VerbatimChar"/>
         </w:rPr>
-        <w:t xml:space="preserve">(Get-ScheduledTask -TaskName ADSecurityAssessment).TaskPath</w:t>
-      </w:r>
-      <w:r>
-        <w:t xml:space="preserve">).</w:t>
+        <w:t xml:space="preserve">-RunLevel Highest</w:t>
+      </w:r>
+      <w:r>
+        <w:t xml:space="preserve"> </w:t>
+      </w:r>
+      <w:r>
+        <w:t xml:space="preserve">nur, wenn die Aufgabe bisher mit höchsten Rechten läuft (Schritt 1).</w:t>
       </w:r>
     </w:p>
     <w:p>
@@ -24033,6 +24286,232 @@
     <w:pPr>
       <w:wordWrap w:val="off"/>
     </w:pPr>
+  </w:style>
+  <w:style w:customStyle="1" w:styleId="KeywordTok" w:type="character">
+    <w:name w:val="KeywordTok"/>
+    <w:basedOn w:val="VerbatimChar"/>
+    <w:rPr>
+      <w:b/>
+      <w:color w:val="007020"/>
+    </w:rPr>
+  </w:style>
+  <w:style w:customStyle="1" w:styleId="DataTypeTok" w:type="character">
+    <w:name w:val="DataTypeTok"/>
+    <w:basedOn w:val="VerbatimChar"/>
+    <w:rPr>
+      <w:color w:val="902000"/>
+    </w:rPr>
+  </w:style>
+  <w:style w:customStyle="1" w:styleId="DecValTok" w:type="character">
+    <w:name w:val="DecValTok"/>
+    <w:basedOn w:val="VerbatimChar"/>
+    <w:rPr>
+      <w:color w:val="40a070"/>
+    </w:rPr>
+  </w:style>
+  <w:style w:customStyle="1" w:styleId="BaseNTok" w:type="character">
+    <w:name w:val="BaseNTok"/>
+    <w:basedOn w:val="VerbatimChar"/>
+    <w:rPr>
+      <w:color w:val="40a070"/>
+    </w:rPr>
+  </w:style>
+  <w:style w:customStyle="1" w:styleId="FloatTok" w:type="character">
+    <w:name w:val="FloatTok"/>
+    <w:basedOn w:val="VerbatimChar"/>
+    <w:rPr>
+      <w:color w:val="40a070"/>
+    </w:rPr>
+  </w:style>
+  <w:style w:customStyle="1" w:styleId="ConstantTok" w:type="character">
+    <w:name w:val="ConstantTok"/>
+    <w:basedOn w:val="VerbatimChar"/>
+    <w:rPr>
+      <w:color w:val="880000"/>
+    </w:rPr>
+  </w:style>
+  <w:style w:customStyle="1" w:styleId="CharTok" w:type="character">
+    <w:name w:val="CharTok"/>
+    <w:basedOn w:val="VerbatimChar"/>
+    <w:rPr>
+      <w:color w:val="4070a0"/>
+    </w:rPr>
+  </w:style>
+  <w:style w:customStyle="1" w:styleId="SpecialCharTok" w:type="character">
+    <w:name w:val="SpecialCharTok"/>
+    <w:basedOn w:val="VerbatimChar"/>
+    <w:rPr>
+      <w:color w:val="4070a0"/>
+    </w:rPr>
+  </w:style>
+  <w:style w:customStyle="1" w:styleId="StringTok" w:type="character">
+    <w:name w:val="StringTok"/>
+    <w:basedOn w:val="VerbatimChar"/>
+    <w:rPr>
+      <w:color w:val="4070a0"/>
+    </w:rPr>
+  </w:style>
+  <w:style w:customStyle="1" w:styleId="VerbatimStringTok" w:type="character">
+    <w:name w:val="VerbatimStringTok"/>
+    <w:basedOn w:val="VerbatimChar"/>
+    <w:rPr>
+      <w:color w:val="4070a0"/>
+    </w:rPr>
+  </w:style>
+  <w:style w:customStyle="1" w:styleId="SpecialStringTok" w:type="character">
+    <w:name w:val="SpecialStringTok"/>
+    <w:basedOn w:val="VerbatimChar"/>
+    <w:rPr>
+      <w:color w:val="bb6688"/>
+    </w:rPr>
+  </w:style>
+  <w:style w:customStyle="1" w:styleId="ImportTok" w:type="character">
+    <w:name w:val="ImportTok"/>
+    <w:basedOn w:val="VerbatimChar"/>
+    <w:rPr>
+      <w:b/>
+      <w:color w:val="008000"/>
+    </w:rPr>
+  </w:style>
+  <w:style w:customStyle="1" w:styleId="CommentTok" w:type="character">
+    <w:name w:val="CommentTok"/>
+    <w:basedOn w:val="VerbatimChar"/>
+    <w:rPr>
+      <w:i/>
+      <w:color w:val="60a0b0"/>
+    </w:rPr>
+  </w:style>
+  <w:style w:customStyle="1" w:styleId="DocumentationTok" w:type="character">
+    <w:name w:val="DocumentationTok"/>
+    <w:basedOn w:val="VerbatimChar"/>
+    <w:rPr>
+      <w:i/>
+      <w:color w:val="ba2121"/>
+    </w:rPr>
+  </w:style>
+  <w:style w:customStyle="1" w:styleId="AnnotationTok" w:type="character">
+    <w:name w:val="AnnotationTok"/>
+    <w:basedOn w:val="VerbatimChar"/>
+    <w:rPr>
+      <w:b/>
+      <w:i/>
+      <w:color w:val="60a0b0"/>
+    </w:rPr>
+  </w:style>
+  <w:style w:customStyle="1" w:styleId="CommentVarTok" w:type="character">
+    <w:name w:val="CommentVarTok"/>
+    <w:basedOn w:val="VerbatimChar"/>
+    <w:rPr>
+      <w:b/>
+      <w:i/>
+      <w:color w:val="60a0b0"/>
+    </w:rPr>
+  </w:style>
+  <w:style w:customStyle="1" w:styleId="OtherTok" w:type="character">
+    <w:name w:val="OtherTok"/>
+    <w:basedOn w:val="VerbatimChar"/>
+    <w:rPr>
+      <w:color w:val="007020"/>
+    </w:rPr>
+  </w:style>
+  <w:style w:customStyle="1" w:styleId="FunctionTok" w:type="character">
+    <w:name w:val="FunctionTok"/>
+    <w:basedOn w:val="VerbatimChar"/>
+    <w:rPr>
+      <w:color w:val="06287e"/>
+    </w:rPr>
+  </w:style>
+  <w:style w:customStyle="1" w:styleId="VariableTok" w:type="character">
+    <w:name w:val="VariableTok"/>
+    <w:basedOn w:val="VerbatimChar"/>
+    <w:rPr>
+      <w:color w:val="19177c"/>
+    </w:rPr>
+  </w:style>
+  <w:style w:customStyle="1" w:styleId="ControlFlowTok" w:type="character">
+    <w:name w:val="ControlFlowTok"/>
+    <w:basedOn w:val="VerbatimChar"/>
+    <w:rPr>
+      <w:b/>
+      <w:color w:val="007020"/>
+    </w:rPr>
+  </w:style>
+  <w:style w:customStyle="1" w:styleId="OperatorTok" w:type="character">
+    <w:name w:val="OperatorTok"/>
+    <w:basedOn w:val="VerbatimChar"/>
+    <w:rPr>
+      <w:color w:val="666666"/>
+    </w:rPr>
+  </w:style>
+  <w:style w:customStyle="1" w:styleId="BuiltInTok" w:type="character">
+    <w:name w:val="BuiltInTok"/>
+    <w:basedOn w:val="VerbatimChar"/>
+    <w:rPr>
+      <w:color w:val="008000"/>
+    </w:rPr>
+  </w:style>
+  <w:style w:customStyle="1" w:styleId="ExtensionTok" w:type="character">
+    <w:name w:val="ExtensionTok"/>
+    <w:basedOn w:val="VerbatimChar"/>
+    <w:rPr/>
+  </w:style>
+  <w:style w:customStyle="1" w:styleId="PreprocessorTok" w:type="character">
+    <w:name w:val="PreprocessorTok"/>
+    <w:basedOn w:val="VerbatimChar"/>
+    <w:rPr>
+      <w:color w:val="bc7a00"/>
+    </w:rPr>
+  </w:style>
+  <w:style w:customStyle="1" w:styleId="AttributeTok" w:type="character">
+    <w:name w:val="AttributeTok"/>
+    <w:basedOn w:val="VerbatimChar"/>
+    <w:rPr>
+      <w:color w:val="7d9029"/>
+    </w:rPr>
+  </w:style>
+  <w:style w:customStyle="1" w:styleId="RegionMarkerTok" w:type="character">
+    <w:name w:val="RegionMarkerTok"/>
+    <w:basedOn w:val="VerbatimChar"/>
+    <w:rPr/>
+  </w:style>
+  <w:style w:customStyle="1" w:styleId="InformationTok" w:type="character">
+    <w:name w:val="InformationTok"/>
+    <w:basedOn w:val="VerbatimChar"/>
+    <w:rPr>
+      <w:b/>
+      <w:i/>
+      <w:color w:val="60a0b0"/>
+    </w:rPr>
+  </w:style>
+  <w:style w:customStyle="1" w:styleId="WarningTok" w:type="character">
+    <w:name w:val="WarningTok"/>
+    <w:basedOn w:val="VerbatimChar"/>
+    <w:rPr>
+      <w:b/>
+      <w:i/>
+      <w:color w:val="60a0b0"/>
+    </w:rPr>
+  </w:style>
+  <w:style w:customStyle="1" w:styleId="AlertTok" w:type="character">
+    <w:name w:val="AlertTok"/>
+    <w:basedOn w:val="VerbatimChar"/>
+    <w:rPr>
+      <w:b/>
+      <w:color w:val="ff0000"/>
+    </w:rPr>
+  </w:style>
+  <w:style w:customStyle="1" w:styleId="ErrorTok" w:type="character">
+    <w:name w:val="ErrorTok"/>
+    <w:basedOn w:val="VerbatimChar"/>
+    <w:rPr>
+      <w:b/>
+      <w:color w:val="ff0000"/>
+    </w:rPr>
+  </w:style>
+  <w:style w:customStyle="1" w:styleId="NormalTok" w:type="character">
+    <w:name w:val="NormalTok"/>
+    <w:basedOn w:val="VerbatimChar"/>
+    <w:rPr/>
   </w:style>
   <w:style w:customStyle="1" w:styleId="KeywordTok" w:type="character">
     <w:name w:val="KeywordTok"/>

</xml_diff>

<commit_message>
docs(jit): clarify step 7 trial run (WhatIf vs live) and -StartOdaTasks
Add info notes to step 7: the -WhatIf block changes nothing vs the live test with -StartOdaTasks (real grant + immediate ODA run + revoke); -StartOdaTasks only starts existing collector tasks (created by the ODA setup, not the toolkit) and warns if missing; grant/watcher must run as the executor gMSA. Regenerated the German Word version.

Co-authored-by: Copilot <223556219+Copilot@users.noreply.github.com>
</commit_message>
<xml_diff>
--- a/docs/ODA-JIT-Deployment.de.docx
+++ b/docs/ODA-JIT-Deployment.de.docx
@@ -10089,6 +10089,381 @@
       </w:r>
       <w:r>
         <w:t xml:space="preserve">mehr in Enterprise Admins; die ODA-Ergebnisse sind vollständig (keine leeren Tabellenblätter).</w:t>
+      </w:r>
+    </w:p>
+    <w:p>
+      <w:pPr>
+        <w:pStyle w:val="BlockText"/>
+      </w:pPr>
+      <w:r>
+        <w:rPr>
+          <w:b/>
+          <w:bCs/>
+        </w:rPr>
+        <w:t xml:space="preserve">Info – was „echter Testlauf” bedeutet.</w:t>
+      </w:r>
+      <w:r>
+        <w:t xml:space="preserve"> </w:t>
+      </w:r>
+      <w:r>
+        <w:t xml:space="preserve">Der erste Block (</w:t>
+      </w:r>
+      <w:r>
+        <w:rPr>
+          <w:rStyle w:val="VerbatimChar"/>
+        </w:rPr>
+        <w:t xml:space="preserve">-WhatIf</w:t>
+      </w:r>
+      <w:r>
+        <w:t xml:space="preserve">) ändert</w:t>
+      </w:r>
+      <w:r>
+        <w:t xml:space="preserve"> </w:t>
+      </w:r>
+      <w:r>
+        <w:rPr>
+          <w:b/>
+          <w:bCs/>
+        </w:rPr>
+        <w:t xml:space="preserve">nichts</w:t>
+      </w:r>
+      <w:r>
+        <w:t xml:space="preserve">: kein</w:t>
+      </w:r>
+      <w:r>
+        <w:t xml:space="preserve"> </w:t>
+      </w:r>
+      <w:r>
+        <w:t xml:space="preserve">Grant, kein Assessment-Start, kein Revoke – nur Vorprüfungen. Der zweite Block ist der</w:t>
+      </w:r>
+      <w:r>
+        <w:t xml:space="preserve"> </w:t>
+      </w:r>
+      <w:r>
+        <w:rPr>
+          <w:b/>
+          <w:bCs/>
+        </w:rPr>
+        <w:t xml:space="preserve">Live-Test</w:t>
+      </w:r>
+      <w:r>
+        <w:t xml:space="preserve">:</w:t>
+      </w:r>
+      <w:r>
+        <w:t xml:space="preserve"> </w:t>
+      </w:r>
+      <w:r>
+        <w:rPr>
+          <w:rStyle w:val="VerbatimChar"/>
+        </w:rPr>
+        <w:t xml:space="preserve">-StartOdaTasks</w:t>
+      </w:r>
+      <w:r>
+        <w:t xml:space="preserve"> </w:t>
+      </w:r>
+      <w:r>
+        <w:t xml:space="preserve">setzt EA</w:t>
+      </w:r>
+      <w:r>
+        <w:t xml:space="preserve"> </w:t>
+      </w:r>
+      <w:r>
+        <w:rPr>
+          <w:b/>
+          <w:bCs/>
+        </w:rPr>
+        <w:t xml:space="preserve">wirklich</w:t>
+      </w:r>
+      <w:r>
+        <w:t xml:space="preserve"> </w:t>
+      </w:r>
+      <w:r>
+        <w:t xml:space="preserve">und startet die ODA-Aufgaben sofort, der</w:t>
+      </w:r>
+      <w:r>
+        <w:t xml:space="preserve"> </w:t>
+      </w:r>
+      <w:r>
+        <w:t xml:space="preserve">Watcher (</w:t>
+      </w:r>
+      <w:r>
+        <w:rPr>
+          <w:rStyle w:val="VerbatimChar"/>
+        </w:rPr>
+        <w:t xml:space="preserve">-WindowStart (Get-Date)</w:t>
+      </w:r>
+      <w:r>
+        <w:t xml:space="preserve">) wartet auf das Ende und entzieht EA wieder. Daher am besten in</w:t>
+      </w:r>
+      <w:r>
+        <w:t xml:space="preserve"> </w:t>
+      </w:r>
+      <w:r>
+        <w:t xml:space="preserve">einem Wartungsfenster/Lab.</w:t>
+      </w:r>
+    </w:p>
+    <w:p>
+      <w:pPr>
+        <w:pStyle w:val="BlockText"/>
+      </w:pPr>
+      <w:r>
+        <w:rPr>
+          <w:b/>
+          <w:bCs/>
+        </w:rPr>
+        <w:t xml:space="preserve">Info –</w:t>
+      </w:r>
+      <w:r>
+        <w:rPr>
+          <w:b/>
+          <w:bCs/>
+        </w:rPr>
+        <w:t xml:space="preserve"> </w:t>
+      </w:r>
+      <w:r>
+        <w:rPr>
+          <w:rStyle w:val="VerbatimChar"/>
+          <w:b/>
+          <w:bCs/>
+        </w:rPr>
+        <w:t xml:space="preserve">-StartOdaTasks</w:t>
+      </w:r>
+      <w:r>
+        <w:rPr>
+          <w:b/>
+          <w:bCs/>
+        </w:rPr>
+        <w:t xml:space="preserve"> </w:t>
+      </w:r>
+      <w:r>
+        <w:rPr>
+          <w:b/>
+          <w:bCs/>
+        </w:rPr>
+        <w:t xml:space="preserve">legt keine ODA-Aufgabe an.</w:t>
+      </w:r>
+      <w:r>
+        <w:t xml:space="preserve"> </w:t>
+      </w:r>
+      <w:r>
+        <w:t xml:space="preserve">Die Aufgaben</w:t>
+      </w:r>
+      <w:r>
+        <w:t xml:space="preserve"> </w:t>
+      </w:r>
+      <w:r>
+        <w:rPr>
+          <w:rStyle w:val="VerbatimChar"/>
+        </w:rPr>
+        <w:t xml:space="preserve">ADAssessment</w:t>
+      </w:r>
+      <w:r>
+        <w:t xml:space="preserve"> </w:t>
+      </w:r>
+      <w:r>
+        <w:t xml:space="preserve">/</w:t>
+      </w:r>
+      <w:r>
+        <w:t xml:space="preserve"> </w:t>
+      </w:r>
+      <w:r>
+        <w:rPr>
+          <w:rStyle w:val="VerbatimChar"/>
+        </w:rPr>
+        <w:t xml:space="preserve">ADSecurityAssessment</w:t>
+      </w:r>
+      <w:r>
+        <w:t xml:space="preserve"> </w:t>
+      </w:r>
+      <w:r>
+        <w:t xml:space="preserve">müssen auf dem Collector</w:t>
+      </w:r>
+      <w:r>
+        <w:t xml:space="preserve"> </w:t>
+      </w:r>
+      <w:r>
+        <w:rPr>
+          <w:b/>
+          <w:bCs/>
+        </w:rPr>
+        <w:t xml:space="preserve">bereits existieren</w:t>
+      </w:r>
+      <w:r>
+        <w:t xml:space="preserve"> </w:t>
+      </w:r>
+      <w:r>
+        <w:t xml:space="preserve">(angelegt durch das</w:t>
+      </w:r>
+      <w:r>
+        <w:t xml:space="preserve"> </w:t>
+      </w:r>
+      <w:r>
+        <w:t xml:space="preserve">ODA-/On-Demand-Assessment-Setup, nicht durch dieses Toolkit).</w:t>
+      </w:r>
+      <w:r>
+        <w:t xml:space="preserve"> </w:t>
+      </w:r>
+      <w:r>
+        <w:rPr>
+          <w:rStyle w:val="VerbatimChar"/>
+        </w:rPr>
+        <w:t xml:space="preserve">-StartOdaTasks</w:t>
+      </w:r>
+      <w:r>
+        <w:t xml:space="preserve"> </w:t>
+      </w:r>
+      <w:r>
+        <w:rPr>
+          <w:b/>
+          <w:bCs/>
+        </w:rPr>
+        <w:t xml:space="preserve">startet</w:t>
+      </w:r>
+      <w:r>
+        <w:t xml:space="preserve"> </w:t>
+      </w:r>
+      <w:r>
+        <w:t xml:space="preserve">nur die</w:t>
+      </w:r>
+      <w:r>
+        <w:t xml:space="preserve"> </w:t>
+      </w:r>
+      <w:r>
+        <w:t xml:space="preserve">vorhandenen Aufgaben sofort (per CIM,</w:t>
+      </w:r>
+      <w:r>
+        <w:t xml:space="preserve"> </w:t>
+      </w:r>
+      <w:r>
+        <w:rPr>
+          <w:rStyle w:val="VerbatimChar"/>
+        </w:rPr>
+        <w:t xml:space="preserve">Start-ScheduledTask</w:t>
+      </w:r>
+      <w:r>
+        <w:t xml:space="preserve">) statt auf den Wochen-Trigger zu</w:t>
+      </w:r>
+      <w:r>
+        <w:t xml:space="preserve"> </w:t>
+      </w:r>
+      <w:r>
+        <w:t xml:space="preserve">warten. Fehlt eine Aufgabe (falscher Name), legt das Skript sie</w:t>
+      </w:r>
+      <w:r>
+        <w:t xml:space="preserve"> </w:t>
+      </w:r>
+      <w:r>
+        <w:rPr>
+          <w:b/>
+          <w:bCs/>
+        </w:rPr>
+        <w:t xml:space="preserve">nicht</w:t>
+      </w:r>
+      <w:r>
+        <w:t xml:space="preserve"> </w:t>
+      </w:r>
+      <w:r>
+        <w:t xml:space="preserve">an, sondern warnt:</w:t>
+      </w:r>
+      <w:r>
+        <w:t xml:space="preserve"> </w:t>
+      </w:r>
+      <w:r>
+        <w:rPr>
+          <w:rStyle w:val="VerbatimChar"/>
+        </w:rPr>
+        <w:t xml:space="preserve">ODA task(s) not found on &lt;Collector&gt;: … - check OdaTaskNames</w:t>
+      </w:r>
+      <w:r>
+        <w:t xml:space="preserve">.</w:t>
+      </w:r>
+    </w:p>
+    <w:p>
+      <w:pPr>
+        <w:pStyle w:val="BlockText"/>
+      </w:pPr>
+      <w:r>
+        <w:rPr>
+          <w:b/>
+          <w:bCs/>
+        </w:rPr>
+        <w:t xml:space="preserve">Info – „im Kontext des Ausführer-gMSA”.</w:t>
+      </w:r>
+      <w:r>
+        <w:t xml:space="preserve"> </w:t>
+      </w:r>
+      <w:r>
+        <w:t xml:space="preserve">Grant/Watcher müssen als</w:t>
+      </w:r>
+      <w:r>
+        <w:t xml:space="preserve"> </w:t>
+      </w:r>
+      <w:r>
+        <w:rPr>
+          <w:rStyle w:val="VerbatimChar"/>
+        </w:rPr>
+        <w:t xml:space="preserve">svc-ODA-JIT$</w:t>
+      </w:r>
+      <w:r>
+        <w:t xml:space="preserve"> </w:t>
+      </w:r>
+      <w:r>
+        <w:t xml:space="preserve">laufen (nur</w:t>
+      </w:r>
+      <w:r>
+        <w:t xml:space="preserve"> </w:t>
+      </w:r>
+      <w:r>
+        <w:t xml:space="preserve">dieses Konto hat die EA- und Collector-Rechte). Am einfachsten die JIT-Aufgaben aus Schritt 8</w:t>
+      </w:r>
+      <w:r>
+        <w:t xml:space="preserve"> </w:t>
+      </w:r>
+      <w:r>
+        <w:t xml:space="preserve">registrieren und in der Aufgabenplanung manuell per</w:t>
+      </w:r>
+      <w:r>
+        <w:t xml:space="preserve"> </w:t>
+      </w:r>
+      <w:r>
+        <w:rPr>
+          <w:b/>
+          <w:bCs/>
+        </w:rPr>
+        <w:t xml:space="preserve">„Ausführen”</w:t>
+      </w:r>
+      <w:r>
+        <w:t xml:space="preserve"> </w:t>
+      </w:r>
+      <w:r>
+        <w:t xml:space="preserve">starten – dann laufen sie als</w:t>
+      </w:r>
+      <w:r>
+        <w:t xml:space="preserve"> </w:t>
+      </w:r>
+      <w:r>
+        <w:t xml:space="preserve">gMSA. Startet man die</w:t>
+      </w:r>
+      <w:r>
+        <w:t xml:space="preserve"> </w:t>
+      </w:r>
+      <w:r>
+        <w:rPr>
+          <w:rStyle w:val="VerbatimChar"/>
+        </w:rPr>
+        <w:t xml:space="preserve">.ps1</w:t>
+      </w:r>
+      <w:r>
+        <w:t xml:space="preserve"> </w:t>
+      </w:r>
+      <w:r>
+        <w:t xml:space="preserve">direkt in einer Admin-Shell, laufen sie als das eigene Konto, nicht</w:t>
+      </w:r>
+      <w:r>
+        <w:t xml:space="preserve"> </w:t>
+      </w:r>
+      <w:r>
+        <w:t xml:space="preserve">als gMSA.</w:t>
       </w:r>
     </w:p>
     <w:bookmarkEnd w:id="23"/>
@@ -24286,6 +24661,232 @@
     <w:pPr>
       <w:wordWrap w:val="off"/>
     </w:pPr>
+  </w:style>
+  <w:style w:customStyle="1" w:styleId="KeywordTok" w:type="character">
+    <w:name w:val="KeywordTok"/>
+    <w:basedOn w:val="VerbatimChar"/>
+    <w:rPr>
+      <w:b/>
+      <w:color w:val="007020"/>
+    </w:rPr>
+  </w:style>
+  <w:style w:customStyle="1" w:styleId="DataTypeTok" w:type="character">
+    <w:name w:val="DataTypeTok"/>
+    <w:basedOn w:val="VerbatimChar"/>
+    <w:rPr>
+      <w:color w:val="902000"/>
+    </w:rPr>
+  </w:style>
+  <w:style w:customStyle="1" w:styleId="DecValTok" w:type="character">
+    <w:name w:val="DecValTok"/>
+    <w:basedOn w:val="VerbatimChar"/>
+    <w:rPr>
+      <w:color w:val="40a070"/>
+    </w:rPr>
+  </w:style>
+  <w:style w:customStyle="1" w:styleId="BaseNTok" w:type="character">
+    <w:name w:val="BaseNTok"/>
+    <w:basedOn w:val="VerbatimChar"/>
+    <w:rPr>
+      <w:color w:val="40a070"/>
+    </w:rPr>
+  </w:style>
+  <w:style w:customStyle="1" w:styleId="FloatTok" w:type="character">
+    <w:name w:val="FloatTok"/>
+    <w:basedOn w:val="VerbatimChar"/>
+    <w:rPr>
+      <w:color w:val="40a070"/>
+    </w:rPr>
+  </w:style>
+  <w:style w:customStyle="1" w:styleId="ConstantTok" w:type="character">
+    <w:name w:val="ConstantTok"/>
+    <w:basedOn w:val="VerbatimChar"/>
+    <w:rPr>
+      <w:color w:val="880000"/>
+    </w:rPr>
+  </w:style>
+  <w:style w:customStyle="1" w:styleId="CharTok" w:type="character">
+    <w:name w:val="CharTok"/>
+    <w:basedOn w:val="VerbatimChar"/>
+    <w:rPr>
+      <w:color w:val="4070a0"/>
+    </w:rPr>
+  </w:style>
+  <w:style w:customStyle="1" w:styleId="SpecialCharTok" w:type="character">
+    <w:name w:val="SpecialCharTok"/>
+    <w:basedOn w:val="VerbatimChar"/>
+    <w:rPr>
+      <w:color w:val="4070a0"/>
+    </w:rPr>
+  </w:style>
+  <w:style w:customStyle="1" w:styleId="StringTok" w:type="character">
+    <w:name w:val="StringTok"/>
+    <w:basedOn w:val="VerbatimChar"/>
+    <w:rPr>
+      <w:color w:val="4070a0"/>
+    </w:rPr>
+  </w:style>
+  <w:style w:customStyle="1" w:styleId="VerbatimStringTok" w:type="character">
+    <w:name w:val="VerbatimStringTok"/>
+    <w:basedOn w:val="VerbatimChar"/>
+    <w:rPr>
+      <w:color w:val="4070a0"/>
+    </w:rPr>
+  </w:style>
+  <w:style w:customStyle="1" w:styleId="SpecialStringTok" w:type="character">
+    <w:name w:val="SpecialStringTok"/>
+    <w:basedOn w:val="VerbatimChar"/>
+    <w:rPr>
+      <w:color w:val="bb6688"/>
+    </w:rPr>
+  </w:style>
+  <w:style w:customStyle="1" w:styleId="ImportTok" w:type="character">
+    <w:name w:val="ImportTok"/>
+    <w:basedOn w:val="VerbatimChar"/>
+    <w:rPr>
+      <w:b/>
+      <w:color w:val="008000"/>
+    </w:rPr>
+  </w:style>
+  <w:style w:customStyle="1" w:styleId="CommentTok" w:type="character">
+    <w:name w:val="CommentTok"/>
+    <w:basedOn w:val="VerbatimChar"/>
+    <w:rPr>
+      <w:i/>
+      <w:color w:val="60a0b0"/>
+    </w:rPr>
+  </w:style>
+  <w:style w:customStyle="1" w:styleId="DocumentationTok" w:type="character">
+    <w:name w:val="DocumentationTok"/>
+    <w:basedOn w:val="VerbatimChar"/>
+    <w:rPr>
+      <w:i/>
+      <w:color w:val="ba2121"/>
+    </w:rPr>
+  </w:style>
+  <w:style w:customStyle="1" w:styleId="AnnotationTok" w:type="character">
+    <w:name w:val="AnnotationTok"/>
+    <w:basedOn w:val="VerbatimChar"/>
+    <w:rPr>
+      <w:b/>
+      <w:i/>
+      <w:color w:val="60a0b0"/>
+    </w:rPr>
+  </w:style>
+  <w:style w:customStyle="1" w:styleId="CommentVarTok" w:type="character">
+    <w:name w:val="CommentVarTok"/>
+    <w:basedOn w:val="VerbatimChar"/>
+    <w:rPr>
+      <w:b/>
+      <w:i/>
+      <w:color w:val="60a0b0"/>
+    </w:rPr>
+  </w:style>
+  <w:style w:customStyle="1" w:styleId="OtherTok" w:type="character">
+    <w:name w:val="OtherTok"/>
+    <w:basedOn w:val="VerbatimChar"/>
+    <w:rPr>
+      <w:color w:val="007020"/>
+    </w:rPr>
+  </w:style>
+  <w:style w:customStyle="1" w:styleId="FunctionTok" w:type="character">
+    <w:name w:val="FunctionTok"/>
+    <w:basedOn w:val="VerbatimChar"/>
+    <w:rPr>
+      <w:color w:val="06287e"/>
+    </w:rPr>
+  </w:style>
+  <w:style w:customStyle="1" w:styleId="VariableTok" w:type="character">
+    <w:name w:val="VariableTok"/>
+    <w:basedOn w:val="VerbatimChar"/>
+    <w:rPr>
+      <w:color w:val="19177c"/>
+    </w:rPr>
+  </w:style>
+  <w:style w:customStyle="1" w:styleId="ControlFlowTok" w:type="character">
+    <w:name w:val="ControlFlowTok"/>
+    <w:basedOn w:val="VerbatimChar"/>
+    <w:rPr>
+      <w:b/>
+      <w:color w:val="007020"/>
+    </w:rPr>
+  </w:style>
+  <w:style w:customStyle="1" w:styleId="OperatorTok" w:type="character">
+    <w:name w:val="OperatorTok"/>
+    <w:basedOn w:val="VerbatimChar"/>
+    <w:rPr>
+      <w:color w:val="666666"/>
+    </w:rPr>
+  </w:style>
+  <w:style w:customStyle="1" w:styleId="BuiltInTok" w:type="character">
+    <w:name w:val="BuiltInTok"/>
+    <w:basedOn w:val="VerbatimChar"/>
+    <w:rPr>
+      <w:color w:val="008000"/>
+    </w:rPr>
+  </w:style>
+  <w:style w:customStyle="1" w:styleId="ExtensionTok" w:type="character">
+    <w:name w:val="ExtensionTok"/>
+    <w:basedOn w:val="VerbatimChar"/>
+    <w:rPr/>
+  </w:style>
+  <w:style w:customStyle="1" w:styleId="PreprocessorTok" w:type="character">
+    <w:name w:val="PreprocessorTok"/>
+    <w:basedOn w:val="VerbatimChar"/>
+    <w:rPr>
+      <w:color w:val="bc7a00"/>
+    </w:rPr>
+  </w:style>
+  <w:style w:customStyle="1" w:styleId="AttributeTok" w:type="character">
+    <w:name w:val="AttributeTok"/>
+    <w:basedOn w:val="VerbatimChar"/>
+    <w:rPr>
+      <w:color w:val="7d9029"/>
+    </w:rPr>
+  </w:style>
+  <w:style w:customStyle="1" w:styleId="RegionMarkerTok" w:type="character">
+    <w:name w:val="RegionMarkerTok"/>
+    <w:basedOn w:val="VerbatimChar"/>
+    <w:rPr/>
+  </w:style>
+  <w:style w:customStyle="1" w:styleId="InformationTok" w:type="character">
+    <w:name w:val="InformationTok"/>
+    <w:basedOn w:val="VerbatimChar"/>
+    <w:rPr>
+      <w:b/>
+      <w:i/>
+      <w:color w:val="60a0b0"/>
+    </w:rPr>
+  </w:style>
+  <w:style w:customStyle="1" w:styleId="WarningTok" w:type="character">
+    <w:name w:val="WarningTok"/>
+    <w:basedOn w:val="VerbatimChar"/>
+    <w:rPr>
+      <w:b/>
+      <w:i/>
+      <w:color w:val="60a0b0"/>
+    </w:rPr>
+  </w:style>
+  <w:style w:customStyle="1" w:styleId="AlertTok" w:type="character">
+    <w:name w:val="AlertTok"/>
+    <w:basedOn w:val="VerbatimChar"/>
+    <w:rPr>
+      <w:b/>
+      <w:color w:val="ff0000"/>
+    </w:rPr>
+  </w:style>
+  <w:style w:customStyle="1" w:styleId="ErrorTok" w:type="character">
+    <w:name w:val="ErrorTok"/>
+    <w:basedOn w:val="VerbatimChar"/>
+    <w:rPr>
+      <w:b/>
+      <w:color w:val="ff0000"/>
+    </w:rPr>
+  </w:style>
+  <w:style w:customStyle="1" w:styleId="NormalTok" w:type="character">
+    <w:name w:val="NormalTok"/>
+    <w:basedOn w:val="VerbatimChar"/>
+    <w:rPr/>
   </w:style>
   <w:style w:customStyle="1" w:styleId="KeywordTok" w:type="character">
     <w:name w:val="KeywordTok"/>

</xml_diff>

<commit_message>
docs(jit): add capabilities and purpose overview table for the six scripts
Section 0 now includes a capabilities/purpose table (purpose, key capabilities, type) complementing the existing file/role table, so readers can see at a glance what each of the six FullEA scripts does and when to use it. Regenerated the German Word version.

Co-authored-by: Copilot <223556219+Copilot@users.noreply.github.com>
</commit_message>
<xml_diff>
--- a/docs/ODA-JIT-Deployment.de.docx
+++ b/docs/ODA-JIT-Deployment.de.docx
@@ -822,6 +822,591 @@
             </w:r>
             <w:r>
               <w:t xml:space="preserve">)</w:t>
+            </w:r>
+          </w:p>
+        </w:tc>
+      </w:tr>
+    </w:tbl>
+    <w:p>
+      <w:pPr>
+        <w:pStyle w:val="BodyText"/>
+      </w:pPr>
+      <w:r>
+        <w:t xml:space="preserve">Die folgende Tabelle fasst</w:t>
+      </w:r>
+      <w:r>
+        <w:t xml:space="preserve"> </w:t>
+      </w:r>
+      <w:r>
+        <w:rPr>
+          <w:b/>
+          <w:bCs/>
+        </w:rPr>
+        <w:t xml:space="preserve">Fähigkeiten und Zweck</w:t>
+      </w:r>
+      <w:r>
+        <w:t xml:space="preserve"> </w:t>
+      </w:r>
+      <w:r>
+        <w:t xml:space="preserve">der sechs Skripte zusammen (ergänzend zur</w:t>
+      </w:r>
+      <w:r>
+        <w:t xml:space="preserve"> </w:t>
+      </w:r>
+      <w:r>
+        <w:t xml:space="preserve">Rolle oben):</w:t>
+      </w:r>
+    </w:p>
+    <w:tbl>
+      <w:tblPr>
+        <w:tblStyle w:val="Table"/>
+        <w:tblW w:type="pct" w:w="5000"/>
+        <w:tblLayout w:type="fixed"/>
+        <w:tblLook w:firstRow="1" w:lastRow="0" w:firstColumn="0" w:lastColumn="0" w:noHBand="0" w:noVBand="0" w:val="0020"/>
+      </w:tblPr>
+      <w:tblGrid>
+        <w:gridCol w:w="1080"/>
+        <w:gridCol w:w="2340"/>
+        <w:gridCol w:w="3960"/>
+        <w:gridCol w:w="540"/>
+      </w:tblGrid>
+      <w:tr>
+        <w:trPr>
+          <w:tblHeader w:val="on"/>
+        </w:trPr>
+        <w:tc>
+          <w:tcPr/>
+          <w:p>
+            <w:pPr>
+              <w:pStyle w:val="Compact"/>
+            </w:pPr>
+            <w:r>
+              <w:t xml:space="preserve">Skript</w:t>
+            </w:r>
+          </w:p>
+        </w:tc>
+        <w:tc>
+          <w:tcPr/>
+          <w:p>
+            <w:pPr>
+              <w:pStyle w:val="Compact"/>
+            </w:pPr>
+            <w:r>
+              <w:t xml:space="preserve">Zweck (wofür)</w:t>
+            </w:r>
+          </w:p>
+        </w:tc>
+        <w:tc>
+          <w:tcPr/>
+          <w:p>
+            <w:pPr>
+              <w:pStyle w:val="Compact"/>
+            </w:pPr>
+            <w:r>
+              <w:t xml:space="preserve">Wichtigste Fähigkeiten</w:t>
+            </w:r>
+          </w:p>
+        </w:tc>
+        <w:tc>
+          <w:tcPr/>
+          <w:p>
+            <w:pPr>
+              <w:pStyle w:val="Compact"/>
+            </w:pPr>
+            <w:r>
+              <w:t xml:space="preserve">Typ</w:t>
+            </w:r>
+          </w:p>
+        </w:tc>
+      </w:tr>
+      <w:tr>
+        <w:tc>
+          <w:tcPr/>
+          <w:p>
+            <w:pPr>
+              <w:pStyle w:val="Compact"/>
+            </w:pPr>
+            <w:r>
+              <w:rPr>
+                <w:rStyle w:val="VerbatimChar"/>
+              </w:rPr>
+              <w:t xml:space="preserve">Register-ODAJitTasks.ps1</w:t>
+            </w:r>
+          </w:p>
+        </w:tc>
+        <w:tc>
+          <w:tcPr/>
+          <w:p>
+            <w:pPr>
+              <w:pStyle w:val="Compact"/>
+            </w:pPr>
+            <w:r>
+              <w:t xml:space="preserve">Einmalige Einrichtung je Forest</w:t>
+            </w:r>
+          </w:p>
+        </w:tc>
+        <w:tc>
+          <w:tcPr/>
+          <w:p>
+            <w:pPr>
+              <w:pStyle w:val="Compact"/>
+            </w:pPr>
+            <w:r>
+              <w:t xml:space="preserve">Legt die Aufgaben</w:t>
+            </w:r>
+            <w:r>
+              <w:t xml:space="preserve"> </w:t>
+            </w:r>
+            <w:r>
+              <w:rPr>
+                <w:rStyle w:val="VerbatimChar"/>
+              </w:rPr>
+              <w:t xml:space="preserve">ODA-JIT-Grant/Revoke-&lt;Forest&gt;</w:t>
+            </w:r>
+            <w:r>
+              <w:t xml:space="preserve">, Ereignisquelle und Log-Ordner an; vergleicht die Collector-Trigger mit der Konfiguration;</w:t>
+            </w:r>
+            <w:r>
+              <w:t xml:space="preserve"> </w:t>
+            </w:r>
+            <w:r>
+              <w:rPr>
+                <w:rStyle w:val="VerbatimChar"/>
+              </w:rPr>
+              <w:t xml:space="preserve">-Unregister</w:t>
+            </w:r>
+            <w:r>
+              <w:t xml:space="preserve"> </w:t>
+            </w:r>
+            <w:r>
+              <w:t xml:space="preserve">zum Entfernen;</w:t>
+            </w:r>
+            <w:r>
+              <w:t xml:space="preserve"> </w:t>
+            </w:r>
+            <w:r>
+              <w:rPr>
+                <w:rStyle w:val="VerbatimChar"/>
+              </w:rPr>
+              <w:t xml:space="preserve">-WhatIf</w:t>
+            </w:r>
+          </w:p>
+        </w:tc>
+        <w:tc>
+          <w:tcPr/>
+          <w:p>
+            <w:pPr>
+              <w:pStyle w:val="Compact"/>
+            </w:pPr>
+            <w:r>
+              <w:t xml:space="preserve">Einrichtung</w:t>
+            </w:r>
+          </w:p>
+        </w:tc>
+      </w:tr>
+      <w:tr>
+        <w:tc>
+          <w:tcPr/>
+          <w:p>
+            <w:pPr>
+              <w:pStyle w:val="Compact"/>
+            </w:pPr>
+            <w:r>
+              <w:rPr>
+                <w:rStyle w:val="VerbatimChar"/>
+              </w:rPr>
+              <w:t xml:space="preserve">Start-ODAJitGrant.ps1</w:t>
+            </w:r>
+          </w:p>
+        </w:tc>
+        <w:tc>
+          <w:tcPr/>
+          <w:p>
+            <w:pPr>
+              <w:pStyle w:val="Compact"/>
+            </w:pPr>
+            <w:r>
+              <w:t xml:space="preserve">EA</w:t>
+            </w:r>
+            <w:r>
+              <w:t xml:space="preserve"> </w:t>
+            </w:r>
+            <w:r>
+              <w:rPr>
+                <w:b/>
+                <w:bCs/>
+              </w:rPr>
+              <w:t xml:space="preserve">vor</w:t>
+            </w:r>
+            <w:r>
+              <w:t xml:space="preserve"> </w:t>
+            </w:r>
+            <w:r>
+              <w:t xml:space="preserve">dem Fenster vergeben</w:t>
+            </w:r>
+          </w:p>
+        </w:tc>
+        <w:tc>
+          <w:tcPr/>
+          <w:p>
+            <w:pPr>
+              <w:pStyle w:val="Compact"/>
+            </w:pPr>
+            <w:r>
+              <w:t xml:space="preserve">Nimmt die Gruppe mit TTL in Enterprise Admins auf, repliziert auf die GCs und prüft die Sichtbarkeit;</w:t>
+            </w:r>
+            <w:r>
+              <w:t xml:space="preserve"> </w:t>
+            </w:r>
+            <w:r>
+              <w:rPr>
+                <w:rStyle w:val="VerbatimChar"/>
+              </w:rPr>
+              <w:t xml:space="preserve">-StartOdaTasks</w:t>
+            </w:r>
+            <w:r>
+              <w:t xml:space="preserve"> </w:t>
+            </w:r>
+            <w:r>
+              <w:t xml:space="preserve">startet die ODA-Aufgaben sofort (Testlauf);</w:t>
+            </w:r>
+            <w:r>
+              <w:t xml:space="preserve"> </w:t>
+            </w:r>
+            <w:r>
+              <w:rPr>
+                <w:rStyle w:val="VerbatimChar"/>
+              </w:rPr>
+              <w:t xml:space="preserve">-WhatIf</w:t>
+            </w:r>
+          </w:p>
+        </w:tc>
+        <w:tc>
+          <w:tcPr/>
+          <w:p>
+            <w:pPr>
+              <w:pStyle w:val="Compact"/>
+            </w:pPr>
+            <w:r>
+              <w:t xml:space="preserve">Laufzeit (Grant)</w:t>
+            </w:r>
+          </w:p>
+        </w:tc>
+      </w:tr>
+      <w:tr>
+        <w:tc>
+          <w:tcPr/>
+          <w:p>
+            <w:pPr>
+              <w:pStyle w:val="Compact"/>
+            </w:pPr>
+            <w:r>
+              <w:rPr>
+                <w:rStyle w:val="VerbatimChar"/>
+              </w:rPr>
+              <w:t xml:space="preserve">Start-ODAJitRevokeWatcher.ps1</w:t>
+            </w:r>
+          </w:p>
+        </w:tc>
+        <w:tc>
+          <w:tcPr/>
+          <w:p>
+            <w:pPr>
+              <w:pStyle w:val="Compact"/>
+            </w:pPr>
+            <w:r>
+              <w:t xml:space="preserve">EA</w:t>
+            </w:r>
+            <w:r>
+              <w:t xml:space="preserve"> </w:t>
+            </w:r>
+            <w:r>
+              <w:rPr>
+                <w:b/>
+                <w:bCs/>
+              </w:rPr>
+              <w:t xml:space="preserve">nach</w:t>
+            </w:r>
+            <w:r>
+              <w:t xml:space="preserve"> </w:t>
+            </w:r>
+            <w:r>
+              <w:t xml:space="preserve">dem Lauf entziehen</w:t>
+            </w:r>
+          </w:p>
+        </w:tc>
+        <w:tc>
+          <w:tcPr/>
+          <w:p>
+            <w:pPr>
+              <w:pStyle w:val="Compact"/>
+            </w:pPr>
+            <w:r>
+              <w:t xml:space="preserve">Erkennt das Ende (Task-Status,</w:t>
+            </w:r>
+            <w:r>
+              <w:t xml:space="preserve"> </w:t>
+            </w:r>
+            <w:r>
+              <w:rPr>
+                <w:rStyle w:val="VerbatimChar"/>
+              </w:rPr>
+              <w:t xml:space="preserve">OMSAssessment.exe</w:t>
+            </w:r>
+            <w:r>
+              <w:t xml:space="preserve">,</w:t>
+            </w:r>
+            <w:r>
+              <w:t xml:space="preserve"> </w:t>
+            </w:r>
+            <w:r>
+              <w:rPr>
+                <w:rStyle w:val="VerbatimChar"/>
+              </w:rPr>
+              <w:t xml:space="preserve">*.recommendations.*</w:t>
+            </w:r>
+            <w:r>
+              <w:t xml:space="preserve">), hält die Karenzzeit, klassifiziert das Ergebnis, erzwingt die Deadline;</w:t>
+            </w:r>
+            <w:r>
+              <w:t xml:space="preserve"> </w:t>
+            </w:r>
+            <w:r>
+              <w:rPr>
+                <w:rStyle w:val="VerbatimChar"/>
+              </w:rPr>
+              <w:t xml:space="preserve">-RevokeNow</w:t>
+            </w:r>
+            <w:r>
+              <w:t xml:space="preserve"> </w:t>
+            </w:r>
+            <w:r>
+              <w:t xml:space="preserve">(Notfall),</w:t>
+            </w:r>
+            <w:r>
+              <w:t xml:space="preserve"> </w:t>
+            </w:r>
+            <w:r>
+              <w:rPr>
+                <w:rStyle w:val="VerbatimChar"/>
+              </w:rPr>
+              <w:t xml:space="preserve">-WindowStart</w:t>
+            </w:r>
+          </w:p>
+        </w:tc>
+        <w:tc>
+          <w:tcPr/>
+          <w:p>
+            <w:pPr>
+              <w:pStyle w:val="Compact"/>
+            </w:pPr>
+            <w:r>
+              <w:t xml:space="preserve">Laufzeit (Revoke)</w:t>
+            </w:r>
+          </w:p>
+        </w:tc>
+      </w:tr>
+      <w:tr>
+        <w:tc>
+          <w:tcPr/>
+          <w:p>
+            <w:pPr>
+              <w:pStyle w:val="Compact"/>
+            </w:pPr>
+            <w:r>
+              <w:rPr>
+                <w:rStyle w:val="VerbatimChar"/>
+              </w:rPr>
+              <w:t xml:space="preserve">Invoke-ODAJitDelegation.ps1</w:t>
+            </w:r>
+          </w:p>
+        </w:tc>
+        <w:tc>
+          <w:tcPr/>
+          <w:p>
+            <w:pPr>
+              <w:pStyle w:val="Compact"/>
+            </w:pPr>
+            <w:r>
+              <w:t xml:space="preserve">Eigentliche EA-Änderung</w:t>
+            </w:r>
+          </w:p>
+        </w:tc>
+        <w:tc>
+          <w:tcPr/>
+          <w:p>
+            <w:pPr>
+              <w:pStyle w:val="Compact"/>
+            </w:pPr>
+            <w:r>
+              <w:t xml:space="preserve">Setzt bzw. entfernt die EA-Mitgliedschaft (</w:t>
+            </w:r>
+            <w:r>
+              <w:rPr>
+                <w:rStyle w:val="VerbatimChar"/>
+              </w:rPr>
+              <w:t xml:space="preserve">-Mode FullEA</w:t>
+            </w:r>
+            <w:r>
+              <w:t xml:space="preserve">,</w:t>
+            </w:r>
+            <w:r>
+              <w:t xml:space="preserve"> </w:t>
+            </w:r>
+            <w:r>
+              <w:rPr>
+                <w:rStyle w:val="VerbatimChar"/>
+              </w:rPr>
+              <w:t xml:space="preserve">-operation add/delete</w:t>
+            </w:r>
+            <w:r>
+              <w:t xml:space="preserve">);</w:t>
+            </w:r>
+            <w:r>
+              <w:t xml:space="preserve"> </w:t>
+            </w:r>
+            <w:r>
+              <w:rPr>
+                <w:b/>
+                <w:bCs/>
+              </w:rPr>
+              <w:t xml:space="preserve">nicht</w:t>
+            </w:r>
+            <w:r>
+              <w:t xml:space="preserve"> </w:t>
+            </w:r>
+            <w:r>
+              <w:t xml:space="preserve">direkt aufrufen</w:t>
+            </w:r>
+          </w:p>
+        </w:tc>
+        <w:tc>
+          <w:tcPr/>
+          <w:p>
+            <w:pPr>
+              <w:pStyle w:val="Compact"/>
+            </w:pPr>
+            <w:r>
+              <w:t xml:space="preserve">Hilfsskript</w:t>
+            </w:r>
+          </w:p>
+        </w:tc>
+      </w:tr>
+      <w:tr>
+        <w:tc>
+          <w:tcPr/>
+          <w:p>
+            <w:pPr>
+              <w:pStyle w:val="Compact"/>
+            </w:pPr>
+            <w:r>
+              <w:rPr>
+                <w:rStyle w:val="VerbatimChar"/>
+              </w:rPr>
+              <w:t xml:space="preserve">ODAJit.Common.psm1</w:t>
+            </w:r>
+          </w:p>
+        </w:tc>
+        <w:tc>
+          <w:tcPr/>
+          <w:p>
+            <w:pPr>
+              <w:pStyle w:val="Compact"/>
+            </w:pPr>
+            <w:r>
+              <w:t xml:space="preserve">Gemeinsame Logik</w:t>
+            </w:r>
+          </w:p>
+        </w:tc>
+        <w:tc>
+          <w:tcPr/>
+          <w:p>
+            <w:pPr>
+              <w:pStyle w:val="Compact"/>
+            </w:pPr>
+            <w:r>
+              <w:t xml:space="preserve">Konfiguration laden/prüfen, Zeitfenster berechnen, Ende-Signale auswerten, Logging, Events, AD-Helfer</w:t>
+            </w:r>
+          </w:p>
+        </w:tc>
+        <w:tc>
+          <w:tcPr/>
+          <w:p>
+            <w:pPr>
+              <w:pStyle w:val="Compact"/>
+            </w:pPr>
+            <w:r>
+              <w:t xml:space="preserve">Bibliothek</w:t>
+            </w:r>
+          </w:p>
+        </w:tc>
+      </w:tr>
+      <w:tr>
+        <w:tc>
+          <w:tcPr/>
+          <w:p>
+            <w:pPr>
+              <w:pStyle w:val="Compact"/>
+            </w:pPr>
+            <w:r>
+              <w:rPr>
+                <w:rStyle w:val="VerbatimChar"/>
+              </w:rPr>
+              <w:t xml:space="preserve">ODAJit.example.psd1</w:t>
+            </w:r>
+          </w:p>
+        </w:tc>
+        <w:tc>
+          <w:tcPr/>
+          <w:p>
+            <w:pPr>
+              <w:pStyle w:val="Compact"/>
+            </w:pPr>
+            <w:r>
+              <w:t xml:space="preserve">Konfigurationsvorlage</w:t>
+            </w:r>
+          </w:p>
+        </w:tc>
+        <w:tc>
+          <w:tcPr/>
+          <w:p>
+            <w:pPr>
+              <w:pStyle w:val="Compact"/>
+            </w:pPr>
+            <w:r>
+              <w:t xml:space="preserve">Alle Parameter je Forest: Konten, Collector,</w:t>
+            </w:r>
+            <w:r>
+              <w:t xml:space="preserve"> </w:t>
+            </w:r>
+            <w:r>
+              <w:rPr>
+                <w:rStyle w:val="VerbatimChar"/>
+              </w:rPr>
+              <w:t xml:space="preserve">OdaTaskNames</w:t>
+            </w:r>
+            <w:r>
+              <w:t xml:space="preserve">, Fenster, Timing, PAM (</w:t>
+            </w:r>
+            <w:r>
+              <w:rPr>
+                <w:rStyle w:val="VerbatimChar"/>
+              </w:rPr>
+              <w:t xml:space="preserve">UsePamTtl</w:t>
+            </w:r>
+            <w:r>
+              <w:t xml:space="preserve">)</w:t>
+            </w:r>
+          </w:p>
+        </w:tc>
+        <w:tc>
+          <w:tcPr/>
+          <w:p>
+            <w:pPr>
+              <w:pStyle w:val="Compact"/>
+            </w:pPr>
+            <w:r>
+              <w:t xml:space="preserve">Konfiguration</w:t>
             </w:r>
           </w:p>
         </w:tc>
@@ -24661,6 +25246,232 @@
     <w:pPr>
       <w:wordWrap w:val="off"/>
     </w:pPr>
+  </w:style>
+  <w:style w:customStyle="1" w:styleId="KeywordTok" w:type="character">
+    <w:name w:val="KeywordTok"/>
+    <w:basedOn w:val="VerbatimChar"/>
+    <w:rPr>
+      <w:b/>
+      <w:color w:val="007020"/>
+    </w:rPr>
+  </w:style>
+  <w:style w:customStyle="1" w:styleId="DataTypeTok" w:type="character">
+    <w:name w:val="DataTypeTok"/>
+    <w:basedOn w:val="VerbatimChar"/>
+    <w:rPr>
+      <w:color w:val="902000"/>
+    </w:rPr>
+  </w:style>
+  <w:style w:customStyle="1" w:styleId="DecValTok" w:type="character">
+    <w:name w:val="DecValTok"/>
+    <w:basedOn w:val="VerbatimChar"/>
+    <w:rPr>
+      <w:color w:val="40a070"/>
+    </w:rPr>
+  </w:style>
+  <w:style w:customStyle="1" w:styleId="BaseNTok" w:type="character">
+    <w:name w:val="BaseNTok"/>
+    <w:basedOn w:val="VerbatimChar"/>
+    <w:rPr>
+      <w:color w:val="40a070"/>
+    </w:rPr>
+  </w:style>
+  <w:style w:customStyle="1" w:styleId="FloatTok" w:type="character">
+    <w:name w:val="FloatTok"/>
+    <w:basedOn w:val="VerbatimChar"/>
+    <w:rPr>
+      <w:color w:val="40a070"/>
+    </w:rPr>
+  </w:style>
+  <w:style w:customStyle="1" w:styleId="ConstantTok" w:type="character">
+    <w:name w:val="ConstantTok"/>
+    <w:basedOn w:val="VerbatimChar"/>
+    <w:rPr>
+      <w:color w:val="880000"/>
+    </w:rPr>
+  </w:style>
+  <w:style w:customStyle="1" w:styleId="CharTok" w:type="character">
+    <w:name w:val="CharTok"/>
+    <w:basedOn w:val="VerbatimChar"/>
+    <w:rPr>
+      <w:color w:val="4070a0"/>
+    </w:rPr>
+  </w:style>
+  <w:style w:customStyle="1" w:styleId="SpecialCharTok" w:type="character">
+    <w:name w:val="SpecialCharTok"/>
+    <w:basedOn w:val="VerbatimChar"/>
+    <w:rPr>
+      <w:color w:val="4070a0"/>
+    </w:rPr>
+  </w:style>
+  <w:style w:customStyle="1" w:styleId="StringTok" w:type="character">
+    <w:name w:val="StringTok"/>
+    <w:basedOn w:val="VerbatimChar"/>
+    <w:rPr>
+      <w:color w:val="4070a0"/>
+    </w:rPr>
+  </w:style>
+  <w:style w:customStyle="1" w:styleId="VerbatimStringTok" w:type="character">
+    <w:name w:val="VerbatimStringTok"/>
+    <w:basedOn w:val="VerbatimChar"/>
+    <w:rPr>
+      <w:color w:val="4070a0"/>
+    </w:rPr>
+  </w:style>
+  <w:style w:customStyle="1" w:styleId="SpecialStringTok" w:type="character">
+    <w:name w:val="SpecialStringTok"/>
+    <w:basedOn w:val="VerbatimChar"/>
+    <w:rPr>
+      <w:color w:val="bb6688"/>
+    </w:rPr>
+  </w:style>
+  <w:style w:customStyle="1" w:styleId="ImportTok" w:type="character">
+    <w:name w:val="ImportTok"/>
+    <w:basedOn w:val="VerbatimChar"/>
+    <w:rPr>
+      <w:b/>
+      <w:color w:val="008000"/>
+    </w:rPr>
+  </w:style>
+  <w:style w:customStyle="1" w:styleId="CommentTok" w:type="character">
+    <w:name w:val="CommentTok"/>
+    <w:basedOn w:val="VerbatimChar"/>
+    <w:rPr>
+      <w:i/>
+      <w:color w:val="60a0b0"/>
+    </w:rPr>
+  </w:style>
+  <w:style w:customStyle="1" w:styleId="DocumentationTok" w:type="character">
+    <w:name w:val="DocumentationTok"/>
+    <w:basedOn w:val="VerbatimChar"/>
+    <w:rPr>
+      <w:i/>
+      <w:color w:val="ba2121"/>
+    </w:rPr>
+  </w:style>
+  <w:style w:customStyle="1" w:styleId="AnnotationTok" w:type="character">
+    <w:name w:val="AnnotationTok"/>
+    <w:basedOn w:val="VerbatimChar"/>
+    <w:rPr>
+      <w:b/>
+      <w:i/>
+      <w:color w:val="60a0b0"/>
+    </w:rPr>
+  </w:style>
+  <w:style w:customStyle="1" w:styleId="CommentVarTok" w:type="character">
+    <w:name w:val="CommentVarTok"/>
+    <w:basedOn w:val="VerbatimChar"/>
+    <w:rPr>
+      <w:b/>
+      <w:i/>
+      <w:color w:val="60a0b0"/>
+    </w:rPr>
+  </w:style>
+  <w:style w:customStyle="1" w:styleId="OtherTok" w:type="character">
+    <w:name w:val="OtherTok"/>
+    <w:basedOn w:val="VerbatimChar"/>
+    <w:rPr>
+      <w:color w:val="007020"/>
+    </w:rPr>
+  </w:style>
+  <w:style w:customStyle="1" w:styleId="FunctionTok" w:type="character">
+    <w:name w:val="FunctionTok"/>
+    <w:basedOn w:val="VerbatimChar"/>
+    <w:rPr>
+      <w:color w:val="06287e"/>
+    </w:rPr>
+  </w:style>
+  <w:style w:customStyle="1" w:styleId="VariableTok" w:type="character">
+    <w:name w:val="VariableTok"/>
+    <w:basedOn w:val="VerbatimChar"/>
+    <w:rPr>
+      <w:color w:val="19177c"/>
+    </w:rPr>
+  </w:style>
+  <w:style w:customStyle="1" w:styleId="ControlFlowTok" w:type="character">
+    <w:name w:val="ControlFlowTok"/>
+    <w:basedOn w:val="VerbatimChar"/>
+    <w:rPr>
+      <w:b/>
+      <w:color w:val="007020"/>
+    </w:rPr>
+  </w:style>
+  <w:style w:customStyle="1" w:styleId="OperatorTok" w:type="character">
+    <w:name w:val="OperatorTok"/>
+    <w:basedOn w:val="VerbatimChar"/>
+    <w:rPr>
+      <w:color w:val="666666"/>
+    </w:rPr>
+  </w:style>
+  <w:style w:customStyle="1" w:styleId="BuiltInTok" w:type="character">
+    <w:name w:val="BuiltInTok"/>
+    <w:basedOn w:val="VerbatimChar"/>
+    <w:rPr>
+      <w:color w:val="008000"/>
+    </w:rPr>
+  </w:style>
+  <w:style w:customStyle="1" w:styleId="ExtensionTok" w:type="character">
+    <w:name w:val="ExtensionTok"/>
+    <w:basedOn w:val="VerbatimChar"/>
+    <w:rPr/>
+  </w:style>
+  <w:style w:customStyle="1" w:styleId="PreprocessorTok" w:type="character">
+    <w:name w:val="PreprocessorTok"/>
+    <w:basedOn w:val="VerbatimChar"/>
+    <w:rPr>
+      <w:color w:val="bc7a00"/>
+    </w:rPr>
+  </w:style>
+  <w:style w:customStyle="1" w:styleId="AttributeTok" w:type="character">
+    <w:name w:val="AttributeTok"/>
+    <w:basedOn w:val="VerbatimChar"/>
+    <w:rPr>
+      <w:color w:val="7d9029"/>
+    </w:rPr>
+  </w:style>
+  <w:style w:customStyle="1" w:styleId="RegionMarkerTok" w:type="character">
+    <w:name w:val="RegionMarkerTok"/>
+    <w:basedOn w:val="VerbatimChar"/>
+    <w:rPr/>
+  </w:style>
+  <w:style w:customStyle="1" w:styleId="InformationTok" w:type="character">
+    <w:name w:val="InformationTok"/>
+    <w:basedOn w:val="VerbatimChar"/>
+    <w:rPr>
+      <w:b/>
+      <w:i/>
+      <w:color w:val="60a0b0"/>
+    </w:rPr>
+  </w:style>
+  <w:style w:customStyle="1" w:styleId="WarningTok" w:type="character">
+    <w:name w:val="WarningTok"/>
+    <w:basedOn w:val="VerbatimChar"/>
+    <w:rPr>
+      <w:b/>
+      <w:i/>
+      <w:color w:val="60a0b0"/>
+    </w:rPr>
+  </w:style>
+  <w:style w:customStyle="1" w:styleId="AlertTok" w:type="character">
+    <w:name w:val="AlertTok"/>
+    <w:basedOn w:val="VerbatimChar"/>
+    <w:rPr>
+      <w:b/>
+      <w:color w:val="ff0000"/>
+    </w:rPr>
+  </w:style>
+  <w:style w:customStyle="1" w:styleId="ErrorTok" w:type="character">
+    <w:name w:val="ErrorTok"/>
+    <w:basedOn w:val="VerbatimChar"/>
+    <w:rPr>
+      <w:b/>
+      <w:color w:val="ff0000"/>
+    </w:rPr>
+  </w:style>
+  <w:style w:customStyle="1" w:styleId="NormalTok" w:type="character">
+    <w:name w:val="NormalTok"/>
+    <w:basedOn w:val="VerbatimChar"/>
+    <w:rPr/>
   </w:style>
   <w:style w:customStyle="1" w:styleId="KeywordTok" w:type="character">
     <w:name w:val="KeywordTok"/>

</xml_diff>

<commit_message>
docs(jit): clarify the PAM/TTL feature alone needs no trust or shadow principals
Section 2.4 now states explicitly that enabling the PAM optional feature (time-bound membership/TTL) in the production forest is sufficient for ODA-JIT FullEA; the admin forest, PIM trust and shadow principals in PAM-Trust-Shadow-Principals are a separate optional scenario, not a prerequisite for enabling the TTL. Regenerated the German Word version.

Co-authored-by: Copilot <223556219+Copilot@users.noreply.github.com>
</commit_message>
<xml_diff>
--- a/docs/ODA-JIT-Deployment.de.docx
+++ b/docs/ODA-JIT-Deployment.de.docx
@@ -4090,6 +4090,172 @@
       </w:r>
       <w:r>
         <w:t xml:space="preserve">.</w:t>
+      </w:r>
+    </w:p>
+    <w:p>
+      <w:pPr>
+        <w:pStyle w:val="BlockText"/>
+      </w:pPr>
+      <w:r>
+        <w:rPr>
+          <w:b/>
+          <w:bCs/>
+        </w:rPr>
+        <w:t xml:space="preserve">TTL-Feature ≠ PIM-Trust/Shadow Principals.</w:t>
+      </w:r>
+      <w:r>
+        <w:t xml:space="preserve"> </w:t>
+      </w:r>
+      <w:r>
+        <w:t xml:space="preserve">Für ODA-JIT (FullEA) genügt</w:t>
+      </w:r>
+      <w:r>
+        <w:t xml:space="preserve"> </w:t>
+      </w:r>
+      <w:r>
+        <w:rPr>
+          <w:b/>
+          <w:bCs/>
+        </w:rPr>
+        <w:t xml:space="preserve">allein</w:t>
+      </w:r>
+      <w:r>
+        <w:t xml:space="preserve"> </w:t>
+      </w:r>
+      <w:r>
+        <w:t xml:space="preserve">das</w:t>
+      </w:r>
+      <w:r>
+        <w:t xml:space="preserve"> </w:t>
+      </w:r>
+      <w:r>
+        <w:t xml:space="preserve">PAM-Optional-Feature (zeitgebundene Mitgliedschaften, TTL)</w:t>
+      </w:r>
+      <w:r>
+        <w:t xml:space="preserve"> </w:t>
+      </w:r>
+      <w:r>
+        <w:rPr>
+          <w:b/>
+          <w:bCs/>
+        </w:rPr>
+        <w:t xml:space="preserve">im Produktions-Forest</w:t>
+      </w:r>
+      <w:r>
+        <w:t xml:space="preserve">. Man braucht</w:t>
+      </w:r>
+      <w:r>
+        <w:t xml:space="preserve"> </w:t>
+      </w:r>
+      <w:r>
+        <w:t xml:space="preserve">dafür</w:t>
+      </w:r>
+      <w:r>
+        <w:t xml:space="preserve"> </w:t>
+      </w:r>
+      <w:r>
+        <w:rPr>
+          <w:b/>
+          <w:bCs/>
+        </w:rPr>
+        <w:t xml:space="preserve">keinen</w:t>
+      </w:r>
+      <w:r>
+        <w:t xml:space="preserve"> </w:t>
+      </w:r>
+      <w:r>
+        <w:t xml:space="preserve">Admin-Forest,</w:t>
+      </w:r>
+      <w:r>
+        <w:t xml:space="preserve"> </w:t>
+      </w:r>
+      <w:r>
+        <w:rPr>
+          <w:b/>
+          <w:bCs/>
+        </w:rPr>
+        <w:t xml:space="preserve">keinen</w:t>
+      </w:r>
+      <w:r>
+        <w:t xml:space="preserve"> </w:t>
+      </w:r>
+      <w:r>
+        <w:t xml:space="preserve">PIM-Trust und</w:t>
+      </w:r>
+      <w:r>
+        <w:t xml:space="preserve"> </w:t>
+      </w:r>
+      <w:r>
+        <w:rPr>
+          <w:b/>
+          <w:bCs/>
+        </w:rPr>
+        <w:t xml:space="preserve">keine</w:t>
+      </w:r>
+      <w:r>
+        <w:t xml:space="preserve"> </w:t>
+      </w:r>
+      <w:r>
+        <w:t xml:space="preserve">Shadow Principals. Diese drei</w:t>
+      </w:r>
+      <w:r>
+        <w:t xml:space="preserve"> </w:t>
+      </w:r>
+      <w:r>
+        <w:t xml:space="preserve">Dinge sind ein</w:t>
+      </w:r>
+      <w:r>
+        <w:t xml:space="preserve"> </w:t>
+      </w:r>
+      <w:r>
+        <w:rPr>
+          <w:b/>
+          <w:bCs/>
+        </w:rPr>
+        <w:t xml:space="preserve">separates, optionales</w:t>
+      </w:r>
+      <w:r>
+        <w:t xml:space="preserve"> </w:t>
+      </w:r>
+      <w:r>
+        <w:t xml:space="preserve">Szenario (Ausführer im Admin-Forest), beschrieben in</w:t>
+      </w:r>
+      <w:r>
+        <w:t xml:space="preserve"> </w:t>
+      </w:r>
+      <w:r>
+        <w:t xml:space="preserve">PAM-Trust-Shadow-Principals.de.md – und</w:t>
+      </w:r>
+      <w:r>
+        <w:t xml:space="preserve"> </w:t>
+      </w:r>
+      <w:r>
+        <w:rPr>
+          <w:b/>
+          <w:bCs/>
+        </w:rPr>
+        <w:t xml:space="preserve">keine</w:t>
+      </w:r>
+      <w:r>
+        <w:t xml:space="preserve"> </w:t>
+      </w:r>
+      <w:r>
+        <w:t xml:space="preserve">Voraussetzung, nur um die TTL zu aktivieren.</w:t>
+      </w:r>
+      <w:r>
+        <w:t xml:space="preserve"> </w:t>
+      </w:r>
+      <w:r>
+        <w:rPr>
+          <w:rStyle w:val="VerbatimChar"/>
+        </w:rPr>
+        <w:t xml:space="preserve">Enable-ADOptionalFeature 'Privileged Access Management Feature'</w:t>
+      </w:r>
+      <w:r>
+        <w:t xml:space="preserve"> </w:t>
+      </w:r>
+      <w:r>
+        <w:t xml:space="preserve">genügt.</w:t>
       </w:r>
     </w:p>
     <w:p>
@@ -25246,6 +25412,232 @@
     <w:pPr>
       <w:wordWrap w:val="off"/>
     </w:pPr>
+  </w:style>
+  <w:style w:customStyle="1" w:styleId="KeywordTok" w:type="character">
+    <w:name w:val="KeywordTok"/>
+    <w:basedOn w:val="VerbatimChar"/>
+    <w:rPr>
+      <w:b/>
+      <w:color w:val="007020"/>
+    </w:rPr>
+  </w:style>
+  <w:style w:customStyle="1" w:styleId="DataTypeTok" w:type="character">
+    <w:name w:val="DataTypeTok"/>
+    <w:basedOn w:val="VerbatimChar"/>
+    <w:rPr>
+      <w:color w:val="902000"/>
+    </w:rPr>
+  </w:style>
+  <w:style w:customStyle="1" w:styleId="DecValTok" w:type="character">
+    <w:name w:val="DecValTok"/>
+    <w:basedOn w:val="VerbatimChar"/>
+    <w:rPr>
+      <w:color w:val="40a070"/>
+    </w:rPr>
+  </w:style>
+  <w:style w:customStyle="1" w:styleId="BaseNTok" w:type="character">
+    <w:name w:val="BaseNTok"/>
+    <w:basedOn w:val="VerbatimChar"/>
+    <w:rPr>
+      <w:color w:val="40a070"/>
+    </w:rPr>
+  </w:style>
+  <w:style w:customStyle="1" w:styleId="FloatTok" w:type="character">
+    <w:name w:val="FloatTok"/>
+    <w:basedOn w:val="VerbatimChar"/>
+    <w:rPr>
+      <w:color w:val="40a070"/>
+    </w:rPr>
+  </w:style>
+  <w:style w:customStyle="1" w:styleId="ConstantTok" w:type="character">
+    <w:name w:val="ConstantTok"/>
+    <w:basedOn w:val="VerbatimChar"/>
+    <w:rPr>
+      <w:color w:val="880000"/>
+    </w:rPr>
+  </w:style>
+  <w:style w:customStyle="1" w:styleId="CharTok" w:type="character">
+    <w:name w:val="CharTok"/>
+    <w:basedOn w:val="VerbatimChar"/>
+    <w:rPr>
+      <w:color w:val="4070a0"/>
+    </w:rPr>
+  </w:style>
+  <w:style w:customStyle="1" w:styleId="SpecialCharTok" w:type="character">
+    <w:name w:val="SpecialCharTok"/>
+    <w:basedOn w:val="VerbatimChar"/>
+    <w:rPr>
+      <w:color w:val="4070a0"/>
+    </w:rPr>
+  </w:style>
+  <w:style w:customStyle="1" w:styleId="StringTok" w:type="character">
+    <w:name w:val="StringTok"/>
+    <w:basedOn w:val="VerbatimChar"/>
+    <w:rPr>
+      <w:color w:val="4070a0"/>
+    </w:rPr>
+  </w:style>
+  <w:style w:customStyle="1" w:styleId="VerbatimStringTok" w:type="character">
+    <w:name w:val="VerbatimStringTok"/>
+    <w:basedOn w:val="VerbatimChar"/>
+    <w:rPr>
+      <w:color w:val="4070a0"/>
+    </w:rPr>
+  </w:style>
+  <w:style w:customStyle="1" w:styleId="SpecialStringTok" w:type="character">
+    <w:name w:val="SpecialStringTok"/>
+    <w:basedOn w:val="VerbatimChar"/>
+    <w:rPr>
+      <w:color w:val="bb6688"/>
+    </w:rPr>
+  </w:style>
+  <w:style w:customStyle="1" w:styleId="ImportTok" w:type="character">
+    <w:name w:val="ImportTok"/>
+    <w:basedOn w:val="VerbatimChar"/>
+    <w:rPr>
+      <w:b/>
+      <w:color w:val="008000"/>
+    </w:rPr>
+  </w:style>
+  <w:style w:customStyle="1" w:styleId="CommentTok" w:type="character">
+    <w:name w:val="CommentTok"/>
+    <w:basedOn w:val="VerbatimChar"/>
+    <w:rPr>
+      <w:i/>
+      <w:color w:val="60a0b0"/>
+    </w:rPr>
+  </w:style>
+  <w:style w:customStyle="1" w:styleId="DocumentationTok" w:type="character">
+    <w:name w:val="DocumentationTok"/>
+    <w:basedOn w:val="VerbatimChar"/>
+    <w:rPr>
+      <w:i/>
+      <w:color w:val="ba2121"/>
+    </w:rPr>
+  </w:style>
+  <w:style w:customStyle="1" w:styleId="AnnotationTok" w:type="character">
+    <w:name w:val="AnnotationTok"/>
+    <w:basedOn w:val="VerbatimChar"/>
+    <w:rPr>
+      <w:b/>
+      <w:i/>
+      <w:color w:val="60a0b0"/>
+    </w:rPr>
+  </w:style>
+  <w:style w:customStyle="1" w:styleId="CommentVarTok" w:type="character">
+    <w:name w:val="CommentVarTok"/>
+    <w:basedOn w:val="VerbatimChar"/>
+    <w:rPr>
+      <w:b/>
+      <w:i/>
+      <w:color w:val="60a0b0"/>
+    </w:rPr>
+  </w:style>
+  <w:style w:customStyle="1" w:styleId="OtherTok" w:type="character">
+    <w:name w:val="OtherTok"/>
+    <w:basedOn w:val="VerbatimChar"/>
+    <w:rPr>
+      <w:color w:val="007020"/>
+    </w:rPr>
+  </w:style>
+  <w:style w:customStyle="1" w:styleId="FunctionTok" w:type="character">
+    <w:name w:val="FunctionTok"/>
+    <w:basedOn w:val="VerbatimChar"/>
+    <w:rPr>
+      <w:color w:val="06287e"/>
+    </w:rPr>
+  </w:style>
+  <w:style w:customStyle="1" w:styleId="VariableTok" w:type="character">
+    <w:name w:val="VariableTok"/>
+    <w:basedOn w:val="VerbatimChar"/>
+    <w:rPr>
+      <w:color w:val="19177c"/>
+    </w:rPr>
+  </w:style>
+  <w:style w:customStyle="1" w:styleId="ControlFlowTok" w:type="character">
+    <w:name w:val="ControlFlowTok"/>
+    <w:basedOn w:val="VerbatimChar"/>
+    <w:rPr>
+      <w:b/>
+      <w:color w:val="007020"/>
+    </w:rPr>
+  </w:style>
+  <w:style w:customStyle="1" w:styleId="OperatorTok" w:type="character">
+    <w:name w:val="OperatorTok"/>
+    <w:basedOn w:val="VerbatimChar"/>
+    <w:rPr>
+      <w:color w:val="666666"/>
+    </w:rPr>
+  </w:style>
+  <w:style w:customStyle="1" w:styleId="BuiltInTok" w:type="character">
+    <w:name w:val="BuiltInTok"/>
+    <w:basedOn w:val="VerbatimChar"/>
+    <w:rPr>
+      <w:color w:val="008000"/>
+    </w:rPr>
+  </w:style>
+  <w:style w:customStyle="1" w:styleId="ExtensionTok" w:type="character">
+    <w:name w:val="ExtensionTok"/>
+    <w:basedOn w:val="VerbatimChar"/>
+    <w:rPr/>
+  </w:style>
+  <w:style w:customStyle="1" w:styleId="PreprocessorTok" w:type="character">
+    <w:name w:val="PreprocessorTok"/>
+    <w:basedOn w:val="VerbatimChar"/>
+    <w:rPr>
+      <w:color w:val="bc7a00"/>
+    </w:rPr>
+  </w:style>
+  <w:style w:customStyle="1" w:styleId="AttributeTok" w:type="character">
+    <w:name w:val="AttributeTok"/>
+    <w:basedOn w:val="VerbatimChar"/>
+    <w:rPr>
+      <w:color w:val="7d9029"/>
+    </w:rPr>
+  </w:style>
+  <w:style w:customStyle="1" w:styleId="RegionMarkerTok" w:type="character">
+    <w:name w:val="RegionMarkerTok"/>
+    <w:basedOn w:val="VerbatimChar"/>
+    <w:rPr/>
+  </w:style>
+  <w:style w:customStyle="1" w:styleId="InformationTok" w:type="character">
+    <w:name w:val="InformationTok"/>
+    <w:basedOn w:val="VerbatimChar"/>
+    <w:rPr>
+      <w:b/>
+      <w:i/>
+      <w:color w:val="60a0b0"/>
+    </w:rPr>
+  </w:style>
+  <w:style w:customStyle="1" w:styleId="WarningTok" w:type="character">
+    <w:name w:val="WarningTok"/>
+    <w:basedOn w:val="VerbatimChar"/>
+    <w:rPr>
+      <w:b/>
+      <w:i/>
+      <w:color w:val="60a0b0"/>
+    </w:rPr>
+  </w:style>
+  <w:style w:customStyle="1" w:styleId="AlertTok" w:type="character">
+    <w:name w:val="AlertTok"/>
+    <w:basedOn w:val="VerbatimChar"/>
+    <w:rPr>
+      <w:b/>
+      <w:color w:val="ff0000"/>
+    </w:rPr>
+  </w:style>
+  <w:style w:customStyle="1" w:styleId="ErrorTok" w:type="character">
+    <w:name w:val="ErrorTok"/>
+    <w:basedOn w:val="VerbatimChar"/>
+    <w:rPr>
+      <w:b/>
+      <w:color w:val="ff0000"/>
+    </w:rPr>
+  </w:style>
+  <w:style w:customStyle="1" w:styleId="NormalTok" w:type="character">
+    <w:name w:val="NormalTok"/>
+    <w:basedOn w:val="VerbatimChar"/>
+    <w:rPr/>
   </w:style>
   <w:style w:customStyle="1" w:styleId="KeywordTok" w:type="character">
     <w:name w:val="KeywordTok"/>

</xml_diff>

<commit_message>
docs(jit): add Add-AD(Security)AssessmentTask steps for the second ODA instance (gMSA, local admin, workspace selection)
Co-authored-by: Copilot <223556219+Copilot@users.noreply.github.com>
</commit_message>
<xml_diff>
--- a/docs/ODA-JIT-Deployment.de.docx
+++ b/docs/ODA-JIT-Deployment.de.docx
@@ -6635,6 +6635,204 @@
       </w:r>
       <w:r>
         <w:t xml:space="preserve"> eintragen.</w:t>
+      </w:r>
+    </w:p>
+    <w:p>
+      <w:pPr>
+        <w:pStyle w:val="ListBullet"/>
+        <w:spacing w:after="40"/>
+      </w:pPr>
+      <w:r>
+        <w:t xml:space="preserve">Die Aufgaben der FullEA-Instanz legt man </w:t>
+      </w:r>
+      <w:r>
+        <w:rPr>
+          <w:b/>
+        </w:rPr>
+        <w:t>auf dem Collector</w:t>
+      </w:r>
+      <w:r>
+        <w:t xml:space="preserve"> in einer PowerShell als Administrator an. Das gMSA muss dort installiert sein (</w:t>
+      </w:r>
+      <w:r>
+        <w:rPr>
+          <w:rFonts w:ascii="Consolas" w:hAnsi="Consolas" w:eastAsia="Consolas"/>
+          <w:color w:val="8B0000"/>
+        </w:rPr>
+        <w:t>Test-ADServiceAccount</w:t>
+      </w:r>
+      <w:r>
+        <w:t xml:space="preserve"> = </w:t>
+      </w:r>
+      <w:r>
+        <w:rPr>
+          <w:rFonts w:ascii="Consolas" w:hAnsi="Consolas" w:eastAsia="Consolas"/>
+          <w:color w:val="8B0000"/>
+        </w:rPr>
+        <w:t>True</w:t>
+      </w:r>
+      <w:r>
+        <w:t>) und das Recht „Als Stapelverarbeitungsauftrag anmelden“ haben, sonst warnt das Cmdlet (</w:t>
+      </w:r>
+      <w:r>
+        <w:rPr>
+          <w:rFonts w:ascii="Consolas" w:hAnsi="Consolas" w:eastAsia="Consolas"/>
+          <w:color w:val="8B0000"/>
+        </w:rPr>
+        <w:t>Log on as a batch job</w:t>
+      </w:r>
+      <w:r>
+        <w:t xml:space="preserve">). Die Abfrage nach </w:t>
+      </w:r>
+      <w:r>
+        <w:rPr>
+          <w:rFonts w:ascii="Consolas" w:hAnsi="Consolas" w:eastAsia="Consolas"/>
+          <w:color w:val="8B0000"/>
+        </w:rPr>
+        <w:t>ScheduledTaskPassword</w:t>
+      </w:r>
+      <w:r>
+        <w:t xml:space="preserve"> mit beliebiger Eingabe oder Enter bestätigen: Das Kennwort eines gMSA verwaltet AD:</w:t>
+      </w:r>
+    </w:p>
+    <w:p>
+      <w:pPr>
+        <w:spacing w:after="80"/>
+      </w:pPr>
+      <w:r>
+        <w:t xml:space="preserve">Das FullEA-gMSA braucht laut Microsoft-Voraussetzungen zusätzlich </w:t>
+      </w:r>
+      <w:r>
+        <w:rPr>
+          <w:b/>
+        </w:rPr>
+        <w:t>lokale Administratorrechte auf dem Collector</w:t>
+      </w:r>
+      <w:r>
+        <w:t xml:space="preserve">. Findet das Cmdlet mehrere Management Groups/Workspaces am Agent, </w:t>
+      </w:r>
+      <w:r>
+        <w:rPr>
+          <w:b/>
+        </w:rPr>
+        <w:t>fragt es nach der Auswahl</w:t>
+      </w:r>
+      <w:r>
+        <w:t xml:space="preserve"> (Nummer eingeben): dort den </w:t>
+      </w:r>
+      <w:r>
+        <w:rPr>
+          <w:b/>
+        </w:rPr>
+        <w:t>neuen</w:t>
+      </w:r>
+      <w:r>
+        <w:t xml:space="preserve"> Workspace wählen. </w:t>
+      </w:r>
+      <w:r>
+        <w:rPr>
+          <w:rFonts w:ascii="Consolas" w:hAnsi="Consolas" w:eastAsia="Consolas"/>
+          <w:color w:val="8B0000"/>
+        </w:rPr>
+        <w:t>-LogAnalyticsWorkspaceId</w:t>
+      </w:r>
+      <w:r>
+        <w:t xml:space="preserve"> gibt es nur in neueren ODA-Versionen und ist in den Microsoft-PDFs (2019/2021) nicht beschrieben.</w:t>
+      </w:r>
+    </w:p>
+    <w:p>
+      <w:pPr>
+        <w:spacing w:after="0" w:before="0"/>
+        <w:ind w:left="170"/>
+        <w:shd w:val="clear" w:color="auto" w:fill="F2F2F2"/>
+      </w:pPr>
+      <w:r>
+        <w:rPr>
+          <w:rFonts w:ascii="Consolas" w:hAnsi="Consolas" w:eastAsia="Consolas"/>
+          <w:sz w:val="17"/>
+        </w:rPr>
+        <w:t xml:space="preserve">  $ws = '&lt;WorkspaceId-FullEA&gt;'   # nur bei ODA-Versionen mit diesem Parameter, sonst weglassen und im Menü wählen</w:t>
+      </w:r>
+    </w:p>
+    <w:p>
+      <w:pPr>
+        <w:spacing w:after="0" w:before="0"/>
+        <w:ind w:left="170"/>
+        <w:shd w:val="clear" w:color="auto" w:fill="F2F2F2"/>
+      </w:pPr>
+      <w:r>
+        <w:rPr>
+          <w:rFonts w:ascii="Consolas" w:hAnsi="Consolas" w:eastAsia="Consolas"/>
+          <w:sz w:val="17"/>
+        </w:rPr>
+        <w:t xml:space="preserve">  Add-ADAssessmentTask         -WorkingDirectory 'C:\Assessments-FullEA' -ScheduledTaskUsername 'CHILDA\gMSA-ODA-FullEA$' -RunWithManagedServiceAccount $true -LogAnalyticsWorkspaceId $ws</w:t>
+      </w:r>
+    </w:p>
+    <w:p>
+      <w:pPr>
+        <w:spacing w:after="0" w:before="0"/>
+        <w:ind w:left="170"/>
+        <w:shd w:val="clear" w:color="auto" w:fill="F2F2F2"/>
+      </w:pPr>
+      <w:r>
+        <w:rPr>
+          <w:rFonts w:ascii="Consolas" w:hAnsi="Consolas" w:eastAsia="Consolas"/>
+          <w:sz w:val="17"/>
+        </w:rPr>
+        <w:t xml:space="preserve">  Add-ADSecurityAssessmentTask -WorkingDirectory 'C:\Assessments-FullEA' -ScheduledTaskUsername 'CHILDA\gMSA-ODA-FullEA$' -RunWithManagedServiceAccount $true -LogAnalyticsWorkspaceId $ws</w:t>
+      </w:r>
+    </w:p>
+    <w:p>
+      <w:pPr>
+        <w:spacing w:after="40"/>
+      </w:pPr>
+    </w:p>
+    <w:p>
+      <w:pPr>
+        <w:spacing w:after="80"/>
+      </w:pPr>
+      <w:r>
+        <w:t>Die Ausgabe nennt den erkannten Agent (</w:t>
+      </w:r>
+      <w:r>
+        <w:rPr>
+          <w:rFonts w:ascii="Consolas" w:hAnsi="Consolas" w:eastAsia="Consolas"/>
+          <w:color w:val="8B0000"/>
+        </w:rPr>
+        <w:t>AOI-&lt;GUID&gt;</w:t>
+      </w:r>
+      <w:r>
+        <w:t xml:space="preserve">) und „Task Creation Successful“. Parameter je ODA-Version mit </w:t>
+      </w:r>
+      <w:r>
+        <w:rPr>
+          <w:rFonts w:ascii="Consolas" w:hAnsi="Consolas" w:eastAsia="Consolas"/>
+          <w:color w:val="8B0000"/>
+        </w:rPr>
+        <w:t>Get-Help Add-ADAssessmentTask -Parameter *</w:t>
+      </w:r>
+      <w:r>
+        <w:t xml:space="preserve"> prüfen. Danach den neuen Ordner mit </w:t>
+      </w:r>
+      <w:r>
+        <w:rPr>
+          <w:rFonts w:ascii="Consolas" w:hAnsi="Consolas" w:eastAsia="Consolas"/>
+          <w:color w:val="8B0000"/>
+        </w:rPr>
+        <w:t>Get-ScheduledTask</w:t>
+      </w:r>
+      <w:r>
+        <w:t xml:space="preserve"> ermitteln (siehe oben) und als </w:t>
+      </w:r>
+      <w:r>
+        <w:rPr>
+          <w:rFonts w:ascii="Consolas" w:hAnsi="Consolas" w:eastAsia="Consolas"/>
+          <w:color w:val="8B0000"/>
+        </w:rPr>
+        <w:t>OdaTaskPath</w:t>
+      </w:r>
+      <w:r>
+        <w:t xml:space="preserve"> eintragen. Die alten Aufgaben bleiben unverändert.</w:t>
       </w:r>
     </w:p>
     <w:p>

</xml_diff>

<commit_message>
refactor(jit): rename Azure/New-ODAJitDataCollectionRules.ps1 to Copy-ODAJitDataCollectionRules.ps1 (approved verb), update guides and regenerate German Word document
Co-authored-by: Copilot <223556219+Copilot@users.noreply.github.com>
</commit_message>
<xml_diff>
--- a/docs/ODA-JIT-Deployment.de.docx
+++ b/docs/ODA-JIT-Deployment.de.docx
@@ -10785,7 +10785,7 @@
           <w:rFonts w:ascii="Consolas" w:hAnsi="Consolas" w:eastAsia="Consolas"/>
           <w:sz w:val="17"/>
         </w:rPr>
-        <w:t>[B]-DCRs aus Azure\New-ODAJitDataCollectionRules.ps1.</w:t>
+        <w:t>[B]-DCRs aus Azure\Copy-ODAJitDataCollectionRules.ps1.</w:t>
       </w:r>
     </w:p>
     <w:p>
@@ -10805,7 +10805,7 @@
           <w:rFonts w:ascii="Consolas" w:hAnsi="Consolas" w:eastAsia="Consolas"/>
           <w:color w:val="8B0000"/>
         </w:rPr>
-        <w:t>Azure/New-ODAJitDataCollectionRules.ps1</w:t>
+        <w:t>Azure/Copy-ODAJitDataCollectionRules.ps1</w:t>
       </w:r>
       <w:r>
         <w:t xml:space="preserve"> klont die vorhandenen DCRs und ändert nur Dateimuster und Ziel-Workspace:</w:t>
@@ -10836,7 +10836,7 @@
           <w:rFonts w:ascii="Consolas" w:hAnsi="Consolas" w:eastAsia="Consolas"/>
           <w:sz w:val="17"/>
         </w:rPr>
-        <w:t>.\Azure\New-ODAJitDataCollectionRules.ps1 -SubscriptionId &lt;id&gt; -ResourceGroup &lt;rg&gt; `</w:t>
+        <w:t>.\Azure\Copy-ODAJitDataCollectionRules.ps1 -SubscriptionId &lt;id&gt; -ResourceGroup &lt;rg&gt; `</w:t>
       </w:r>
     </w:p>
     <w:p>

</xml_diff>

<commit_message>
docs: JIT deployment guide - highest privileges, ExecutionPolicy Bypass/GPO, re-registration overwrite, revoke acceptance
Co-authored-by: Copilot <223556219+Copilot@users.noreply.github.com>
</commit_message>
<xml_diff>
--- a/docs/ODA-JIT-Deployment.de.docx
+++ b/docs/ODA-JIT-Deployment.de.docx
@@ -8901,6 +8901,143 @@
                 <w:color w:val="8B0000"/>
                 <w:sz w:val="19"/>
               </w:rPr>
+              <w:t>RunStartToleranceMinutes</w:t>
+            </w:r>
+          </w:p>
+        </w:tc>
+        <w:tc>
+          <w:tcPr>
+            <w:tcW w:type="dxa" w:w="3249"/>
+          </w:tcPr>
+          <w:p>
+            <w:r/>
+            <w:r>
+              <w:rPr>
+                <w:b/>
+                <w:sz w:val="19"/>
+              </w:rPr>
+              <w:t>Toleranz für Läufe kurz vor `WindowStart`</w:t>
+            </w:r>
+            <w:r>
+              <w:rPr>
+                <w:sz w:val="19"/>
+              </w:rPr>
+              <w:t xml:space="preserve">: Eine Aufgabe, deren letzter Lauf höchstens so viele Minuten vor </w:t>
+            </w:r>
+            <w:r>
+              <w:rPr>
+                <w:rFonts w:ascii="Consolas" w:hAnsi="Consolas" w:eastAsia="Consolas"/>
+                <w:color w:val="8B0000"/>
+                <w:sz w:val="19"/>
+              </w:rPr>
+              <w:t>WindowStart</w:t>
+            </w:r>
+            <w:r>
+              <w:rPr>
+                <w:sz w:val="19"/>
+              </w:rPr>
+              <w:t xml:space="preserve"> liegt, gilt als *gelaufen*. Nötig für manuelle Tests, bei denen die ODA-Aufgaben (</w:t>
+            </w:r>
+            <w:r>
+              <w:rPr>
+                <w:rFonts w:ascii="Consolas" w:hAnsi="Consolas" w:eastAsia="Consolas"/>
+                <w:color w:val="8B0000"/>
+                <w:sz w:val="19"/>
+              </w:rPr>
+              <w:t>-StartOdaTasks</w:t>
+            </w:r>
+            <w:r>
+              <w:rPr>
+                <w:sz w:val="19"/>
+              </w:rPr>
+              <w:t xml:space="preserve">) vor dem Watcher mit </w:t>
+            </w:r>
+            <w:r>
+              <w:rPr>
+                <w:rFonts w:ascii="Consolas" w:hAnsi="Consolas" w:eastAsia="Consolas"/>
+                <w:color w:val="8B0000"/>
+                <w:sz w:val="19"/>
+              </w:rPr>
+              <w:t>-WindowStart (Get-Date)</w:t>
+            </w:r>
+            <w:r>
+              <w:rPr>
+                <w:sz w:val="19"/>
+              </w:rPr>
+              <w:t xml:space="preserve"> gestartet werden</w:t>
+            </w:r>
+          </w:p>
+        </w:tc>
+        <w:tc>
+          <w:tcPr>
+            <w:tcW w:type="dxa" w:w="3249"/>
+          </w:tcPr>
+          <w:p>
+            <w:r/>
+            <w:r>
+              <w:rPr>
+                <w:sz w:val="19"/>
+              </w:rPr>
+              <w:t xml:space="preserve">Standard </w:t>
+            </w:r>
+            <w:r>
+              <w:rPr>
+                <w:rFonts w:ascii="Consolas" w:hAnsi="Consolas" w:eastAsia="Consolas"/>
+                <w:color w:val="8B0000"/>
+                <w:sz w:val="19"/>
+              </w:rPr>
+              <w:t>15</w:t>
+            </w:r>
+            <w:r>
+              <w:rPr>
+                <w:sz w:val="19"/>
+              </w:rPr>
+              <w:t xml:space="preserve">. Ohne Toleranz wird ein solcher Lauf als </w:t>
+            </w:r>
+            <w:r>
+              <w:rPr>
+                <w:rFonts w:ascii="Consolas" w:hAnsi="Consolas" w:eastAsia="Consolas"/>
+                <w:color w:val="8B0000"/>
+                <w:sz w:val="19"/>
+              </w:rPr>
+              <w:t>Incomplete</w:t>
+            </w:r>
+            <w:r>
+              <w:rPr>
+                <w:sz w:val="19"/>
+              </w:rPr>
+              <w:t xml:space="preserve"> („Aufgabe(n) nicht gelaufen") gemeldet, obwohl er lief. Das Grant-Log gibt die exakte Task-Startzeit für </w:t>
+            </w:r>
+            <w:r>
+              <w:rPr>
+                <w:rFonts w:ascii="Consolas" w:hAnsi="Consolas" w:eastAsia="Consolas"/>
+                <w:color w:val="8B0000"/>
+                <w:sz w:val="19"/>
+              </w:rPr>
+              <w:t>-WindowStart</w:t>
+            </w:r>
+            <w:r>
+              <w:rPr>
+                <w:sz w:val="19"/>
+              </w:rPr>
+              <w:t xml:space="preserve"> aus</w:t>
+            </w:r>
+          </w:p>
+        </w:tc>
+      </w:tr>
+      <w:tr>
+        <w:tc>
+          <w:tcPr>
+            <w:tcW w:type="dxa" w:w="3249"/>
+          </w:tcPr>
+          <w:p>
+            <w:r/>
+            <w:r>
+              <w:rPr>
+                <w:rFonts w:ascii="Consolas" w:hAnsi="Consolas" w:eastAsia="Consolas"/>
+                <w:color w:val="8B0000"/>
+                <w:sz w:val="19"/>
+              </w:rPr>
               <w:t>DeadlineHours</w:t>
             </w:r>
           </w:p>
@@ -12585,7 +12722,37 @@
         <w:spacing w:after="80"/>
       </w:pPr>
       <w:r>
-        <w:t>Prüfen: Grant-Log OK, Event 1000; Watcher erkennt Ende → Event 1010; das gMSA ist danach nicht mehr in Enterprise Admins; die ODA-Ergebnisse sind vollständig (keine leeren Tabellenblätter).</w:t>
+        <w:t xml:space="preserve">Prüfen: Grant-Log OK, Event 1000; Watcher erkennt Ende → Event 1010; das gMSA ist danach nicht mehr in Enterprise Admins; die ODA-Ergebnisse sind vollständig (keine leeren Tabellenblätter). Liegt zwischen dem Start der Tasks und dem Watcher mehr als </w:t>
+      </w:r>
+      <w:r>
+        <w:rPr>
+          <w:rFonts w:ascii="Consolas" w:hAnsi="Consolas" w:eastAsia="Consolas"/>
+          <w:color w:val="8B0000"/>
+        </w:rPr>
+        <w:t>RunStartToleranceMinutes</w:t>
+      </w:r>
+      <w:r>
+        <w:t xml:space="preserve">, statt </w:t>
+      </w:r>
+      <w:r>
+        <w:rPr>
+          <w:rFonts w:ascii="Consolas" w:hAnsi="Consolas" w:eastAsia="Consolas"/>
+          <w:color w:val="8B0000"/>
+        </w:rPr>
+        <w:t>(Get-Date)</w:t>
+      </w:r>
+      <w:r>
+        <w:t xml:space="preserve"> die vom Grant ausgegebene exakte Task-Startzeit verwenden (</w:t>
+      </w:r>
+      <w:r>
+        <w:rPr>
+          <w:rFonts w:ascii="Consolas" w:hAnsi="Consolas" w:eastAsia="Consolas"/>
+          <w:color w:val="8B0000"/>
+        </w:rPr>
+        <w:t>-WindowStart '&lt;yyyy-MM-dd HH:mm:ss&gt;'</w:t>
+      </w:r>
+      <w:r>
+        <w:t>).</w:t>
       </w:r>
     </w:p>
     <w:tbl>
@@ -13023,6 +13190,74 @@
     </w:p>
     <w:p>
       <w:pPr>
+        <w:spacing w:after="80"/>
+      </w:pPr>
+      <w:r>
+        <w:rPr>
+          <w:b/>
+        </w:rPr>
+        <w:t>Höchste Privilegien und Ausführungsrichtlinie</w:t>
+      </w:r>
+    </w:p>
+    <w:p>
+      <w:pPr>
+        <w:pStyle w:val="ListBullet"/>
+        <w:spacing w:after="40"/>
+      </w:pPr>
+      <w:r>
+        <w:t xml:space="preserve">Beide Aufgaben (Grant und Revoke) werden bereits mit </w:t>
+      </w:r>
+      <w:r>
+        <w:rPr>
+          <w:b/>
+        </w:rPr>
+        <w:t>„Mit höchsten Privilegien ausführen“</w:t>
+      </w:r>
+      <w:r>
+        <w:t xml:space="preserve"> (</w:t>
+      </w:r>
+      <w:r>
+        <w:rPr>
+          <w:rFonts w:ascii="Consolas" w:hAnsi="Consolas" w:eastAsia="Consolas"/>
+          <w:color w:val="8B0000"/>
+        </w:rPr>
+        <w:t>RunLevel Highest</w:t>
+      </w:r>
+      <w:r>
+        <w:t>) registriert. Eine manuelle Nachstellung ist nicht nötig.</w:t>
+      </w:r>
+    </w:p>
+    <w:p>
+      <w:pPr>
+        <w:pStyle w:val="ListBullet"/>
+        <w:spacing w:after="40"/>
+      </w:pPr>
+      <w:r>
+        <w:t xml:space="preserve">Standardmäßig enthalten beide Aufgabenaktionen </w:t>
+      </w:r>
+      <w:r>
+        <w:rPr>
+          <w:rFonts w:ascii="Consolas" w:hAnsi="Consolas" w:eastAsia="Consolas"/>
+          <w:color w:val="8B0000"/>
+        </w:rPr>
+        <w:t>-ExecutionPolicy RemoteSigned</w:t>
+      </w:r>
+      <w:r>
+        <w:t xml:space="preserve">. Startet eine Aufgabe dadurch nicht (z. B. Skripte nicht signiert oder nicht entsperrt), reproduziert die Registrierung mit </w:t>
+      </w:r>
+      <w:r>
+        <w:rPr>
+          <w:rFonts w:ascii="Consolas" w:hAnsi="Consolas" w:eastAsia="Consolas"/>
+          <w:color w:val="8B0000"/>
+        </w:rPr>
+        <w:t>-ExecutionPolicy Bypass</w:t>
+      </w:r>
+      <w:r>
+        <w:t xml:space="preserve"> die Einstellung, die sich beim Kunden bewährt hat:</w:t>
+      </w:r>
+    </w:p>
+    <w:p>
+      <w:pPr>
         <w:spacing w:after="0" w:before="0"/>
         <w:ind w:left="170"/>
         <w:shd w:val="clear" w:color="auto" w:fill="F2F2F2"/>
@@ -13032,7 +13267,122 @@
           <w:rFonts w:ascii="Consolas" w:hAnsi="Consolas" w:eastAsia="Consolas"/>
           <w:sz w:val="17"/>
         </w:rPr>
-        <w:t>Get-ScheduledTask -TaskPath '\ODA-JIT\' | Get-ScheduledTaskInfo |</w:t>
+        <w:t xml:space="preserve">  .\Register-ODAJitTasks.ps1 -ConfigPath C:\ODA-JIT\Config\ODAJit.forest-a.psd1 -ExecutionPolicy Bypass</w:t>
+      </w:r>
+    </w:p>
+    <w:p>
+      <w:pPr>
+        <w:spacing w:after="40"/>
+      </w:pPr>
+    </w:p>
+    <w:p>
+      <w:pPr>
+        <w:pStyle w:val="ListBullet"/>
+        <w:spacing w:after="40"/>
+      </w:pPr>
+      <w:r>
+        <w:rPr>
+          <w:rFonts w:ascii="Consolas" w:hAnsi="Consolas" w:eastAsia="Consolas"/>
+          <w:color w:val="8B0000"/>
+        </w:rPr>
+        <w:t>Bypass</w:t>
+      </w:r>
+      <w:r>
+        <w:t xml:space="preserve"> gilt nur für den von der Aufgabe gestarteten PowerShell-Prozess. Eine per Gruppenrichtlinie gesetzte Ausführungsrichtlinie (</w:t>
+      </w:r>
+      <w:r>
+        <w:rPr>
+          <w:rFonts w:ascii="Consolas" w:hAnsi="Consolas" w:eastAsia="Consolas"/>
+          <w:color w:val="8B0000"/>
+        </w:rPr>
+        <w:t>MachinePolicy</w:t>
+      </w:r>
+      <w:r>
+        <w:t>/</w:t>
+      </w:r>
+      <w:r>
+        <w:rPr>
+          <w:rFonts w:ascii="Consolas" w:hAnsi="Consolas" w:eastAsia="Consolas"/>
+          <w:color w:val="8B0000"/>
+        </w:rPr>
+        <w:t>UserPolicy</w:t>
+      </w:r>
+      <w:r>
+        <w:t xml:space="preserve">) hat Vorrang und wird dadurch </w:t>
+      </w:r>
+      <w:r>
+        <w:rPr>
+          <w:b/>
+        </w:rPr>
+        <w:t>nicht</w:t>
+      </w:r>
+      <w:r>
+        <w:t xml:space="preserve"> übersteuert (prüfen mit </w:t>
+      </w:r>
+      <w:r>
+        <w:rPr>
+          <w:rFonts w:ascii="Consolas" w:hAnsi="Consolas" w:eastAsia="Consolas"/>
+          <w:color w:val="8B0000"/>
+        </w:rPr>
+        <w:t>Get-ExecutionPolicy -List</w:t>
+      </w:r>
+      <w:r>
+        <w:t xml:space="preserve">). Für Tier-0 bleiben signierte Skripte mit </w:t>
+      </w:r>
+      <w:r>
+        <w:rPr>
+          <w:rFonts w:ascii="Consolas" w:hAnsi="Consolas" w:eastAsia="Consolas"/>
+          <w:color w:val="8B0000"/>
+        </w:rPr>
+        <w:t>AllSigned</w:t>
+      </w:r>
+      <w:r>
+        <w:t xml:space="preserve"> die Empfehlung; </w:t>
+      </w:r>
+      <w:r>
+        <w:rPr>
+          <w:rFonts w:ascii="Consolas" w:hAnsi="Consolas" w:eastAsia="Consolas"/>
+          <w:color w:val="8B0000"/>
+        </w:rPr>
+        <w:t>RemoteSigned</w:t>
+      </w:r>
+      <w:r>
+        <w:t xml:space="preserve"> bleibt der Standard.</w:t>
+      </w:r>
+    </w:p>
+    <w:p>
+      <w:pPr>
+        <w:pStyle w:val="ListBullet"/>
+        <w:spacing w:after="40"/>
+      </w:pPr>
+      <w:r>
+        <w:rPr>
+          <w:b/>
+        </w:rPr>
+        <w:t>Jede erneute Registrierung überschreibt beide Aufgaben.</w:t>
+      </w:r>
+      <w:r>
+        <w:t xml:space="preserve"> Die gewünschte Ausführungsrichtlinie muss daher jedes Mal erneut angegeben werden – sonst steht wieder </w:t>
+      </w:r>
+      <w:r>
+        <w:rPr>
+          <w:rFonts w:ascii="Consolas" w:hAnsi="Consolas" w:eastAsia="Consolas"/>
+          <w:color w:val="8B0000"/>
+        </w:rPr>
+        <w:t>RemoteSigned</w:t>
+      </w:r>
+      <w:r>
+        <w:t xml:space="preserve"> in den Aufgaben, auch wenn sie zuvor manuell auf </w:t>
+      </w:r>
+      <w:r>
+        <w:rPr>
+          <w:rFonts w:ascii="Consolas" w:hAnsi="Consolas" w:eastAsia="Consolas"/>
+          <w:color w:val="8B0000"/>
+        </w:rPr>
+        <w:t>Bypass</w:t>
+      </w:r>
+      <w:r>
+        <w:t xml:space="preserve"> umgestellt wurden.</w:t>
       </w:r>
     </w:p>
     <w:p>
@@ -13046,24 +13396,38 @@
           <w:rFonts w:ascii="Consolas" w:hAnsi="Consolas" w:eastAsia="Consolas"/>
           <w:sz w:val="17"/>
         </w:rPr>
-        <w:t xml:space="preserve">    Select-Object TaskName, NextRunTime, LastRunTime, LastTaskResult</w:t>
+        <w:t>Get-ScheduledTask -TaskPath '\ODA-JIT\' | Get-ScheduledTaskInfo |</w:t>
       </w:r>
     </w:p>
     <w:p>
       <w:pPr>
-        <w:spacing w:after="40"/>
-      </w:pPr>
+        <w:spacing w:after="0" w:before="0"/>
+        <w:ind w:left="170"/>
+        <w:shd w:val="clear" w:color="auto" w:fill="F2F2F2"/>
+      </w:pPr>
+      <w:r>
+        <w:rPr>
+          <w:rFonts w:ascii="Consolas" w:hAnsi="Consolas" w:eastAsia="Consolas"/>
+          <w:sz w:val="17"/>
+        </w:rPr>
+        <w:t xml:space="preserve">    Select-Object TaskName, NextRunTime, LastRunTime, LastTaskResult</w:t>
+      </w:r>
     </w:p>
     <w:p>
       <w:pPr>
-        <w:pStyle w:val="Heading2"/>
-      </w:pPr>
-      <w:r>
-        <w:t>Schritt 9 – Auf JIT umstellen</w:t>
-      </w:r>
+        <w:spacing w:after="40"/>
+      </w:pPr>
     </w:p>
     <w:p>
       <w:pPr>
+        <w:pStyle w:val="Heading2"/>
+      </w:pPr>
+      <w:r>
+        <w:t>Schritt 9 – Auf JIT umstellen</w:t>
+      </w:r>
+    </w:p>
+    <w:p>
+      <w:pPr>
         <w:pStyle w:val="ListNumber"/>
         <w:spacing w:after="40"/>
       </w:pPr>
@@ -13077,7 +13441,16 @@
         <w:spacing w:after="40"/>
       </w:pPr>
       <w:r>
-        <w:t>Ersten regulären Lauf abwarten und Events 1000 → 1010 sowie die Ergebnisse prüfen.</w:t>
+        <w:t xml:space="preserve">Ersten regulären Lauf abwarten und Events 1000 → 1010 sowie die Ergebnisse prüfen. </w:t>
+      </w:r>
+      <w:r>
+        <w:rPr>
+          <w:b/>
+        </w:rPr>
+        <w:t>Die Abnahme umfasst den erfolgreichen Revoke:</w:t>
+      </w:r>
+      <w:r>
+        <w:t xml:space="preserve"> Logfiles und die Aufnahme der Gruppe in Enterprise Admins belegen nur den Grant. Zusätzlich müssen das Revoke-Log, ein Event 1010 (1011/1012 = Entzug mit Warnung, 1013 = Entzug fehlgeschlagen) und die tatsächlich entfernte Gruppenmitgliedschaft nach Laufende und Karenzzeit bestätigt sein.</w:t>
       </w:r>
     </w:p>
     <w:p>
@@ -14605,6 +14978,100 @@
                 <w:sz w:val="19"/>
               </w:rPr>
               <w:t xml:space="preserve"> bzw. Skripte signieren</w:t>
+            </w:r>
+          </w:p>
+        </w:tc>
+      </w:tr>
+      <w:tr>
+        <w:tc>
+          <w:tcPr>
+            <w:tcW w:type="dxa" w:w="3249"/>
+          </w:tcPr>
+          <w:p>
+            <w:r/>
+            <w:r>
+              <w:rPr>
+                <w:sz w:val="19"/>
+              </w:rPr>
+              <w:t>Aufgabe startet nicht, obwohl gMSA und Batch-Recht stimmen</w:t>
+            </w:r>
+          </w:p>
+        </w:tc>
+        <w:tc>
+          <w:tcPr>
+            <w:tcW w:type="dxa" w:w="3249"/>
+          </w:tcPr>
+          <w:p>
+            <w:r/>
+            <w:r>
+              <w:rPr>
+                <w:sz w:val="19"/>
+              </w:rPr>
+              <w:t xml:space="preserve">Ausführungsrichtlinie </w:t>
+            </w:r>
+            <w:r>
+              <w:rPr>
+                <w:rFonts w:ascii="Consolas" w:hAnsi="Consolas" w:eastAsia="Consolas"/>
+                <w:color w:val="8B0000"/>
+                <w:sz w:val="19"/>
+              </w:rPr>
+              <w:t>RemoteSigned</w:t>
+            </w:r>
+            <w:r>
+              <w:rPr>
+                <w:sz w:val="19"/>
+              </w:rPr>
+              <w:t xml:space="preserve"> in der Aufgabenaktion blockiert die Skripte</w:t>
+            </w:r>
+          </w:p>
+        </w:tc>
+        <w:tc>
+          <w:tcPr>
+            <w:tcW w:type="dxa" w:w="3249"/>
+          </w:tcPr>
+          <w:p>
+            <w:r/>
+            <w:r>
+              <w:rPr>
+                <w:rFonts w:ascii="Consolas" w:hAnsi="Consolas" w:eastAsia="Consolas"/>
+                <w:color w:val="8B0000"/>
+                <w:sz w:val="19"/>
+              </w:rPr>
+              <w:t>Register-ODAJitTasks.ps1 -ExecutionPolicy Bypass</w:t>
+            </w:r>
+            <w:r>
+              <w:rPr>
+                <w:sz w:val="19"/>
+              </w:rPr>
+              <w:t xml:space="preserve"> (oder signieren und </w:t>
+            </w:r>
+            <w:r>
+              <w:rPr>
+                <w:rFonts w:ascii="Consolas" w:hAnsi="Consolas" w:eastAsia="Consolas"/>
+                <w:color w:val="8B0000"/>
+                <w:sz w:val="19"/>
+              </w:rPr>
+              <w:t>AllSigned</w:t>
+            </w:r>
+            <w:r>
+              <w:rPr>
+                <w:sz w:val="19"/>
+              </w:rPr>
+              <w:t>); eine Gruppenrichtlinie hat Vorrang (</w:t>
+            </w:r>
+            <w:r>
+              <w:rPr>
+                <w:rFonts w:ascii="Consolas" w:hAnsi="Consolas" w:eastAsia="Consolas"/>
+                <w:color w:val="8B0000"/>
+                <w:sz w:val="19"/>
+              </w:rPr>
+              <w:t>Get-ExecutionPolicy -List</w:t>
+            </w:r>
+            <w:r>
+              <w:rPr>
+                <w:sz w:val="19"/>
+              </w:rPr>
+              <w:t>). Die erneute Registrierung überschreibt beide Aufgaben (Schritt 8)</w:t>
             </w:r>
           </w:p>
         </w:tc>

</xml_diff>